<commit_message>
add tehcnician name for each labs
</commit_message>
<xml_diff>
--- a/src/templates/FULL-LED SWABALAST.docx
+++ b/src/templates/FULL-LED SWABALAST.docx
@@ -526,25 +526,14 @@
                 <w:szCs w:val="20"/>
               </w:rPr>
             </w:pPr>
-            <w:proofErr w:type="spellStart"/>
-            <w:r>
-              <w:rPr>
-                <w:rFonts w:ascii="Arial" w:hAnsi="Arial" w:cs="Arial"/>
-                <w:sz w:val="20"/>
-                <w:szCs w:val="20"/>
-              </w:rPr>
-              <w:t>Pengujian</w:t>
-            </w:r>
-            <w:proofErr w:type="spellEnd"/>
-            <w:r>
-              <w:rPr>
-                <w:rFonts w:ascii="Arial" w:hAnsi="Arial" w:cs="Arial"/>
-                <w:sz w:val="20"/>
-                <w:szCs w:val="20"/>
-              </w:rPr>
-              <w:t xml:space="preserve"> </w:t>
-            </w:r>
-            <w:proofErr w:type="spellStart"/>
+            <w:r>
+              <w:rPr>
+                <w:rFonts w:ascii="Arial" w:hAnsi="Arial" w:cs="Arial"/>
+                <w:sz w:val="20"/>
+                <w:szCs w:val="20"/>
+              </w:rPr>
+              <w:t xml:space="preserve">Pengujian </w:t>
+            </w:r>
             <w:r>
               <w:rPr>
                 <w:rFonts w:ascii="Arial" w:hAnsi="Arial" w:cs="Arial"/>
@@ -553,7 +542,6 @@
               </w:rPr>
               <w:t>Penuh</w:t>
             </w:r>
-            <w:proofErr w:type="spellEnd"/>
           </w:p>
         </w:tc>
       </w:tr>
@@ -809,23 +797,13 @@
                 <w:szCs w:val="20"/>
               </w:rPr>
             </w:pPr>
-            <w:proofErr w:type="spellStart"/>
-            <w:r>
-              <w:rPr>
-                <w:rFonts w:ascii="Arial" w:hAnsi="Arial" w:cs="Arial"/>
-                <w:sz w:val="20"/>
-                <w:szCs w:val="20"/>
-              </w:rPr>
-              <w:t>Laboratorium</w:t>
-            </w:r>
-            <w:proofErr w:type="spellEnd"/>
-            <w:r>
-              <w:rPr>
-                <w:rFonts w:ascii="Arial" w:hAnsi="Arial" w:cs="Arial"/>
-                <w:sz w:val="20"/>
-                <w:szCs w:val="20"/>
-              </w:rPr>
-              <w:t xml:space="preserve"> PT. SUCOFINDO</w:t>
+            <w:r>
+              <w:rPr>
+                <w:rFonts w:ascii="Arial" w:hAnsi="Arial" w:cs="Arial"/>
+                <w:sz w:val="20"/>
+                <w:szCs w:val="20"/>
+              </w:rPr>
+              <w:t>Laboratorium PT. SUCOFINDO</w:t>
             </w:r>
           </w:p>
         </w:tc>
@@ -1497,25 +1475,7 @@
                 <w:sz w:val="20"/>
                 <w:szCs w:val="20"/>
               </w:rPr>
-              <w:t>{</w:t>
-            </w:r>
-            <w:proofErr w:type="spellStart"/>
-            <w:r>
-              <w:rPr>
-                <w:rFonts w:ascii="Arial" w:hAnsi="Arial" w:cs="Arial"/>
-                <w:sz w:val="20"/>
-                <w:szCs w:val="20"/>
-              </w:rPr>
-              <w:t>date_received</w:t>
-            </w:r>
-            <w:proofErr w:type="spellEnd"/>
-            <w:r>
-              <w:rPr>
-                <w:rFonts w:ascii="Arial" w:hAnsi="Arial" w:cs="Arial"/>
-                <w:sz w:val="20"/>
-                <w:szCs w:val="20"/>
-              </w:rPr>
-              <w:t>}</w:t>
+              <w:t>{date_received}</w:t>
             </w:r>
           </w:p>
         </w:tc>
@@ -1607,25 +1567,7 @@
                 <w:sz w:val="20"/>
                 <w:szCs w:val="20"/>
               </w:rPr>
-              <w:t>{</w:t>
-            </w:r>
-            <w:proofErr w:type="spellStart"/>
-            <w:r>
-              <w:rPr>
-                <w:rFonts w:ascii="Arial" w:hAnsi="Arial" w:cs="Arial"/>
-                <w:sz w:val="20"/>
-                <w:szCs w:val="20"/>
-              </w:rPr>
-              <w:t>date_testing</w:t>
-            </w:r>
-            <w:proofErr w:type="spellEnd"/>
-            <w:r>
-              <w:rPr>
-                <w:rFonts w:ascii="Arial" w:hAnsi="Arial" w:cs="Arial"/>
-                <w:sz w:val="20"/>
-                <w:szCs w:val="20"/>
-              </w:rPr>
-              <w:t>}</w:t>
+              <w:t>{date_testing}</w:t>
             </w:r>
           </w:p>
         </w:tc>
@@ -1714,88 +1656,14 @@
                 <w:lang w:val="it-IT"/>
               </w:rPr>
             </w:pPr>
-            <w:proofErr w:type="spellStart"/>
-            <w:r>
-              <w:rPr>
-                <w:rFonts w:ascii="Arial" w:hAnsi="Arial" w:cs="Arial"/>
-                <w:sz w:val="20"/>
-                <w:szCs w:val="20"/>
-              </w:rPr>
-              <w:t>Laporan</w:t>
-            </w:r>
-            <w:proofErr w:type="spellEnd"/>
-            <w:r>
-              <w:rPr>
-                <w:rFonts w:ascii="Arial" w:hAnsi="Arial" w:cs="Arial"/>
-                <w:sz w:val="20"/>
-                <w:szCs w:val="20"/>
-              </w:rPr>
-              <w:t xml:space="preserve"> </w:t>
-            </w:r>
-            <w:proofErr w:type="spellStart"/>
-            <w:r>
-              <w:rPr>
-                <w:rFonts w:ascii="Arial" w:hAnsi="Arial" w:cs="Arial"/>
-                <w:sz w:val="20"/>
-                <w:szCs w:val="20"/>
-              </w:rPr>
-              <w:t>ini</w:t>
-            </w:r>
-            <w:proofErr w:type="spellEnd"/>
-            <w:r>
-              <w:rPr>
-                <w:rFonts w:ascii="Arial" w:hAnsi="Arial" w:cs="Arial"/>
-                <w:sz w:val="20"/>
-                <w:szCs w:val="20"/>
-              </w:rPr>
-              <w:t xml:space="preserve"> </w:t>
-            </w:r>
-            <w:proofErr w:type="spellStart"/>
-            <w:r>
-              <w:rPr>
-                <w:rFonts w:ascii="Arial" w:hAnsi="Arial" w:cs="Arial"/>
-                <w:sz w:val="20"/>
-                <w:szCs w:val="20"/>
-              </w:rPr>
-              <w:t>bukan</w:t>
-            </w:r>
-            <w:proofErr w:type="spellEnd"/>
-            <w:r>
-              <w:rPr>
-                <w:rFonts w:ascii="Arial" w:hAnsi="Arial" w:cs="Arial"/>
-                <w:sz w:val="20"/>
-                <w:szCs w:val="20"/>
-              </w:rPr>
-              <w:t xml:space="preserve"> </w:t>
-            </w:r>
-            <w:proofErr w:type="spellStart"/>
-            <w:r>
-              <w:rPr>
-                <w:rFonts w:ascii="Arial" w:hAnsi="Arial" w:cs="Arial"/>
-                <w:sz w:val="20"/>
-                <w:szCs w:val="20"/>
-              </w:rPr>
-              <w:t>Sertifikat</w:t>
-            </w:r>
-            <w:proofErr w:type="spellEnd"/>
-            <w:r>
-              <w:rPr>
-                <w:rFonts w:ascii="Arial" w:hAnsi="Arial" w:cs="Arial"/>
-                <w:sz w:val="20"/>
-                <w:szCs w:val="20"/>
-              </w:rPr>
-              <w:t xml:space="preserve"> </w:t>
-            </w:r>
-            <w:proofErr w:type="spellStart"/>
-            <w:r>
-              <w:rPr>
-                <w:rFonts w:ascii="Arial" w:hAnsi="Arial" w:cs="Arial"/>
-                <w:sz w:val="20"/>
-                <w:szCs w:val="20"/>
-              </w:rPr>
-              <w:t>Produk</w:t>
-            </w:r>
-            <w:proofErr w:type="spellEnd"/>
+            <w:r>
+              <w:rPr>
+                <w:rFonts w:ascii="Arial" w:hAnsi="Arial" w:cs="Arial"/>
+                <w:sz w:val="20"/>
+                <w:szCs w:val="20"/>
+              </w:rPr>
+              <w:t>Laporan ini bukan Sertifikat Produk</w:t>
+            </w:r>
           </w:p>
         </w:tc>
       </w:tr>
@@ -2078,29 +1946,7 @@
                 <w:szCs w:val="20"/>
                 <w:lang w:val="en-US"/>
               </w:rPr>
-              <w:t>{</w:t>
-            </w:r>
-            <w:proofErr w:type="spellStart"/>
-            <w:r>
-              <w:rPr>
-                <w:rFonts w:ascii="Arial" w:hAnsi="Arial" w:cs="Arial"/>
-                <w:bCs/>
-                <w:sz w:val="20"/>
-                <w:szCs w:val="20"/>
-                <w:lang w:val="en-US"/>
-              </w:rPr>
-              <w:t>order_number</w:t>
-            </w:r>
-            <w:proofErr w:type="spellEnd"/>
-            <w:r>
-              <w:rPr>
-                <w:rFonts w:ascii="Arial" w:hAnsi="Arial" w:cs="Arial"/>
-                <w:bCs/>
-                <w:sz w:val="20"/>
-                <w:szCs w:val="20"/>
-                <w:lang w:val="en-US"/>
-              </w:rPr>
-              <w:t>}</w:t>
+              <w:t>{order_number}</w:t>
             </w:r>
           </w:p>
         </w:tc>
@@ -4569,27 +4415,7 @@
                 <w:sz w:val="20"/>
                 <w:szCs w:val="20"/>
               </w:rPr>
-              <w:t>{</w:t>
-            </w:r>
-            <w:proofErr w:type="spellStart"/>
-            <w:r>
-              <w:rPr>
-                <w:rFonts w:ascii="Arial" w:hAnsi="Arial" w:cs="Arial"/>
-                <w:bCs/>
-                <w:sz w:val="20"/>
-                <w:szCs w:val="20"/>
-              </w:rPr>
-              <w:t>factory_address</w:t>
-            </w:r>
-            <w:proofErr w:type="spellEnd"/>
-            <w:r>
-              <w:rPr>
-                <w:rFonts w:ascii="Arial" w:hAnsi="Arial" w:cs="Arial"/>
-                <w:bCs/>
-                <w:sz w:val="20"/>
-                <w:szCs w:val="20"/>
-              </w:rPr>
-              <w:t>}</w:t>
+              <w:t>{factory_address}</w:t>
             </w:r>
           </w:p>
         </w:tc>
@@ -5407,25 +5233,7 @@
                 <w:sz w:val="20"/>
                 <w:szCs w:val="20"/>
               </w:rPr>
-              <w:t>{</w:t>
-            </w:r>
-            <w:proofErr w:type="spellStart"/>
-            <w:r>
-              <w:rPr>
-                <w:rFonts w:ascii="Arial" w:hAnsi="Arial" w:cs="Arial"/>
-                <w:sz w:val="20"/>
-                <w:szCs w:val="20"/>
-              </w:rPr>
-              <w:t>date_received</w:t>
-            </w:r>
-            <w:proofErr w:type="spellEnd"/>
-            <w:r>
-              <w:rPr>
-                <w:rFonts w:ascii="Arial" w:hAnsi="Arial" w:cs="Arial"/>
-                <w:sz w:val="20"/>
-                <w:szCs w:val="20"/>
-              </w:rPr>
-              <w:t>}</w:t>
+              <w:t>{date_received}</w:t>
             </w:r>
           </w:p>
         </w:tc>
@@ -5533,25 +5341,7 @@
                 <w:sz w:val="20"/>
                 <w:szCs w:val="20"/>
               </w:rPr>
-              <w:t>{</w:t>
-            </w:r>
-            <w:proofErr w:type="spellStart"/>
-            <w:r>
-              <w:rPr>
-                <w:rFonts w:ascii="Arial" w:hAnsi="Arial" w:cs="Arial"/>
-                <w:sz w:val="20"/>
-                <w:szCs w:val="20"/>
-              </w:rPr>
-              <w:t>date_testing</w:t>
-            </w:r>
-            <w:proofErr w:type="spellEnd"/>
-            <w:r>
-              <w:rPr>
-                <w:rFonts w:ascii="Arial" w:hAnsi="Arial" w:cs="Arial"/>
-                <w:sz w:val="20"/>
-                <w:szCs w:val="20"/>
-              </w:rPr>
-              <w:t>}</w:t>
+              <w:t>{date_testing}</w:t>
             </w:r>
           </w:p>
         </w:tc>
@@ -5871,7 +5661,6 @@
               </w:rPr>
             </w:pPr>
             <w:bookmarkStart w:id="0" w:name="_Hlk184114358"/>
-            <w:proofErr w:type="spellStart"/>
             <w:r>
               <w:rPr>
                 <w:rFonts w:ascii="Arial" w:hAnsi="Arial" w:cs="Arial"/>
@@ -5881,33 +5670,8 @@
                 <w:szCs w:val="20"/>
                 <w:u w:val="single"/>
               </w:rPr>
-              <w:t>Ringkasan</w:t>
-            </w:r>
-            <w:proofErr w:type="spellEnd"/>
-            <w:r>
-              <w:rPr>
-                <w:rFonts w:ascii="Arial" w:hAnsi="Arial" w:cs="Arial"/>
-                <w:b/>
-                <w:bCs/>
-                <w:sz w:val="20"/>
-                <w:szCs w:val="20"/>
-                <w:u w:val="single"/>
-              </w:rPr>
-              <w:t xml:space="preserve"> </w:t>
-            </w:r>
-            <w:proofErr w:type="spellStart"/>
-            <w:r>
-              <w:rPr>
-                <w:rFonts w:ascii="Arial" w:hAnsi="Arial" w:cs="Arial"/>
-                <w:b/>
-                <w:bCs/>
-                <w:sz w:val="20"/>
-                <w:szCs w:val="20"/>
-                <w:u w:val="single"/>
-              </w:rPr>
-              <w:t>Pengujian</w:t>
-            </w:r>
-            <w:proofErr w:type="spellEnd"/>
+              <w:t>Ringkasan Pengujian</w:t>
+            </w:r>
           </w:p>
           <w:p>
             <w:pPr>
@@ -5944,9 +5708,18 @@
                 <w:rFonts w:ascii="Arial" w:hAnsi="Arial" w:cs="Arial"/>
                 <w:sz w:val="20"/>
                 <w:szCs w:val="20"/>
+                <w:lang w:val="it-IT" w:eastAsia="zh-CN"/>
+              </w:rPr>
+              <w:t xml:space="preserve"> </w:t>
+            </w:r>
+            <w:r>
+              <w:rPr>
+                <w:rFonts w:ascii="Arial" w:hAnsi="Arial" w:cs="Arial"/>
+                <w:sz w:val="20"/>
+                <w:szCs w:val="20"/>
                 <w:lang w:val="sv-SE"/>
               </w:rPr>
-              <w:t>{ if_not_pass}</w:t>
+              <w:t>{if_not_pass}</w:t>
             </w:r>
             <w:r>
               <w:rPr>
@@ -6037,19 +5810,56 @@
                 <w:szCs w:val="20"/>
                 <w:lang w:val="en-ID"/>
               </w:rPr>
+              <w:t xml:space="preserve"> merek</w:t>
+            </w:r>
+            <w:r>
+              <w:rPr>
+                <w:rFonts w:ascii="Arial" w:hAnsi="Arial" w:cs="Arial"/>
+                <w:sz w:val="20"/>
+                <w:szCs w:val="20"/>
+                <w:lang w:val="pt-BR"/>
+              </w:rPr>
               <w:t xml:space="preserve"> </w:t>
             </w:r>
-            <w:proofErr w:type="spellStart"/>
-            <w:r>
-              <w:rPr>
-                <w:rFonts w:ascii="Arial" w:hAnsi="Arial" w:cs="Arial"/>
+            <w:r>
+              <w:rPr>
+                <w:rFonts w:ascii="Arial" w:hAnsi="Arial" w:cs="Arial"/>
+                <w:sz w:val="20"/>
+                <w:szCs w:val="20"/>
+                <w:lang w:val="en-ID" w:eastAsia="zh-CN"/>
+              </w:rPr>
+              <w:t>{merk}</w:t>
+            </w:r>
+            <w:r>
+              <w:rPr>
+                <w:rFonts w:ascii="Arial" w:hAnsi="Arial" w:cs="Arial"/>
+                <w:bCs/>
                 <w:sz w:val="20"/>
                 <w:szCs w:val="20"/>
                 <w:lang w:val="en-ID"/>
               </w:rPr>
-              <w:t>merek</w:t>
-            </w:r>
-            <w:proofErr w:type="spellEnd"/>
+              <w:t xml:space="preserve"> </w:t>
+            </w:r>
+            <w:r>
+              <w:rPr>
+                <w:rFonts w:ascii="Arial" w:hAnsi="Arial" w:cs="Arial"/>
+                <w:bCs/>
+                <w:sz w:val="20"/>
+                <w:szCs w:val="20"/>
+                <w:lang w:val="en-ID"/>
+              </w:rPr>
+              <w:t>m</w:t>
+            </w:r>
+            <w:r>
+              <w:rPr>
+                <w:rFonts w:ascii="Arial" w:hAnsi="Arial" w:cs="Arial"/>
+                <w:bCs/>
+                <w:sz w:val="20"/>
+                <w:szCs w:val="20"/>
+                <w:lang w:val="en-ID"/>
+              </w:rPr>
+              <w:t>odel</w:t>
+            </w:r>
             <w:r>
               <w:rPr>
                 <w:rFonts w:ascii="Arial" w:hAnsi="Arial" w:cs="Arial"/>
@@ -6066,7 +5876,25 @@
                 <w:szCs w:val="20"/>
                 <w:lang w:val="en-ID" w:eastAsia="zh-CN"/>
               </w:rPr>
-              <w:t>{merk}</w:t>
+              <w:t>{model}</w:t>
+            </w:r>
+            <w:r>
+              <w:rPr>
+                <w:rFonts w:ascii="Arial" w:hAnsi="Arial" w:cs="Arial"/>
+                <w:sz w:val="20"/>
+                <w:szCs w:val="20"/>
+                <w:lang w:val="en-ID" w:eastAsia="zh-CN"/>
+              </w:rPr>
+              <w:t xml:space="preserve"> </w:t>
+            </w:r>
+            <w:r>
+              <w:rPr>
+                <w:rFonts w:ascii="Arial" w:hAnsi="Arial" w:cs="Arial"/>
+                <w:sz w:val="20"/>
+                <w:szCs w:val="20"/>
+                <w:lang w:val="en-ID"/>
+              </w:rPr>
+              <w:t>dilakukan pengujian</w:t>
             </w:r>
             <w:r>
               <w:rPr>
@@ -6086,7 +5914,7 @@
                 <w:szCs w:val="20"/>
                 <w:lang w:val="en-ID"/>
               </w:rPr>
-              <w:t>m</w:t>
+              <w:t xml:space="preserve">{testing_type} </w:t>
             </w:r>
             <w:r>
               <w:rPr>
@@ -6096,161 +5924,17 @@
                 <w:szCs w:val="20"/>
                 <w:lang w:val="en-ID"/>
               </w:rPr>
-              <w:t>odel</w:t>
-            </w:r>
-            <w:r>
-              <w:rPr>
-                <w:rFonts w:ascii="Arial" w:hAnsi="Arial" w:cs="Arial"/>
-                <w:sz w:val="20"/>
-                <w:szCs w:val="20"/>
-                <w:lang w:val="pt-BR"/>
-              </w:rPr>
-              <w:t xml:space="preserve"> </w:t>
-            </w:r>
-            <w:r>
-              <w:rPr>
-                <w:rFonts w:ascii="Arial" w:hAnsi="Arial" w:cs="Arial"/>
-                <w:sz w:val="20"/>
-                <w:szCs w:val="20"/>
-                <w:lang w:val="en-ID" w:eastAsia="zh-CN"/>
-              </w:rPr>
-              <w:t>{model}</w:t>
-            </w:r>
-            <w:r>
-              <w:rPr>
-                <w:rFonts w:ascii="Arial" w:hAnsi="Arial" w:cs="Arial"/>
-                <w:sz w:val="20"/>
-                <w:szCs w:val="20"/>
-                <w:lang w:val="en-ID" w:eastAsia="zh-CN"/>
-              </w:rPr>
-              <w:t xml:space="preserve"> </w:t>
-            </w:r>
-            <w:proofErr w:type="spellStart"/>
-            <w:r>
-              <w:rPr>
-                <w:rFonts w:ascii="Arial" w:hAnsi="Arial" w:cs="Arial"/>
+              <w:t xml:space="preserve">dengan </w:t>
+            </w:r>
+            <w:r>
+              <w:rPr>
+                <w:rFonts w:ascii="Arial" w:hAnsi="Arial" w:cs="Arial"/>
+                <w:bCs/>
                 <w:sz w:val="20"/>
                 <w:szCs w:val="20"/>
                 <w:lang w:val="en-ID"/>
               </w:rPr>
-              <w:t>dilakukan</w:t>
-            </w:r>
-            <w:proofErr w:type="spellEnd"/>
-            <w:r>
-              <w:rPr>
-                <w:rFonts w:ascii="Arial" w:hAnsi="Arial" w:cs="Arial"/>
-                <w:sz w:val="20"/>
-                <w:szCs w:val="20"/>
-                <w:lang w:val="en-ID"/>
-              </w:rPr>
-              <w:t xml:space="preserve"> </w:t>
-            </w:r>
-            <w:proofErr w:type="spellStart"/>
-            <w:r>
-              <w:rPr>
-                <w:rFonts w:ascii="Arial" w:hAnsi="Arial" w:cs="Arial"/>
-                <w:sz w:val="20"/>
-                <w:szCs w:val="20"/>
-                <w:lang w:val="en-ID"/>
-              </w:rPr>
-              <w:t>pengujian</w:t>
-            </w:r>
-            <w:proofErr w:type="spellEnd"/>
-            <w:r>
-              <w:rPr>
-                <w:rFonts w:ascii="Arial" w:hAnsi="Arial" w:cs="Arial"/>
-                <w:bCs/>
-                <w:sz w:val="20"/>
-                <w:szCs w:val="20"/>
-                <w:lang w:val="en-ID"/>
-              </w:rPr>
-              <w:t xml:space="preserve"> </w:t>
-            </w:r>
-            <w:r>
-              <w:rPr>
-                <w:rFonts w:ascii="Arial" w:hAnsi="Arial" w:cs="Arial"/>
-                <w:bCs/>
-                <w:sz w:val="20"/>
-                <w:szCs w:val="20"/>
-                <w:lang w:val="en-ID"/>
-              </w:rPr>
-              <w:t>{</w:t>
-            </w:r>
-            <w:proofErr w:type="spellStart"/>
-            <w:r>
-              <w:rPr>
-                <w:rFonts w:ascii="Arial" w:hAnsi="Arial" w:cs="Arial"/>
-                <w:bCs/>
-                <w:sz w:val="20"/>
-                <w:szCs w:val="20"/>
-                <w:lang w:val="en-ID"/>
-              </w:rPr>
-              <w:t>testing_type</w:t>
-            </w:r>
-            <w:proofErr w:type="spellEnd"/>
-            <w:r>
-              <w:rPr>
-                <w:rFonts w:ascii="Arial" w:hAnsi="Arial" w:cs="Arial"/>
-                <w:bCs/>
-                <w:sz w:val="20"/>
-                <w:szCs w:val="20"/>
-                <w:lang w:val="en-ID"/>
-              </w:rPr>
-              <w:t xml:space="preserve">} </w:t>
-            </w:r>
-            <w:proofErr w:type="spellStart"/>
-            <w:r>
-              <w:rPr>
-                <w:rFonts w:ascii="Arial" w:hAnsi="Arial" w:cs="Arial"/>
-                <w:bCs/>
-                <w:sz w:val="20"/>
-                <w:szCs w:val="20"/>
-                <w:lang w:val="en-ID"/>
-              </w:rPr>
-              <w:t>dengan</w:t>
-            </w:r>
-            <w:proofErr w:type="spellEnd"/>
-            <w:r>
-              <w:rPr>
-                <w:rFonts w:ascii="Arial" w:hAnsi="Arial" w:cs="Arial"/>
-                <w:bCs/>
-                <w:sz w:val="20"/>
-                <w:szCs w:val="20"/>
-                <w:lang w:val="en-ID"/>
-              </w:rPr>
-              <w:t xml:space="preserve"> </w:t>
-            </w:r>
-            <w:r>
-              <w:rPr>
-                <w:rFonts w:ascii="Arial" w:hAnsi="Arial" w:cs="Arial"/>
-                <w:bCs/>
-                <w:sz w:val="20"/>
-                <w:szCs w:val="20"/>
-                <w:lang w:val="en-ID"/>
-              </w:rPr>
-              <w:t>{</w:t>
-            </w:r>
-            <w:proofErr w:type="spellStart"/>
-            <w:r>
-              <w:rPr>
-                <w:rFonts w:ascii="Arial" w:hAnsi="Arial" w:cs="Arial"/>
-                <w:bCs/>
-                <w:sz w:val="20"/>
-                <w:szCs w:val="20"/>
-                <w:lang w:val="en-ID"/>
-              </w:rPr>
-              <w:t>iwo_or_duty_letter</w:t>
-            </w:r>
-            <w:proofErr w:type="spellEnd"/>
-            <w:r>
-              <w:rPr>
-                <w:rFonts w:ascii="Arial" w:hAnsi="Arial" w:cs="Arial"/>
-                <w:bCs/>
-                <w:sz w:val="20"/>
-                <w:szCs w:val="20"/>
-                <w:lang w:val="en-ID"/>
-              </w:rPr>
-              <w:t>}</w:t>
+              <w:t>{iwo_or_duty_letter}</w:t>
             </w:r>
           </w:p>
         </w:tc>
@@ -6310,7 +5994,6 @@
                 <w:u w:val="single"/>
               </w:rPr>
             </w:pPr>
-            <w:proofErr w:type="spellStart"/>
             <w:r>
               <w:rPr>
                 <w:rFonts w:ascii="Arial" w:hAnsi="Arial" w:cs="Arial"/>
@@ -6320,33 +6003,8 @@
                 <w:szCs w:val="20"/>
                 <w:u w:val="single"/>
               </w:rPr>
-              <w:t>Informasi</w:t>
-            </w:r>
-            <w:proofErr w:type="spellEnd"/>
-            <w:r>
-              <w:rPr>
-                <w:rFonts w:ascii="Arial" w:hAnsi="Arial" w:cs="Arial"/>
-                <w:b/>
-                <w:bCs/>
-                <w:sz w:val="20"/>
-                <w:szCs w:val="20"/>
-                <w:u w:val="single"/>
-              </w:rPr>
-              <w:t xml:space="preserve"> Umum </w:t>
-            </w:r>
-            <w:proofErr w:type="spellStart"/>
-            <w:r>
-              <w:rPr>
-                <w:rFonts w:ascii="Arial" w:hAnsi="Arial" w:cs="Arial"/>
-                <w:b/>
-                <w:bCs/>
-                <w:sz w:val="20"/>
-                <w:szCs w:val="20"/>
-                <w:u w:val="single"/>
-              </w:rPr>
-              <w:t>Produk</w:t>
-            </w:r>
-            <w:proofErr w:type="spellEnd"/>
+              <w:t>Informasi Umum Produk</w:t>
+            </w:r>
           </w:p>
           <w:p>
             <w:pPr>
@@ -6597,27 +6255,7 @@
                       <w:szCs w:val="20"/>
                       <w:lang w:val="en-GB" w:eastAsia="zh-CN"/>
                     </w:rPr>
-                    <w:t>{</w:t>
-                  </w:r>
-                  <w:proofErr w:type="spellStart"/>
-                  <w:r>
-                    <w:rPr>
-                      <w:rFonts w:ascii="Arial" w:hAnsi="Arial" w:cs="Arial"/>
-                      <w:sz w:val="20"/>
-                      <w:szCs w:val="20"/>
-                      <w:lang w:val="en-GB" w:eastAsia="zh-CN"/>
-                    </w:rPr>
-                    <w:t>marking_voltage</w:t>
-                  </w:r>
-                  <w:proofErr w:type="spellEnd"/>
-                  <w:r>
-                    <w:rPr>
-                      <w:rFonts w:ascii="Arial" w:hAnsi="Arial" w:cs="Arial"/>
-                      <w:sz w:val="20"/>
-                      <w:szCs w:val="20"/>
-                      <w:lang w:val="en-GB" w:eastAsia="zh-CN"/>
-                    </w:rPr>
-                    <w:t>}</w:t>
+                    <w:t>{marking_voltage}</w:t>
                   </w:r>
                 </w:p>
               </w:tc>
@@ -6643,27 +6281,7 @@
                       <w:szCs w:val="20"/>
                       <w:lang w:val="en-GB"/>
                     </w:rPr>
-                    <w:t>{</w:t>
-                  </w:r>
-                  <w:proofErr w:type="spellStart"/>
-                  <w:r>
-                    <w:rPr>
-                      <w:rFonts w:ascii="Arial" w:hAnsi="Arial" w:cs="Arial"/>
-                      <w:sz w:val="20"/>
-                      <w:szCs w:val="20"/>
-                      <w:lang w:val="en-GB"/>
-                    </w:rPr>
-                    <w:t>marking_freq</w:t>
-                  </w:r>
-                  <w:proofErr w:type="spellEnd"/>
-                  <w:r>
-                    <w:rPr>
-                      <w:rFonts w:ascii="Arial" w:hAnsi="Arial" w:cs="Arial"/>
-                      <w:sz w:val="20"/>
-                      <w:szCs w:val="20"/>
-                      <w:lang w:val="en-GB"/>
-                    </w:rPr>
-                    <w:t>}</w:t>
+                    <w:t>{marking_freq}</w:t>
                   </w:r>
                 </w:p>
               </w:tc>
@@ -6689,27 +6307,7 @@
                       <w:szCs w:val="20"/>
                       <w:lang w:val="en-US"/>
                     </w:rPr>
-                    <w:t>{</w:t>
-                  </w:r>
-                  <w:proofErr w:type="spellStart"/>
-                  <w:r>
-                    <w:rPr>
-                      <w:rFonts w:ascii="Arial" w:hAnsi="Arial" w:cs="Arial"/>
-                      <w:sz w:val="20"/>
-                      <w:szCs w:val="20"/>
-                      <w:lang w:val="en-US"/>
-                    </w:rPr>
-                    <w:t>marking_power</w:t>
-                  </w:r>
-                  <w:proofErr w:type="spellEnd"/>
-                  <w:r>
-                    <w:rPr>
-                      <w:rFonts w:ascii="Arial" w:hAnsi="Arial" w:cs="Arial"/>
-                      <w:sz w:val="20"/>
-                      <w:szCs w:val="20"/>
-                      <w:lang w:val="en-US"/>
-                    </w:rPr>
-                    <w:t>}</w:t>
+                    <w:t>{marking_power}</w:t>
                   </w:r>
                 </w:p>
               </w:tc>
@@ -7050,43 +6648,7 @@
                 <w:sz w:val="20"/>
                 <w:szCs w:val="20"/>
               </w:rPr>
-              <w:t>{/is_header} {^</w:t>
-            </w:r>
-            <w:proofErr w:type="spellStart"/>
-            <w:r>
-              <w:rPr>
-                <w:rFonts w:ascii="Arial" w:hAnsi="Arial" w:cs="Arial"/>
-                <w:sz w:val="20"/>
-                <w:szCs w:val="20"/>
-              </w:rPr>
-              <w:t>is_header</w:t>
-            </w:r>
-            <w:proofErr w:type="spellEnd"/>
-            <w:r>
-              <w:rPr>
-                <w:rFonts w:ascii="Arial" w:hAnsi="Arial" w:cs="Arial"/>
-                <w:sz w:val="20"/>
-                <w:szCs w:val="20"/>
-              </w:rPr>
-              <w:t>} {text} {/</w:t>
-            </w:r>
-            <w:proofErr w:type="spellStart"/>
-            <w:r>
-              <w:rPr>
-                <w:rFonts w:ascii="Arial" w:hAnsi="Arial" w:cs="Arial"/>
-                <w:sz w:val="20"/>
-                <w:szCs w:val="20"/>
-              </w:rPr>
-              <w:t>is_header</w:t>
-            </w:r>
-            <w:proofErr w:type="spellEnd"/>
-            <w:r>
-              <w:rPr>
-                <w:rFonts w:ascii="Arial" w:hAnsi="Arial" w:cs="Arial"/>
-                <w:sz w:val="20"/>
-                <w:szCs w:val="20"/>
-              </w:rPr>
-              <w:t>}</w:t>
+              <w:t>{/is_header} {^is_header} {text} {/is_header}</w:t>
             </w:r>
           </w:p>
         </w:tc>
@@ -7187,25 +6749,7 @@
                 <w:sz w:val="20"/>
                 <w:szCs w:val="20"/>
               </w:rPr>
-              <w:t>{/is_header} {^</w:t>
-            </w:r>
-            <w:proofErr w:type="spellStart"/>
-            <w:r>
-              <w:rPr>
-                <w:rFonts w:ascii="Arial" w:hAnsi="Arial" w:cs="Arial"/>
-                <w:sz w:val="20"/>
-                <w:szCs w:val="20"/>
-              </w:rPr>
-              <w:t>is_header</w:t>
-            </w:r>
-            <w:proofErr w:type="spellEnd"/>
-            <w:r>
-              <w:rPr>
-                <w:rFonts w:ascii="Arial" w:hAnsi="Arial" w:cs="Arial"/>
-                <w:sz w:val="20"/>
-                <w:szCs w:val="20"/>
-              </w:rPr>
-              <w:t>} {</w:t>
+              <w:t>{/is_header} {^is_header} {</w:t>
             </w:r>
             <w:r>
               <w:rPr>
@@ -7221,25 +6765,7 @@
                 <w:sz w:val="20"/>
                 <w:szCs w:val="20"/>
               </w:rPr>
-              <w:t>} {/</w:t>
-            </w:r>
-            <w:proofErr w:type="spellStart"/>
-            <w:r>
-              <w:rPr>
-                <w:rFonts w:ascii="Arial" w:hAnsi="Arial" w:cs="Arial"/>
-                <w:sz w:val="20"/>
-                <w:szCs w:val="20"/>
-              </w:rPr>
-              <w:t>is_header</w:t>
-            </w:r>
-            <w:proofErr w:type="spellEnd"/>
-            <w:r>
-              <w:rPr>
-                <w:rFonts w:ascii="Arial" w:hAnsi="Arial" w:cs="Arial"/>
-                <w:sz w:val="20"/>
-                <w:szCs w:val="20"/>
-              </w:rPr>
-              <w:t>}</w:t>
+              <w:t>} {/is_header}</w:t>
             </w:r>
             <w:r>
               <w:rPr>
@@ -7417,9 +6943,8 @@
                 <w:szCs w:val="20"/>
                 <w:lang w:val="en-US"/>
               </w:rPr>
-              <w:t>{</w:t>
-            </w:r>
-            <w:proofErr w:type="spellStart"/>
+              <w:t>{result</w:t>
+            </w:r>
             <w:r>
               <w:rPr>
                 <w:rFonts w:ascii="Arial" w:hAnsi="Arial" w:cs="Arial"/>
@@ -7428,19 +6953,8 @@
                 <w:szCs w:val="20"/>
                 <w:lang w:val="en-US"/>
               </w:rPr>
-              <w:t>result</w:t>
-            </w:r>
-            <w:r>
-              <w:rPr>
-                <w:rFonts w:ascii="Arial" w:hAnsi="Arial" w:cs="Arial"/>
-                <w:b/>
-                <w:sz w:val="20"/>
-                <w:szCs w:val="20"/>
-                <w:lang w:val="en-US"/>
-              </w:rPr>
               <w:t>_table_title</w:t>
             </w:r>
-            <w:proofErr w:type="spellEnd"/>
             <w:r>
               <w:rPr>
                 <w:rFonts w:ascii="Arial" w:hAnsi="Arial" w:cs="Arial"/>
@@ -8297,23 +7811,13 @@
                 <w:lang w:val="id-ID"/>
               </w:rPr>
             </w:pPr>
-            <w:proofErr w:type="spellStart"/>
             <w:r>
               <w:rPr>
                 <w:rFonts w:ascii="Arial" w:hAnsi="Arial" w:cs="Arial"/>
                 <w:sz w:val="18"/>
                 <w:szCs w:val="18"/>
               </w:rPr>
-              <w:t>Min.majordiameterofthescrew</w:t>
-            </w:r>
-            <w:proofErr w:type="spellEnd"/>
-            <w:r>
-              <w:rPr>
-                <w:rFonts w:ascii="Arial" w:hAnsi="Arial" w:cs="Arial"/>
-                <w:sz w:val="18"/>
-                <w:szCs w:val="18"/>
-              </w:rPr>
-              <w:t xml:space="preserve"> Thread (7006-28A)</w:t>
+              <w:t>Min.majordiameterofthescrew Thread (7006-28A)</w:t>
             </w:r>
           </w:p>
         </w:tc>
@@ -9108,23 +8612,13 @@
                 <w:lang w:val="id-ID"/>
               </w:rPr>
             </w:pPr>
-            <w:proofErr w:type="spellStart"/>
             <w:r>
               <w:rPr>
                 <w:rFonts w:ascii="Arial" w:hAnsi="Arial" w:cs="Arial"/>
                 <w:sz w:val="18"/>
                 <w:szCs w:val="18"/>
               </w:rPr>
-              <w:t>Contactmaking</w:t>
-            </w:r>
-            <w:proofErr w:type="spellEnd"/>
-            <w:r>
-              <w:rPr>
-                <w:rFonts w:ascii="Arial" w:hAnsi="Arial" w:cs="Arial"/>
-                <w:sz w:val="18"/>
-                <w:szCs w:val="18"/>
-              </w:rPr>
-              <w:t xml:space="preserve"> (7006-50)</w:t>
+              <w:t>Contactmaking (7006-50)</w:t>
             </w:r>
           </w:p>
         </w:tc>
@@ -9552,7 +9046,6 @@
                 <w:szCs w:val="20"/>
               </w:rPr>
             </w:pPr>
-            <w:proofErr w:type="spellStart"/>
             <w:r>
               <w:rPr>
                 <w:rFonts w:ascii="Arial" w:hAnsi="Arial" w:cs="Arial"/>
@@ -9560,29 +9053,8 @@
                 <w:sz w:val="20"/>
                 <w:szCs w:val="20"/>
               </w:rPr>
-              <w:t>Resistansi</w:t>
-            </w:r>
-            <w:proofErr w:type="spellEnd"/>
-            <w:r>
-              <w:rPr>
-                <w:rFonts w:ascii="Arial" w:hAnsi="Arial" w:cs="Arial"/>
-                <w:b/>
-                <w:sz w:val="20"/>
-                <w:szCs w:val="20"/>
-              </w:rPr>
-              <w:t xml:space="preserve"> </w:t>
-            </w:r>
-            <w:proofErr w:type="spellStart"/>
-            <w:r>
-              <w:rPr>
-                <w:rFonts w:ascii="Arial" w:hAnsi="Arial" w:cs="Arial"/>
-                <w:b/>
-                <w:sz w:val="20"/>
-                <w:szCs w:val="20"/>
-              </w:rPr>
-              <w:t>Isolasi</w:t>
-            </w:r>
-            <w:proofErr w:type="spellEnd"/>
+              <w:t>Resistansi Isolasi</w:t>
+            </w:r>
           </w:p>
         </w:tc>
         <w:tc>
@@ -9608,29 +9080,7 @@
                 <w:szCs w:val="20"/>
                 <w:lang w:val="en-US"/>
               </w:rPr>
-              <w:t>{</w:t>
-            </w:r>
-            <w:proofErr w:type="spellStart"/>
-            <w:r>
-              <w:rPr>
-                <w:rFonts w:ascii="Arial" w:hAnsi="Arial" w:cs="Arial"/>
-                <w:b/>
-                <w:sz w:val="20"/>
-                <w:szCs w:val="20"/>
-                <w:lang w:val="en-US"/>
-              </w:rPr>
-              <w:t>result_table_title</w:t>
-            </w:r>
-            <w:proofErr w:type="spellEnd"/>
-            <w:r>
-              <w:rPr>
-                <w:rFonts w:ascii="Arial" w:hAnsi="Arial" w:cs="Arial"/>
-                <w:b/>
-                <w:sz w:val="20"/>
-                <w:szCs w:val="20"/>
-                <w:lang w:val="en-US"/>
-              </w:rPr>
-              <w:t>}</w:t>
+              <w:t>{result_table_title}</w:t>
             </w:r>
           </w:p>
         </w:tc>
@@ -9661,18 +9111,8 @@
                 <w:sz w:val="20"/>
                 <w:szCs w:val="20"/>
               </w:rPr>
-              <w:t xml:space="preserve">Bagian yang </w:t>
-            </w:r>
-            <w:proofErr w:type="spellStart"/>
-            <w:r>
-              <w:rPr>
-                <w:rFonts w:ascii="Arial" w:hAnsi="Arial" w:cs="Arial"/>
-                <w:sz w:val="20"/>
-                <w:szCs w:val="20"/>
-              </w:rPr>
-              <w:t>diukur</w:t>
-            </w:r>
-            <w:proofErr w:type="spellEnd"/>
+              <w:t>Bagian yang diukur</w:t>
+            </w:r>
           </w:p>
         </w:tc>
         <w:tc>
@@ -9695,43 +9135,7 @@
                 <w:sz w:val="20"/>
                 <w:szCs w:val="20"/>
               </w:rPr>
-              <w:t xml:space="preserve">Nilai </w:t>
-            </w:r>
-            <w:proofErr w:type="spellStart"/>
-            <w:r>
-              <w:rPr>
-                <w:rFonts w:ascii="Arial" w:hAnsi="Arial" w:cs="Arial"/>
-                <w:sz w:val="20"/>
-                <w:szCs w:val="20"/>
-              </w:rPr>
-              <w:t>Resistansi</w:t>
-            </w:r>
-            <w:proofErr w:type="spellEnd"/>
-            <w:r>
-              <w:rPr>
-                <w:rFonts w:ascii="Arial" w:hAnsi="Arial" w:cs="Arial"/>
-                <w:sz w:val="20"/>
-                <w:szCs w:val="20"/>
-              </w:rPr>
-              <w:t xml:space="preserve"> </w:t>
-            </w:r>
-            <w:proofErr w:type="spellStart"/>
-            <w:r>
-              <w:rPr>
-                <w:rFonts w:ascii="Arial" w:hAnsi="Arial" w:cs="Arial"/>
-                <w:sz w:val="20"/>
-                <w:szCs w:val="20"/>
-              </w:rPr>
-              <w:t>Isolasi</w:t>
-            </w:r>
-            <w:proofErr w:type="spellEnd"/>
-            <w:r>
-              <w:rPr>
-                <w:rFonts w:ascii="Arial" w:hAnsi="Arial" w:cs="Arial"/>
-                <w:sz w:val="20"/>
-                <w:szCs w:val="20"/>
-              </w:rPr>
-              <w:t xml:space="preserve"> (GΩ)</w:t>
+              <w:t>Nilai Resistansi Isolasi (GΩ)</w:t>
             </w:r>
           </w:p>
         </w:tc>
@@ -9751,41 +9155,13 @@
                 <w:szCs w:val="20"/>
               </w:rPr>
             </w:pPr>
-            <w:proofErr w:type="spellStart"/>
-            <w:r>
-              <w:rPr>
-                <w:rFonts w:ascii="Arial" w:hAnsi="Arial" w:cs="Arial"/>
-                <w:sz w:val="20"/>
-                <w:szCs w:val="20"/>
-              </w:rPr>
-              <w:t>Persyaratan</w:t>
-            </w:r>
-            <w:proofErr w:type="spellEnd"/>
-            <w:r>
-              <w:rPr>
-                <w:rFonts w:ascii="Arial" w:hAnsi="Arial" w:cs="Arial"/>
-                <w:sz w:val="20"/>
-                <w:szCs w:val="20"/>
-              </w:rPr>
-              <w:t xml:space="preserve"> </w:t>
-            </w:r>
-            <w:proofErr w:type="spellStart"/>
-            <w:r>
-              <w:rPr>
-                <w:rFonts w:ascii="Arial" w:hAnsi="Arial" w:cs="Arial"/>
-                <w:sz w:val="20"/>
-                <w:szCs w:val="20"/>
-              </w:rPr>
-              <w:t>Standar</w:t>
-            </w:r>
-            <w:proofErr w:type="spellEnd"/>
-            <w:r>
-              <w:rPr>
-                <w:rFonts w:ascii="Arial" w:hAnsi="Arial" w:cs="Arial"/>
-                <w:sz w:val="20"/>
-                <w:szCs w:val="20"/>
-              </w:rPr>
-              <w:t xml:space="preserve"> (MΩ)</w:t>
+            <w:r>
+              <w:rPr>
+                <w:rFonts w:ascii="Arial" w:hAnsi="Arial" w:cs="Arial"/>
+                <w:sz w:val="20"/>
+                <w:szCs w:val="20"/>
+              </w:rPr>
+              <w:t>Persyaratan Standar (MΩ)</w:t>
             </w:r>
           </w:p>
         </w:tc>
@@ -9815,43 +9191,7 @@
                 <w:sz w:val="20"/>
                 <w:szCs w:val="20"/>
               </w:rPr>
-              <w:t xml:space="preserve">Kaki </w:t>
-            </w:r>
-            <w:proofErr w:type="spellStart"/>
-            <w:r>
-              <w:rPr>
-                <w:rFonts w:ascii="Arial" w:hAnsi="Arial" w:cs="Arial"/>
-                <w:sz w:val="20"/>
-                <w:szCs w:val="20"/>
-              </w:rPr>
-              <w:t>lampu</w:t>
-            </w:r>
-            <w:proofErr w:type="spellEnd"/>
-            <w:r>
-              <w:rPr>
-                <w:rFonts w:ascii="Arial" w:hAnsi="Arial" w:cs="Arial"/>
-                <w:sz w:val="20"/>
-                <w:szCs w:val="20"/>
-              </w:rPr>
-              <w:t xml:space="preserve"> I + </w:t>
-            </w:r>
-            <w:proofErr w:type="spellStart"/>
-            <w:r>
-              <w:rPr>
-                <w:rFonts w:ascii="Arial" w:hAnsi="Arial" w:cs="Arial"/>
-                <w:sz w:val="20"/>
-                <w:szCs w:val="20"/>
-              </w:rPr>
-              <w:t>Selungkup</w:t>
-            </w:r>
-            <w:proofErr w:type="spellEnd"/>
-            <w:r>
-              <w:rPr>
-                <w:rFonts w:ascii="Arial" w:hAnsi="Arial" w:cs="Arial"/>
-                <w:sz w:val="20"/>
-                <w:szCs w:val="20"/>
-              </w:rPr>
-              <w:t xml:space="preserve"> </w:t>
+              <w:t xml:space="preserve">Kaki lampu I + Selungkup </w:t>
             </w:r>
           </w:p>
         </w:tc>
@@ -9933,43 +9273,7 @@
                 <w:sz w:val="20"/>
                 <w:szCs w:val="20"/>
               </w:rPr>
-              <w:t xml:space="preserve">Kaki </w:t>
-            </w:r>
-            <w:proofErr w:type="spellStart"/>
-            <w:r>
-              <w:rPr>
-                <w:rFonts w:ascii="Arial" w:hAnsi="Arial" w:cs="Arial"/>
-                <w:sz w:val="20"/>
-                <w:szCs w:val="20"/>
-              </w:rPr>
-              <w:t>lampu</w:t>
-            </w:r>
-            <w:proofErr w:type="spellEnd"/>
-            <w:r>
-              <w:rPr>
-                <w:rFonts w:ascii="Arial" w:hAnsi="Arial" w:cs="Arial"/>
-                <w:sz w:val="20"/>
-                <w:szCs w:val="20"/>
-              </w:rPr>
-              <w:t xml:space="preserve"> II + </w:t>
-            </w:r>
-            <w:proofErr w:type="spellStart"/>
-            <w:r>
-              <w:rPr>
-                <w:rFonts w:ascii="Arial" w:hAnsi="Arial" w:cs="Arial"/>
-                <w:sz w:val="20"/>
-                <w:szCs w:val="20"/>
-              </w:rPr>
-              <w:t>Selungkup</w:t>
-            </w:r>
-            <w:proofErr w:type="spellEnd"/>
-            <w:r>
-              <w:rPr>
-                <w:rFonts w:ascii="Arial" w:hAnsi="Arial" w:cs="Arial"/>
-                <w:sz w:val="20"/>
-                <w:szCs w:val="20"/>
-              </w:rPr>
-              <w:t xml:space="preserve"> </w:t>
+              <w:t xml:space="preserve">Kaki lampu II + Selungkup </w:t>
             </w:r>
           </w:p>
         </w:tc>
@@ -10049,43 +9353,7 @@
                 <w:sz w:val="20"/>
                 <w:szCs w:val="20"/>
               </w:rPr>
-              <w:t xml:space="preserve">Kaki </w:t>
-            </w:r>
-            <w:proofErr w:type="spellStart"/>
-            <w:r>
-              <w:rPr>
-                <w:rFonts w:ascii="Arial" w:hAnsi="Arial" w:cs="Arial"/>
-                <w:sz w:val="20"/>
-                <w:szCs w:val="20"/>
-              </w:rPr>
-              <w:t>lampu</w:t>
-            </w:r>
-            <w:proofErr w:type="spellEnd"/>
-            <w:r>
-              <w:rPr>
-                <w:rFonts w:ascii="Arial" w:hAnsi="Arial" w:cs="Arial"/>
-                <w:sz w:val="20"/>
-                <w:szCs w:val="20"/>
-              </w:rPr>
-              <w:t xml:space="preserve"> III + </w:t>
-            </w:r>
-            <w:proofErr w:type="spellStart"/>
-            <w:r>
-              <w:rPr>
-                <w:rFonts w:ascii="Arial" w:hAnsi="Arial" w:cs="Arial"/>
-                <w:sz w:val="20"/>
-                <w:szCs w:val="20"/>
-              </w:rPr>
-              <w:t>Selungkup</w:t>
-            </w:r>
-            <w:proofErr w:type="spellEnd"/>
-            <w:r>
-              <w:rPr>
-                <w:rFonts w:ascii="Arial" w:hAnsi="Arial" w:cs="Arial"/>
-                <w:sz w:val="20"/>
-                <w:szCs w:val="20"/>
-              </w:rPr>
-              <w:t xml:space="preserve"> </w:t>
+              <w:t xml:space="preserve">Kaki lampu III + Selungkup </w:t>
             </w:r>
           </w:p>
         </w:tc>
@@ -10256,29 +9524,7 @@
                 <w:szCs w:val="20"/>
                 <w:lang w:val="en-US"/>
               </w:rPr>
-              <w:t>{</w:t>
-            </w:r>
-            <w:proofErr w:type="spellStart"/>
-            <w:r>
-              <w:rPr>
-                <w:rFonts w:ascii="Arial" w:hAnsi="Arial" w:cs="Arial"/>
-                <w:b/>
-                <w:sz w:val="20"/>
-                <w:szCs w:val="20"/>
-                <w:lang w:val="en-US"/>
-              </w:rPr>
-              <w:t>result_table_title</w:t>
-            </w:r>
-            <w:proofErr w:type="spellEnd"/>
-            <w:r>
-              <w:rPr>
-                <w:rFonts w:ascii="Arial" w:hAnsi="Arial" w:cs="Arial"/>
-                <w:b/>
-                <w:sz w:val="20"/>
-                <w:szCs w:val="20"/>
-                <w:lang w:val="en-US"/>
-              </w:rPr>
-              <w:t>}</w:t>
+              <w:t>{result_table_title}</w:t>
             </w:r>
           </w:p>
         </w:tc>
@@ -10309,18 +9555,8 @@
                 <w:sz w:val="20"/>
                 <w:szCs w:val="20"/>
               </w:rPr>
-              <w:t xml:space="preserve">Bagian yang </w:t>
-            </w:r>
-            <w:proofErr w:type="spellStart"/>
-            <w:r>
-              <w:rPr>
-                <w:rFonts w:ascii="Arial" w:hAnsi="Arial" w:cs="Arial"/>
-                <w:sz w:val="20"/>
-                <w:szCs w:val="20"/>
-              </w:rPr>
-              <w:t>diukur</w:t>
-            </w:r>
-            <w:proofErr w:type="spellEnd"/>
+              <w:t>Bagian yang diukur</w:t>
+            </w:r>
           </w:p>
         </w:tc>
         <w:tc>
@@ -10337,23 +9573,13 @@
                 <w:szCs w:val="20"/>
               </w:rPr>
             </w:pPr>
-            <w:proofErr w:type="spellStart"/>
-            <w:r>
-              <w:rPr>
-                <w:rFonts w:ascii="Arial" w:hAnsi="Arial" w:cs="Arial"/>
-                <w:sz w:val="20"/>
-                <w:szCs w:val="20"/>
-              </w:rPr>
-              <w:t>Tegangan</w:t>
-            </w:r>
-            <w:proofErr w:type="spellEnd"/>
-            <w:r>
-              <w:rPr>
-                <w:rFonts w:ascii="Arial" w:hAnsi="Arial" w:cs="Arial"/>
-                <w:sz w:val="20"/>
-                <w:szCs w:val="20"/>
-              </w:rPr>
-              <w:t xml:space="preserve"> Uji </w:t>
+            <w:r>
+              <w:rPr>
+                <w:rFonts w:ascii="Arial" w:hAnsi="Arial" w:cs="Arial"/>
+                <w:sz w:val="20"/>
+                <w:szCs w:val="20"/>
+              </w:rPr>
+              <w:t xml:space="preserve">Tegangan Uji </w:t>
             </w:r>
           </w:p>
         </w:tc>
@@ -10409,36 +9635,8 @@
                 <w:sz w:val="20"/>
                 <w:szCs w:val="20"/>
               </w:rPr>
-              <w:t xml:space="preserve">Kaki </w:t>
-            </w:r>
-            <w:proofErr w:type="spellStart"/>
-            <w:r>
-              <w:rPr>
-                <w:rFonts w:ascii="Arial" w:hAnsi="Arial" w:cs="Arial"/>
-                <w:sz w:val="20"/>
-                <w:szCs w:val="20"/>
-              </w:rPr>
-              <w:t>lampu</w:t>
-            </w:r>
-            <w:proofErr w:type="spellEnd"/>
-            <w:r>
-              <w:rPr>
-                <w:rFonts w:ascii="Arial" w:hAnsi="Arial" w:cs="Arial"/>
-                <w:sz w:val="20"/>
-                <w:szCs w:val="20"/>
-              </w:rPr>
-              <w:t xml:space="preserve"> I + </w:t>
-            </w:r>
-            <w:proofErr w:type="spellStart"/>
-            <w:r>
-              <w:rPr>
-                <w:rFonts w:ascii="Arial" w:hAnsi="Arial" w:cs="Arial"/>
-                <w:sz w:val="20"/>
-                <w:szCs w:val="20"/>
-              </w:rPr>
-              <w:t>Selungkup</w:t>
-            </w:r>
-            <w:proofErr w:type="spellEnd"/>
+              <w:t>Kaki lampu I + Selungkup</w:t>
+            </w:r>
           </w:p>
         </w:tc>
         <w:tc>
@@ -10461,18 +9659,8 @@
                 <w:sz w:val="20"/>
                 <w:szCs w:val="20"/>
               </w:rPr>
-              <w:t xml:space="preserve">1440 </w:t>
-            </w:r>
-            <w:proofErr w:type="spellStart"/>
-            <w:r>
-              <w:rPr>
-                <w:rFonts w:ascii="Arial" w:hAnsi="Arial" w:cs="Arial"/>
-                <w:sz w:val="20"/>
-                <w:szCs w:val="20"/>
-              </w:rPr>
-              <w:t>Vrms</w:t>
-            </w:r>
-            <w:proofErr w:type="spellEnd"/>
+              <w:t>1440 Vrms</w:t>
+            </w:r>
           </w:p>
         </w:tc>
         <w:tc>
@@ -10526,36 +9714,8 @@
                 <w:sz w:val="20"/>
                 <w:szCs w:val="20"/>
               </w:rPr>
-              <w:t xml:space="preserve">Kaki </w:t>
-            </w:r>
-            <w:proofErr w:type="spellStart"/>
-            <w:r>
-              <w:rPr>
-                <w:rFonts w:ascii="Arial" w:hAnsi="Arial" w:cs="Arial"/>
-                <w:sz w:val="20"/>
-                <w:szCs w:val="20"/>
-              </w:rPr>
-              <w:t>lampu</w:t>
-            </w:r>
-            <w:proofErr w:type="spellEnd"/>
-            <w:r>
-              <w:rPr>
-                <w:rFonts w:ascii="Arial" w:hAnsi="Arial" w:cs="Arial"/>
-                <w:sz w:val="20"/>
-                <w:szCs w:val="20"/>
-              </w:rPr>
-              <w:t xml:space="preserve"> II + </w:t>
-            </w:r>
-            <w:proofErr w:type="spellStart"/>
-            <w:r>
-              <w:rPr>
-                <w:rFonts w:ascii="Arial" w:hAnsi="Arial" w:cs="Arial"/>
-                <w:sz w:val="20"/>
-                <w:szCs w:val="20"/>
-              </w:rPr>
-              <w:t>Selungkup</w:t>
-            </w:r>
-            <w:proofErr w:type="spellEnd"/>
+              <w:t>Kaki lampu II + Selungkup</w:t>
+            </w:r>
           </w:p>
         </w:tc>
         <w:tc>
@@ -10578,18 +9738,8 @@
                 <w:sz w:val="20"/>
                 <w:szCs w:val="20"/>
               </w:rPr>
-              <w:t xml:space="preserve">1440 </w:t>
-            </w:r>
-            <w:proofErr w:type="spellStart"/>
-            <w:r>
-              <w:rPr>
-                <w:rFonts w:ascii="Arial" w:hAnsi="Arial" w:cs="Arial"/>
-                <w:sz w:val="20"/>
-                <w:szCs w:val="20"/>
-              </w:rPr>
-              <w:t>Vrms</w:t>
-            </w:r>
-            <w:proofErr w:type="spellEnd"/>
+              <w:t>1440 Vrms</w:t>
+            </w:r>
           </w:p>
         </w:tc>
         <w:tc>
@@ -10643,36 +9793,8 @@
                 <w:sz w:val="20"/>
                 <w:szCs w:val="20"/>
               </w:rPr>
-              <w:t xml:space="preserve">Kaki </w:t>
-            </w:r>
-            <w:proofErr w:type="spellStart"/>
-            <w:r>
-              <w:rPr>
-                <w:rFonts w:ascii="Arial" w:hAnsi="Arial" w:cs="Arial"/>
-                <w:sz w:val="20"/>
-                <w:szCs w:val="20"/>
-              </w:rPr>
-              <w:t>lampu</w:t>
-            </w:r>
-            <w:proofErr w:type="spellEnd"/>
-            <w:r>
-              <w:rPr>
-                <w:rFonts w:ascii="Arial" w:hAnsi="Arial" w:cs="Arial"/>
-                <w:sz w:val="20"/>
-                <w:szCs w:val="20"/>
-              </w:rPr>
-              <w:t xml:space="preserve"> III + </w:t>
-            </w:r>
-            <w:proofErr w:type="spellStart"/>
-            <w:r>
-              <w:rPr>
-                <w:rFonts w:ascii="Arial" w:hAnsi="Arial" w:cs="Arial"/>
-                <w:sz w:val="20"/>
-                <w:szCs w:val="20"/>
-              </w:rPr>
-              <w:t>Selungkup</w:t>
-            </w:r>
-            <w:proofErr w:type="spellEnd"/>
+              <w:t>Kaki lampu III + Selungkup</w:t>
+            </w:r>
           </w:p>
         </w:tc>
         <w:tc>
@@ -10695,18 +9817,8 @@
                 <w:sz w:val="20"/>
                 <w:szCs w:val="20"/>
               </w:rPr>
-              <w:t xml:space="preserve">1440 </w:t>
-            </w:r>
-            <w:proofErr w:type="spellStart"/>
-            <w:r>
-              <w:rPr>
-                <w:rFonts w:ascii="Arial" w:hAnsi="Arial" w:cs="Arial"/>
-                <w:sz w:val="20"/>
-                <w:szCs w:val="20"/>
-              </w:rPr>
-              <w:t>Vrms</w:t>
-            </w:r>
-            <w:proofErr w:type="spellEnd"/>
+              <w:t>1440 Vrms</w:t>
+            </w:r>
           </w:p>
         </w:tc>
         <w:tc>
@@ -10892,29 +10004,7 @@
                 <w:szCs w:val="20"/>
                 <w:lang w:val="en-US"/>
               </w:rPr>
-              <w:t>{</w:t>
-            </w:r>
-            <w:proofErr w:type="spellStart"/>
-            <w:r>
-              <w:rPr>
-                <w:rFonts w:ascii="Arial" w:hAnsi="Arial" w:cs="Arial"/>
-                <w:b/>
-                <w:sz w:val="20"/>
-                <w:szCs w:val="20"/>
-                <w:lang w:val="en-US"/>
-              </w:rPr>
-              <w:t>result_table_title</w:t>
-            </w:r>
-            <w:proofErr w:type="spellEnd"/>
-            <w:r>
-              <w:rPr>
-                <w:rFonts w:ascii="Arial" w:hAnsi="Arial" w:cs="Arial"/>
-                <w:b/>
-                <w:sz w:val="20"/>
-                <w:szCs w:val="20"/>
-                <w:lang w:val="en-US"/>
-              </w:rPr>
-              <w:t>}</w:t>
+              <w:t>{result_table_title}</w:t>
             </w:r>
           </w:p>
         </w:tc>
@@ -11768,7 +10858,6 @@
                 <w:szCs w:val="20"/>
               </w:rPr>
             </w:pPr>
-            <w:proofErr w:type="spellStart"/>
             <w:r>
               <w:rPr>
                 <w:rFonts w:ascii="Arial" w:hAnsi="Arial" w:cs="Arial"/>
@@ -11776,29 +10865,8 @@
                 <w:sz w:val="20"/>
                 <w:szCs w:val="20"/>
               </w:rPr>
-              <w:t>Resistansi</w:t>
-            </w:r>
-            <w:proofErr w:type="spellEnd"/>
-            <w:r>
-              <w:rPr>
-                <w:rFonts w:ascii="Arial" w:hAnsi="Arial" w:cs="Arial"/>
-                <w:b/>
-                <w:sz w:val="20"/>
-                <w:szCs w:val="20"/>
-              </w:rPr>
-              <w:t xml:space="preserve"> </w:t>
-            </w:r>
-            <w:proofErr w:type="spellStart"/>
-            <w:r>
-              <w:rPr>
-                <w:rFonts w:ascii="Arial" w:hAnsi="Arial" w:cs="Arial"/>
-                <w:b/>
-                <w:sz w:val="20"/>
-                <w:szCs w:val="20"/>
-              </w:rPr>
-              <w:t>Isolasi</w:t>
-            </w:r>
-            <w:proofErr w:type="spellEnd"/>
+              <w:t>Resistansi Isolasi</w:t>
+            </w:r>
           </w:p>
         </w:tc>
         <w:tc>
@@ -11824,29 +10892,7 @@
                 <w:szCs w:val="20"/>
                 <w:lang w:val="en-US"/>
               </w:rPr>
-              <w:t>{</w:t>
-            </w:r>
-            <w:proofErr w:type="spellStart"/>
-            <w:r>
-              <w:rPr>
-                <w:rFonts w:ascii="Arial" w:hAnsi="Arial" w:cs="Arial"/>
-                <w:b/>
-                <w:sz w:val="20"/>
-                <w:szCs w:val="20"/>
-                <w:lang w:val="en-US"/>
-              </w:rPr>
-              <w:t>result_table_title</w:t>
-            </w:r>
-            <w:proofErr w:type="spellEnd"/>
-            <w:r>
-              <w:rPr>
-                <w:rFonts w:ascii="Arial" w:hAnsi="Arial" w:cs="Arial"/>
-                <w:b/>
-                <w:sz w:val="20"/>
-                <w:szCs w:val="20"/>
-                <w:lang w:val="en-US"/>
-              </w:rPr>
-              <w:t>}</w:t>
+              <w:t>{result_table_title}</w:t>
             </w:r>
           </w:p>
         </w:tc>
@@ -11877,18 +10923,8 @@
                 <w:sz w:val="20"/>
                 <w:szCs w:val="20"/>
               </w:rPr>
-              <w:t xml:space="preserve">Bagian yang </w:t>
-            </w:r>
-            <w:proofErr w:type="spellStart"/>
-            <w:r>
-              <w:rPr>
-                <w:rFonts w:ascii="Arial" w:hAnsi="Arial" w:cs="Arial"/>
-                <w:sz w:val="20"/>
-                <w:szCs w:val="20"/>
-              </w:rPr>
-              <w:t>diukur</w:t>
-            </w:r>
-            <w:proofErr w:type="spellEnd"/>
+              <w:t>Bagian yang diukur</w:t>
+            </w:r>
           </w:p>
         </w:tc>
         <w:tc>
@@ -11911,43 +10947,7 @@
                 <w:sz w:val="20"/>
                 <w:szCs w:val="20"/>
               </w:rPr>
-              <w:t xml:space="preserve">Nilai </w:t>
-            </w:r>
-            <w:proofErr w:type="spellStart"/>
-            <w:r>
-              <w:rPr>
-                <w:rFonts w:ascii="Arial" w:hAnsi="Arial" w:cs="Arial"/>
-                <w:sz w:val="20"/>
-                <w:szCs w:val="20"/>
-              </w:rPr>
-              <w:t>Resistansi</w:t>
-            </w:r>
-            <w:proofErr w:type="spellEnd"/>
-            <w:r>
-              <w:rPr>
-                <w:rFonts w:ascii="Arial" w:hAnsi="Arial" w:cs="Arial"/>
-                <w:sz w:val="20"/>
-                <w:szCs w:val="20"/>
-              </w:rPr>
-              <w:t xml:space="preserve"> </w:t>
-            </w:r>
-            <w:proofErr w:type="spellStart"/>
-            <w:r>
-              <w:rPr>
-                <w:rFonts w:ascii="Arial" w:hAnsi="Arial" w:cs="Arial"/>
-                <w:sz w:val="20"/>
-                <w:szCs w:val="20"/>
-              </w:rPr>
-              <w:t>Isolasi</w:t>
-            </w:r>
-            <w:proofErr w:type="spellEnd"/>
-            <w:r>
-              <w:rPr>
-                <w:rFonts w:ascii="Arial" w:hAnsi="Arial" w:cs="Arial"/>
-                <w:sz w:val="20"/>
-                <w:szCs w:val="20"/>
-              </w:rPr>
-              <w:t xml:space="preserve"> (GΩ)</w:t>
+              <w:t>Nilai Resistansi Isolasi (GΩ)</w:t>
             </w:r>
           </w:p>
         </w:tc>
@@ -11967,41 +10967,13 @@
                 <w:szCs w:val="20"/>
               </w:rPr>
             </w:pPr>
-            <w:proofErr w:type="spellStart"/>
-            <w:r>
-              <w:rPr>
-                <w:rFonts w:ascii="Arial" w:hAnsi="Arial" w:cs="Arial"/>
-                <w:sz w:val="20"/>
-                <w:szCs w:val="20"/>
-              </w:rPr>
-              <w:t>Persyaratan</w:t>
-            </w:r>
-            <w:proofErr w:type="spellEnd"/>
-            <w:r>
-              <w:rPr>
-                <w:rFonts w:ascii="Arial" w:hAnsi="Arial" w:cs="Arial"/>
-                <w:sz w:val="20"/>
-                <w:szCs w:val="20"/>
-              </w:rPr>
-              <w:t xml:space="preserve"> </w:t>
-            </w:r>
-            <w:proofErr w:type="spellStart"/>
-            <w:r>
-              <w:rPr>
-                <w:rFonts w:ascii="Arial" w:hAnsi="Arial" w:cs="Arial"/>
-                <w:sz w:val="20"/>
-                <w:szCs w:val="20"/>
-              </w:rPr>
-              <w:t>Standar</w:t>
-            </w:r>
-            <w:proofErr w:type="spellEnd"/>
-            <w:r>
-              <w:rPr>
-                <w:rFonts w:ascii="Arial" w:hAnsi="Arial" w:cs="Arial"/>
-                <w:sz w:val="20"/>
-                <w:szCs w:val="20"/>
-              </w:rPr>
-              <w:t xml:space="preserve"> (MΩ)</w:t>
+            <w:r>
+              <w:rPr>
+                <w:rFonts w:ascii="Arial" w:hAnsi="Arial" w:cs="Arial"/>
+                <w:sz w:val="20"/>
+                <w:szCs w:val="20"/>
+              </w:rPr>
+              <w:t>Persyaratan Standar (MΩ)</w:t>
             </w:r>
           </w:p>
         </w:tc>
@@ -12031,36 +11003,8 @@
                 <w:sz w:val="20"/>
                 <w:szCs w:val="20"/>
               </w:rPr>
-              <w:t xml:space="preserve">Kaki </w:t>
-            </w:r>
-            <w:proofErr w:type="spellStart"/>
-            <w:r>
-              <w:rPr>
-                <w:rFonts w:ascii="Arial" w:hAnsi="Arial" w:cs="Arial"/>
-                <w:sz w:val="20"/>
-                <w:szCs w:val="20"/>
-              </w:rPr>
-              <w:t>lampu</w:t>
-            </w:r>
-            <w:proofErr w:type="spellEnd"/>
-            <w:r>
-              <w:rPr>
-                <w:rFonts w:ascii="Arial" w:hAnsi="Arial" w:cs="Arial"/>
-                <w:sz w:val="20"/>
-                <w:szCs w:val="20"/>
-              </w:rPr>
-              <w:t xml:space="preserve"> I + </w:t>
-            </w:r>
-            <w:proofErr w:type="spellStart"/>
-            <w:r>
-              <w:rPr>
-                <w:rFonts w:ascii="Arial" w:hAnsi="Arial" w:cs="Arial"/>
-                <w:sz w:val="20"/>
-                <w:szCs w:val="20"/>
-              </w:rPr>
-              <w:t>Selungkup</w:t>
-            </w:r>
-            <w:proofErr w:type="spellEnd"/>
+              <w:t>Kaki lampu I + Selungkup</w:t>
+            </w:r>
           </w:p>
         </w:tc>
         <w:tc>
@@ -12143,36 +11087,8 @@
                 <w:sz w:val="20"/>
                 <w:szCs w:val="20"/>
               </w:rPr>
-              <w:t xml:space="preserve">Kaki </w:t>
-            </w:r>
-            <w:proofErr w:type="spellStart"/>
-            <w:r>
-              <w:rPr>
-                <w:rFonts w:ascii="Arial" w:hAnsi="Arial" w:cs="Arial"/>
-                <w:sz w:val="20"/>
-                <w:szCs w:val="20"/>
-              </w:rPr>
-              <w:t>lampu</w:t>
-            </w:r>
-            <w:proofErr w:type="spellEnd"/>
-            <w:r>
-              <w:rPr>
-                <w:rFonts w:ascii="Arial" w:hAnsi="Arial" w:cs="Arial"/>
-                <w:sz w:val="20"/>
-                <w:szCs w:val="20"/>
-              </w:rPr>
-              <w:t xml:space="preserve"> II + </w:t>
-            </w:r>
-            <w:proofErr w:type="spellStart"/>
-            <w:r>
-              <w:rPr>
-                <w:rFonts w:ascii="Arial" w:hAnsi="Arial" w:cs="Arial"/>
-                <w:sz w:val="20"/>
-                <w:szCs w:val="20"/>
-              </w:rPr>
-              <w:t>Selungkup</w:t>
-            </w:r>
-            <w:proofErr w:type="spellEnd"/>
+              <w:t>Kaki lampu II + Selungkup</w:t>
+            </w:r>
           </w:p>
         </w:tc>
         <w:tc>
@@ -12253,36 +11169,8 @@
                 <w:sz w:val="20"/>
                 <w:szCs w:val="20"/>
               </w:rPr>
-              <w:t xml:space="preserve">Kaki </w:t>
-            </w:r>
-            <w:proofErr w:type="spellStart"/>
-            <w:r>
-              <w:rPr>
-                <w:rFonts w:ascii="Arial" w:hAnsi="Arial" w:cs="Arial"/>
-                <w:sz w:val="20"/>
-                <w:szCs w:val="20"/>
-              </w:rPr>
-              <w:t>lampu</w:t>
-            </w:r>
-            <w:proofErr w:type="spellEnd"/>
-            <w:r>
-              <w:rPr>
-                <w:rFonts w:ascii="Arial" w:hAnsi="Arial" w:cs="Arial"/>
-                <w:sz w:val="20"/>
-                <w:szCs w:val="20"/>
-              </w:rPr>
-              <w:t xml:space="preserve"> III + </w:t>
-            </w:r>
-            <w:proofErr w:type="spellStart"/>
-            <w:r>
-              <w:rPr>
-                <w:rFonts w:ascii="Arial" w:hAnsi="Arial" w:cs="Arial"/>
-                <w:sz w:val="20"/>
-                <w:szCs w:val="20"/>
-              </w:rPr>
-              <w:t>Selungkup</w:t>
-            </w:r>
-            <w:proofErr w:type="spellEnd"/>
+              <w:t>Kaki lampu III + Selungkup</w:t>
+            </w:r>
           </w:p>
         </w:tc>
         <w:tc>
@@ -12491,18 +11379,8 @@
                 <w:sz w:val="20"/>
                 <w:szCs w:val="20"/>
               </w:rPr>
-              <w:t xml:space="preserve">Bagian yang </w:t>
-            </w:r>
-            <w:proofErr w:type="spellStart"/>
-            <w:r>
-              <w:rPr>
-                <w:rFonts w:ascii="Arial" w:hAnsi="Arial" w:cs="Arial"/>
-                <w:sz w:val="20"/>
-                <w:szCs w:val="20"/>
-              </w:rPr>
-              <w:t>diukur</w:t>
-            </w:r>
-            <w:proofErr w:type="spellEnd"/>
+              <w:t>Bagian yang diukur</w:t>
+            </w:r>
           </w:p>
         </w:tc>
         <w:tc>
@@ -12519,23 +11397,13 @@
                 <w:szCs w:val="20"/>
               </w:rPr>
             </w:pPr>
-            <w:proofErr w:type="spellStart"/>
-            <w:r>
-              <w:rPr>
-                <w:rFonts w:ascii="Arial" w:hAnsi="Arial" w:cs="Arial"/>
-                <w:sz w:val="20"/>
-                <w:szCs w:val="20"/>
-              </w:rPr>
-              <w:t>Tegangan</w:t>
-            </w:r>
-            <w:proofErr w:type="spellEnd"/>
-            <w:r>
-              <w:rPr>
-                <w:rFonts w:ascii="Arial" w:hAnsi="Arial" w:cs="Arial"/>
-                <w:sz w:val="20"/>
-                <w:szCs w:val="20"/>
-              </w:rPr>
-              <w:t xml:space="preserve"> Uji </w:t>
+            <w:r>
+              <w:rPr>
+                <w:rFonts w:ascii="Arial" w:hAnsi="Arial" w:cs="Arial"/>
+                <w:sz w:val="20"/>
+                <w:szCs w:val="20"/>
+              </w:rPr>
+              <w:t xml:space="preserve">Tegangan Uji </w:t>
             </w:r>
           </w:p>
         </w:tc>
@@ -12591,36 +11459,8 @@
                 <w:sz w:val="20"/>
                 <w:szCs w:val="20"/>
               </w:rPr>
-              <w:t xml:space="preserve">Kaki </w:t>
-            </w:r>
-            <w:proofErr w:type="spellStart"/>
-            <w:r>
-              <w:rPr>
-                <w:rFonts w:ascii="Arial" w:hAnsi="Arial" w:cs="Arial"/>
-                <w:sz w:val="20"/>
-                <w:szCs w:val="20"/>
-              </w:rPr>
-              <w:t>lampu</w:t>
-            </w:r>
-            <w:proofErr w:type="spellEnd"/>
-            <w:r>
-              <w:rPr>
-                <w:rFonts w:ascii="Arial" w:hAnsi="Arial" w:cs="Arial"/>
-                <w:sz w:val="20"/>
-                <w:szCs w:val="20"/>
-              </w:rPr>
-              <w:t xml:space="preserve"> I + </w:t>
-            </w:r>
-            <w:proofErr w:type="spellStart"/>
-            <w:r>
-              <w:rPr>
-                <w:rFonts w:ascii="Arial" w:hAnsi="Arial" w:cs="Arial"/>
-                <w:sz w:val="20"/>
-                <w:szCs w:val="20"/>
-              </w:rPr>
-              <w:t>Selungkup</w:t>
-            </w:r>
-            <w:proofErr w:type="spellEnd"/>
+              <w:t>Kaki lampu I + Selungkup</w:t>
+            </w:r>
           </w:p>
         </w:tc>
         <w:tc>
@@ -12643,18 +11483,8 @@
                 <w:sz w:val="20"/>
                 <w:szCs w:val="20"/>
               </w:rPr>
-              <w:t xml:space="preserve">1440 </w:t>
-            </w:r>
-            <w:proofErr w:type="spellStart"/>
-            <w:r>
-              <w:rPr>
-                <w:rFonts w:ascii="Arial" w:hAnsi="Arial" w:cs="Arial"/>
-                <w:sz w:val="20"/>
-                <w:szCs w:val="20"/>
-              </w:rPr>
-              <w:t>Vrms</w:t>
-            </w:r>
-            <w:proofErr w:type="spellEnd"/>
+              <w:t>1440 Vrms</w:t>
+            </w:r>
           </w:p>
         </w:tc>
         <w:tc>
@@ -12708,36 +11538,8 @@
                 <w:sz w:val="20"/>
                 <w:szCs w:val="20"/>
               </w:rPr>
-              <w:t xml:space="preserve">Kaki </w:t>
-            </w:r>
-            <w:proofErr w:type="spellStart"/>
-            <w:r>
-              <w:rPr>
-                <w:rFonts w:ascii="Arial" w:hAnsi="Arial" w:cs="Arial"/>
-                <w:sz w:val="20"/>
-                <w:szCs w:val="20"/>
-              </w:rPr>
-              <w:t>lampu</w:t>
-            </w:r>
-            <w:proofErr w:type="spellEnd"/>
-            <w:r>
-              <w:rPr>
-                <w:rFonts w:ascii="Arial" w:hAnsi="Arial" w:cs="Arial"/>
-                <w:sz w:val="20"/>
-                <w:szCs w:val="20"/>
-              </w:rPr>
-              <w:t xml:space="preserve"> II + </w:t>
-            </w:r>
-            <w:proofErr w:type="spellStart"/>
-            <w:r>
-              <w:rPr>
-                <w:rFonts w:ascii="Arial" w:hAnsi="Arial" w:cs="Arial"/>
-                <w:sz w:val="20"/>
-                <w:szCs w:val="20"/>
-              </w:rPr>
-              <w:t>Selungkup</w:t>
-            </w:r>
-            <w:proofErr w:type="spellEnd"/>
+              <w:t>Kaki lampu II + Selungkup</w:t>
+            </w:r>
           </w:p>
         </w:tc>
         <w:tc>
@@ -12760,18 +11562,8 @@
                 <w:sz w:val="20"/>
                 <w:szCs w:val="20"/>
               </w:rPr>
-              <w:t xml:space="preserve">1440 </w:t>
-            </w:r>
-            <w:proofErr w:type="spellStart"/>
-            <w:r>
-              <w:rPr>
-                <w:rFonts w:ascii="Arial" w:hAnsi="Arial" w:cs="Arial"/>
-                <w:sz w:val="20"/>
-                <w:szCs w:val="20"/>
-              </w:rPr>
-              <w:t>Vrms</w:t>
-            </w:r>
-            <w:proofErr w:type="spellEnd"/>
+              <w:t>1440 Vrms</w:t>
+            </w:r>
           </w:p>
         </w:tc>
         <w:tc>
@@ -12825,36 +11617,8 @@
                 <w:sz w:val="20"/>
                 <w:szCs w:val="20"/>
               </w:rPr>
-              <w:t xml:space="preserve">Kaki </w:t>
-            </w:r>
-            <w:proofErr w:type="spellStart"/>
-            <w:r>
-              <w:rPr>
-                <w:rFonts w:ascii="Arial" w:hAnsi="Arial" w:cs="Arial"/>
-                <w:sz w:val="20"/>
-                <w:szCs w:val="20"/>
-              </w:rPr>
-              <w:t>lampu</w:t>
-            </w:r>
-            <w:proofErr w:type="spellEnd"/>
-            <w:r>
-              <w:rPr>
-                <w:rFonts w:ascii="Arial" w:hAnsi="Arial" w:cs="Arial"/>
-                <w:sz w:val="20"/>
-                <w:szCs w:val="20"/>
-              </w:rPr>
-              <w:t xml:space="preserve"> III + </w:t>
-            </w:r>
-            <w:proofErr w:type="spellStart"/>
-            <w:r>
-              <w:rPr>
-                <w:rFonts w:ascii="Arial" w:hAnsi="Arial" w:cs="Arial"/>
-                <w:sz w:val="20"/>
-                <w:szCs w:val="20"/>
-              </w:rPr>
-              <w:t>Selungkup</w:t>
-            </w:r>
-            <w:proofErr w:type="spellEnd"/>
+              <w:t>Kaki lampu III + Selungkup</w:t>
+            </w:r>
           </w:p>
         </w:tc>
         <w:tc>
@@ -12877,18 +11641,8 @@
                 <w:sz w:val="20"/>
                 <w:szCs w:val="20"/>
               </w:rPr>
-              <w:t xml:space="preserve">1440 </w:t>
-            </w:r>
-            <w:proofErr w:type="spellStart"/>
-            <w:r>
-              <w:rPr>
-                <w:rFonts w:ascii="Arial" w:hAnsi="Arial" w:cs="Arial"/>
-                <w:sz w:val="20"/>
-                <w:szCs w:val="20"/>
-              </w:rPr>
-              <w:t>Vrms</w:t>
-            </w:r>
-            <w:proofErr w:type="spellEnd"/>
+              <w:t>1440 Vrms</w:t>
+            </w:r>
           </w:p>
         </w:tc>
         <w:tc>
@@ -13763,7 +12517,6 @@
                 <w:lang w:val="en-US"/>
               </w:rPr>
             </w:pPr>
-            <w:proofErr w:type="spellStart"/>
             <w:r>
               <w:rPr>
                 <w:rFonts w:ascii="Arial" w:hAnsi="Arial" w:cs="Arial"/>
@@ -13773,7 +12526,6 @@
               </w:rPr>
               <w:t>Selungkup</w:t>
             </w:r>
-            <w:proofErr w:type="spellEnd"/>
           </w:p>
         </w:tc>
         <w:tc>
@@ -14169,67 +12921,7 @@
                 <w:szCs w:val="20"/>
                 <w:lang w:val="es-ES"/>
               </w:rPr>
-              <w:t xml:space="preserve">Padam </w:t>
-            </w:r>
-            <w:proofErr w:type="spellStart"/>
-            <w:r>
-              <w:rPr>
-                <w:rFonts w:ascii="Arial" w:hAnsi="Arial" w:cs="Arial"/>
-                <w:sz w:val="20"/>
-                <w:szCs w:val="20"/>
-                <w:lang w:val="es-ES"/>
-              </w:rPr>
-              <w:t>dengan</w:t>
-            </w:r>
-            <w:proofErr w:type="spellEnd"/>
-            <w:r>
-              <w:rPr>
-                <w:rFonts w:ascii="Arial" w:hAnsi="Arial" w:cs="Arial"/>
-                <w:sz w:val="20"/>
-                <w:szCs w:val="20"/>
-                <w:lang w:val="es-ES"/>
-              </w:rPr>
-              <w:t xml:space="preserve"> </w:t>
-            </w:r>
-            <w:proofErr w:type="spellStart"/>
-            <w:r>
-              <w:rPr>
-                <w:rFonts w:ascii="Arial" w:hAnsi="Arial" w:cs="Arial"/>
-                <w:sz w:val="20"/>
-                <w:szCs w:val="20"/>
-                <w:lang w:val="es-ES"/>
-              </w:rPr>
-              <w:t>sendirinya</w:t>
-            </w:r>
-            <w:proofErr w:type="spellEnd"/>
-            <w:r>
-              <w:rPr>
-                <w:rFonts w:ascii="Arial" w:hAnsi="Arial" w:cs="Arial"/>
-                <w:sz w:val="20"/>
-                <w:szCs w:val="20"/>
-                <w:lang w:val="es-ES"/>
-              </w:rPr>
-              <w:t xml:space="preserve"> </w:t>
-            </w:r>
-            <w:proofErr w:type="spellStart"/>
-            <w:r>
-              <w:rPr>
-                <w:rFonts w:ascii="Arial" w:hAnsi="Arial" w:cs="Arial"/>
-                <w:sz w:val="20"/>
-                <w:szCs w:val="20"/>
-                <w:lang w:val="es-ES"/>
-              </w:rPr>
-              <w:t>setelah</w:t>
-            </w:r>
-            <w:proofErr w:type="spellEnd"/>
-            <w:r>
-              <w:rPr>
-                <w:rFonts w:ascii="Arial" w:hAnsi="Arial" w:cs="Arial"/>
-                <w:sz w:val="20"/>
-                <w:szCs w:val="20"/>
-                <w:lang w:val="es-ES"/>
-              </w:rPr>
-              <w:t xml:space="preserve"> 30 s</w:t>
+              <w:t>Padam dengan sendirinya setelah 30 s</w:t>
             </w:r>
           </w:p>
           <w:p>
@@ -14291,7 +12983,6 @@
                 <w:lang w:val="en-US"/>
               </w:rPr>
             </w:pPr>
-            <w:proofErr w:type="spellStart"/>
             <w:r>
               <w:rPr>
                 <w:rFonts w:ascii="Arial" w:hAnsi="Arial" w:cs="Arial"/>
@@ -14301,7 +12992,6 @@
               </w:rPr>
               <w:t>Selungkup</w:t>
             </w:r>
-            <w:proofErr w:type="spellEnd"/>
           </w:p>
         </w:tc>
         <w:tc>
@@ -14480,7 +13170,6 @@
                 <w:szCs w:val="20"/>
               </w:rPr>
             </w:pPr>
-            <w:proofErr w:type="spellStart"/>
             <w:r>
               <w:rPr>
                 <w:rFonts w:ascii="Arial" w:hAnsi="Arial" w:cs="Arial"/>
@@ -14488,29 +13177,8 @@
                 <w:sz w:val="20"/>
                 <w:szCs w:val="20"/>
               </w:rPr>
-              <w:t>Kondisi</w:t>
-            </w:r>
-            <w:proofErr w:type="spellEnd"/>
-            <w:r>
-              <w:rPr>
-                <w:rFonts w:ascii="Arial" w:hAnsi="Arial" w:cs="Arial"/>
-                <w:b/>
-                <w:sz w:val="20"/>
-                <w:szCs w:val="20"/>
-              </w:rPr>
-              <w:t xml:space="preserve"> </w:t>
-            </w:r>
-            <w:proofErr w:type="spellStart"/>
-            <w:r>
-              <w:rPr>
-                <w:rFonts w:ascii="Arial" w:hAnsi="Arial" w:cs="Arial"/>
-                <w:b/>
-                <w:sz w:val="20"/>
-                <w:szCs w:val="20"/>
-              </w:rPr>
-              <w:t>Kegagalan</w:t>
-            </w:r>
-            <w:proofErr w:type="spellEnd"/>
+              <w:t>Kondisi Kegagalan</w:t>
+            </w:r>
           </w:p>
         </w:tc>
         <w:tc>
@@ -14561,7 +13229,6 @@
                 <w:szCs w:val="20"/>
               </w:rPr>
             </w:pPr>
-            <w:proofErr w:type="spellStart"/>
             <w:r>
               <w:rPr>
                 <w:rFonts w:ascii="Arial" w:hAnsi="Arial" w:cs="Arial"/>
@@ -14569,49 +13236,8 @@
                 <w:sz w:val="20"/>
                 <w:szCs w:val="20"/>
               </w:rPr>
-              <w:t>Kondisi</w:t>
-            </w:r>
-            <w:proofErr w:type="spellEnd"/>
-            <w:r>
-              <w:rPr>
-                <w:rFonts w:ascii="Arial" w:hAnsi="Arial" w:cs="Arial"/>
-                <w:b/>
-                <w:sz w:val="20"/>
-                <w:szCs w:val="20"/>
-              </w:rPr>
-              <w:t xml:space="preserve"> </w:t>
-            </w:r>
-            <w:proofErr w:type="spellStart"/>
-            <w:r>
-              <w:rPr>
-                <w:rFonts w:ascii="Arial" w:hAnsi="Arial" w:cs="Arial"/>
-                <w:b/>
-                <w:sz w:val="20"/>
-                <w:szCs w:val="20"/>
-              </w:rPr>
-              <w:t>Kegagalan</w:t>
-            </w:r>
-            <w:proofErr w:type="spellEnd"/>
-            <w:r>
-              <w:rPr>
-                <w:rFonts w:ascii="Arial" w:hAnsi="Arial" w:cs="Arial"/>
-                <w:b/>
-                <w:sz w:val="20"/>
-                <w:szCs w:val="20"/>
-              </w:rPr>
-              <w:t xml:space="preserve"> yang </w:t>
-            </w:r>
-            <w:proofErr w:type="spellStart"/>
-            <w:r>
-              <w:rPr>
-                <w:rFonts w:ascii="Arial" w:hAnsi="Arial" w:cs="Arial"/>
-                <w:b/>
-                <w:sz w:val="20"/>
-                <w:szCs w:val="20"/>
-              </w:rPr>
-              <w:t>diterapkan</w:t>
-            </w:r>
-            <w:proofErr w:type="spellEnd"/>
+              <w:t>Kondisi Kegagalan yang diterapkan</w:t>
+            </w:r>
           </w:p>
         </w:tc>
         <w:tc>
@@ -14630,7 +13256,6 @@
                 <w:lang w:val="es-ES"/>
               </w:rPr>
             </w:pPr>
-            <w:proofErr w:type="spellStart"/>
             <w:r>
               <w:rPr>
                 <w:rFonts w:ascii="Arial" w:hAnsi="Arial" w:cs="Arial"/>
@@ -14639,62 +13264,7 @@
                 <w:szCs w:val="20"/>
                 <w:lang w:val="es-ES"/>
               </w:rPr>
-              <w:t>Lampu</w:t>
-            </w:r>
-            <w:proofErr w:type="spellEnd"/>
-            <w:r>
-              <w:rPr>
-                <w:rFonts w:ascii="Arial" w:hAnsi="Arial" w:cs="Arial"/>
-                <w:b/>
-                <w:sz w:val="20"/>
-                <w:szCs w:val="20"/>
-                <w:lang w:val="es-ES"/>
-              </w:rPr>
-              <w:t xml:space="preserve"> </w:t>
-            </w:r>
-            <w:proofErr w:type="spellStart"/>
-            <w:r>
-              <w:rPr>
-                <w:rFonts w:ascii="Arial" w:hAnsi="Arial" w:cs="Arial"/>
-                <w:b/>
-                <w:sz w:val="20"/>
-                <w:szCs w:val="20"/>
-                <w:lang w:val="es-ES"/>
-              </w:rPr>
-              <w:t>memenuhi</w:t>
-            </w:r>
-            <w:proofErr w:type="spellEnd"/>
-            <w:r>
-              <w:rPr>
-                <w:rFonts w:ascii="Arial" w:hAnsi="Arial" w:cs="Arial"/>
-                <w:b/>
-                <w:sz w:val="20"/>
-                <w:szCs w:val="20"/>
-                <w:lang w:val="es-ES"/>
-              </w:rPr>
-              <w:t xml:space="preserve"> </w:t>
-            </w:r>
-            <w:proofErr w:type="spellStart"/>
-            <w:r>
-              <w:rPr>
-                <w:rFonts w:ascii="Arial" w:hAnsi="Arial" w:cs="Arial"/>
-                <w:b/>
-                <w:sz w:val="20"/>
-                <w:szCs w:val="20"/>
-                <w:lang w:val="es-ES"/>
-              </w:rPr>
-              <w:t>Kesesuaian</w:t>
-            </w:r>
-            <w:proofErr w:type="spellEnd"/>
-            <w:r>
-              <w:rPr>
-                <w:rFonts w:ascii="Arial" w:hAnsi="Arial" w:cs="Arial"/>
-                <w:b/>
-                <w:sz w:val="20"/>
-                <w:szCs w:val="20"/>
-                <w:lang w:val="es-ES"/>
-              </w:rPr>
-              <w:t xml:space="preserve"> (Ya/Tidak)</w:t>
+              <w:t>Lampu memenuhi Kesesuaian (Ya/Tidak)</w:t>
             </w:r>
           </w:p>
         </w:tc>
@@ -14714,7 +13284,6 @@
                 <w:szCs w:val="20"/>
               </w:rPr>
             </w:pPr>
-            <w:proofErr w:type="spellStart"/>
             <w:r>
               <w:rPr>
                 <w:rFonts w:ascii="Arial" w:hAnsi="Arial" w:cs="Arial"/>
@@ -14724,7 +13293,6 @@
               </w:rPr>
               <w:t>Keterangan</w:t>
             </w:r>
-            <w:proofErr w:type="spellEnd"/>
           </w:p>
         </w:tc>
       </w:tr>
@@ -15242,87 +13810,7 @@
                 <w:szCs w:val="18"/>
                 <w:lang w:val="es-ES"/>
               </w:rPr>
-              <w:t xml:space="preserve">TABEL: Jarak </w:t>
-            </w:r>
-            <w:proofErr w:type="spellStart"/>
-            <w:r>
-              <w:rPr>
-                <w:rFonts w:ascii="Arial" w:hAnsi="Arial" w:cs="Arial"/>
-                <w:sz w:val="18"/>
-                <w:szCs w:val="18"/>
-                <w:lang w:val="es-ES"/>
-              </w:rPr>
-              <w:t>minimum</w:t>
-            </w:r>
-            <w:proofErr w:type="spellEnd"/>
-            <w:r>
-              <w:rPr>
-                <w:rFonts w:ascii="Arial" w:hAnsi="Arial" w:cs="Arial"/>
-                <w:sz w:val="18"/>
-                <w:szCs w:val="18"/>
-                <w:lang w:val="es-ES"/>
-              </w:rPr>
-              <w:t xml:space="preserve"> </w:t>
-            </w:r>
-            <w:proofErr w:type="spellStart"/>
-            <w:r>
-              <w:rPr>
-                <w:rFonts w:ascii="Arial" w:hAnsi="Arial" w:cs="Arial"/>
-                <w:sz w:val="18"/>
-                <w:szCs w:val="18"/>
-                <w:lang w:val="es-ES"/>
-              </w:rPr>
-              <w:t>untuk</w:t>
-            </w:r>
-            <w:proofErr w:type="spellEnd"/>
-            <w:r>
-              <w:rPr>
-                <w:rFonts w:ascii="Arial" w:hAnsi="Arial" w:cs="Arial"/>
-                <w:sz w:val="18"/>
-                <w:szCs w:val="18"/>
-                <w:lang w:val="es-ES"/>
-              </w:rPr>
-              <w:t xml:space="preserve"> </w:t>
-            </w:r>
-            <w:proofErr w:type="spellStart"/>
-            <w:r>
-              <w:rPr>
-                <w:rFonts w:ascii="Arial" w:hAnsi="Arial" w:cs="Arial"/>
-                <w:sz w:val="18"/>
-                <w:szCs w:val="18"/>
-                <w:lang w:val="es-ES"/>
-              </w:rPr>
-              <w:t>tegangan</w:t>
-            </w:r>
-            <w:proofErr w:type="spellEnd"/>
-            <w:r>
-              <w:rPr>
-                <w:rFonts w:ascii="Arial" w:hAnsi="Arial" w:cs="Arial"/>
-                <w:sz w:val="18"/>
-                <w:szCs w:val="18"/>
-                <w:lang w:val="es-ES"/>
-              </w:rPr>
-              <w:t xml:space="preserve"> sinusoidal </w:t>
-            </w:r>
-            <w:proofErr w:type="spellStart"/>
-            <w:r>
-              <w:rPr>
-                <w:rFonts w:ascii="Arial" w:hAnsi="Arial" w:cs="Arial"/>
-                <w:sz w:val="18"/>
-                <w:szCs w:val="18"/>
-                <w:lang w:val="es-ES"/>
-              </w:rPr>
-              <w:t>a.b</w:t>
-            </w:r>
-            <w:proofErr w:type="spellEnd"/>
-            <w:r>
-              <w:rPr>
-                <w:rFonts w:ascii="Arial" w:hAnsi="Arial" w:cs="Arial"/>
-                <w:sz w:val="18"/>
-                <w:szCs w:val="18"/>
-                <w:lang w:val="es-ES"/>
-              </w:rPr>
-              <w:t>. (50Hz)</w:t>
+              <w:t>TABEL: Jarak minimum untuk tegangan sinusoidal a.b. (50Hz)</w:t>
             </w:r>
           </w:p>
         </w:tc>
@@ -15393,7 +13881,6 @@
                 <w:szCs w:val="18"/>
               </w:rPr>
             </w:pPr>
-            <w:proofErr w:type="spellStart"/>
             <w:r>
               <w:rPr>
                 <w:rFonts w:ascii="Arial" w:hAnsi="Arial" w:cs="Arial"/>
@@ -15401,37 +13888,7 @@
                 <w:szCs w:val="18"/>
                 <w:lang w:val="es-ES"/>
               </w:rPr>
-              <w:t>Tegangan</w:t>
-            </w:r>
-            <w:proofErr w:type="spellEnd"/>
-            <w:r>
-              <w:rPr>
-                <w:rFonts w:ascii="Arial" w:hAnsi="Arial" w:cs="Arial"/>
-                <w:sz w:val="18"/>
-                <w:szCs w:val="18"/>
-                <w:lang w:val="es-ES"/>
-              </w:rPr>
-              <w:t xml:space="preserve"> </w:t>
-            </w:r>
-            <w:proofErr w:type="spellStart"/>
-            <w:r>
-              <w:rPr>
-                <w:rFonts w:ascii="Arial" w:hAnsi="Arial" w:cs="Arial"/>
-                <w:sz w:val="18"/>
-                <w:szCs w:val="18"/>
-                <w:lang w:val="es-ES"/>
-              </w:rPr>
-              <w:t>kerja</w:t>
-            </w:r>
-            <w:proofErr w:type="spellEnd"/>
-            <w:r>
-              <w:rPr>
-                <w:rFonts w:ascii="Arial" w:hAnsi="Arial" w:cs="Arial"/>
-                <w:sz w:val="18"/>
-                <w:szCs w:val="18"/>
-                <w:lang w:val="es-ES"/>
-              </w:rPr>
-              <w:t xml:space="preserve"> (V)</w:t>
+              <w:t>Tegangan kerja (V)</w:t>
             </w:r>
           </w:p>
         </w:tc>
@@ -15561,18 +14018,8 @@
                 <w:sz w:val="18"/>
                 <w:szCs w:val="18"/>
               </w:rPr>
-              <w:t xml:space="preserve">Jarak </w:t>
-            </w:r>
-            <w:proofErr w:type="spellStart"/>
-            <w:r>
-              <w:rPr>
-                <w:rFonts w:ascii="Arial" w:hAnsi="Arial" w:cs="Arial"/>
-                <w:sz w:val="18"/>
-                <w:szCs w:val="18"/>
-              </w:rPr>
-              <w:t>rambat</w:t>
-            </w:r>
-            <w:proofErr w:type="spellEnd"/>
+              <w:t>Jarak rambat</w:t>
+            </w:r>
           </w:p>
         </w:tc>
         <w:tc>
@@ -15602,18 +14049,8 @@
                 <w:sz w:val="18"/>
                 <w:szCs w:val="18"/>
               </w:rPr>
-              <w:t xml:space="preserve">Jarak </w:t>
-            </w:r>
-            <w:proofErr w:type="spellStart"/>
-            <w:r>
-              <w:rPr>
-                <w:rFonts w:ascii="Arial" w:hAnsi="Arial" w:cs="Arial"/>
-                <w:sz w:val="18"/>
-                <w:szCs w:val="18"/>
-              </w:rPr>
-              <w:t>bebas</w:t>
-            </w:r>
-            <w:proofErr w:type="spellEnd"/>
+              <w:t>Jarak bebas</w:t>
+            </w:r>
           </w:p>
         </w:tc>
         <w:tc>
@@ -15643,18 +14080,8 @@
                 <w:sz w:val="18"/>
                 <w:szCs w:val="18"/>
               </w:rPr>
-              <w:t xml:space="preserve">Jarak </w:t>
-            </w:r>
-            <w:proofErr w:type="spellStart"/>
-            <w:r>
-              <w:rPr>
-                <w:rFonts w:ascii="Arial" w:hAnsi="Arial" w:cs="Arial"/>
-                <w:sz w:val="18"/>
-                <w:szCs w:val="18"/>
-              </w:rPr>
-              <w:t>bebas</w:t>
-            </w:r>
-            <w:proofErr w:type="spellEnd"/>
+              <w:t>Jarak bebas</w:t>
+            </w:r>
           </w:p>
         </w:tc>
         <w:tc>
@@ -15734,23 +14161,13 @@
                 <w:szCs w:val="18"/>
               </w:rPr>
             </w:pPr>
-            <w:proofErr w:type="spellStart"/>
             <w:r>
               <w:rPr>
                 <w:rFonts w:ascii="Arial" w:hAnsi="Arial" w:cs="Arial"/>
                 <w:sz w:val="18"/>
                 <w:szCs w:val="18"/>
               </w:rPr>
-              <w:t>Insulasi</w:t>
-            </w:r>
-            <w:proofErr w:type="spellEnd"/>
-            <w:r>
-              <w:rPr>
-                <w:rFonts w:ascii="Arial" w:hAnsi="Arial" w:cs="Arial"/>
-                <w:sz w:val="18"/>
-                <w:szCs w:val="18"/>
-              </w:rPr>
-              <w:t xml:space="preserve"> PTI ≥600</w:t>
+              <w:t>Insulasi PTI ≥600</w:t>
             </w:r>
           </w:p>
         </w:tc>
@@ -15776,23 +14193,13 @@
                 <w:szCs w:val="18"/>
               </w:rPr>
             </w:pPr>
-            <w:proofErr w:type="spellStart"/>
             <w:r>
               <w:rPr>
                 <w:rFonts w:ascii="Arial" w:hAnsi="Arial" w:cs="Arial"/>
                 <w:sz w:val="18"/>
                 <w:szCs w:val="18"/>
               </w:rPr>
-              <w:t>Insulasi</w:t>
-            </w:r>
-            <w:proofErr w:type="spellEnd"/>
-            <w:r>
-              <w:rPr>
-                <w:rFonts w:ascii="Arial" w:hAnsi="Arial" w:cs="Arial"/>
-                <w:sz w:val="18"/>
-                <w:szCs w:val="18"/>
-              </w:rPr>
-              <w:t xml:space="preserve"> PTI &lt;600</w:t>
+              <w:t>Insulasi PTI &lt;600</w:t>
             </w:r>
           </w:p>
         </w:tc>
@@ -15945,7 +14352,6 @@
               </w:rPr>
               <w:t xml:space="preserve">0,6 </w:t>
             </w:r>
-            <w:proofErr w:type="spellStart"/>
             <w:r>
               <w:rPr>
                 <w:rFonts w:ascii="Arial" w:hAnsi="Arial" w:cs="Arial"/>
@@ -15955,7 +14361,6 @@
               </w:rPr>
               <w:t>a,b</w:t>
             </w:r>
-            <w:proofErr w:type="spellEnd"/>
           </w:p>
         </w:tc>
         <w:tc>
@@ -15990,7 +14395,6 @@
               </w:rPr>
               <w:t xml:space="preserve">1,2 </w:t>
             </w:r>
-            <w:proofErr w:type="spellStart"/>
             <w:r>
               <w:rPr>
                 <w:rFonts w:ascii="Arial" w:hAnsi="Arial" w:cs="Arial"/>
@@ -16000,7 +14404,6 @@
               </w:rPr>
               <w:t>a,b</w:t>
             </w:r>
-            <w:proofErr w:type="spellEnd"/>
           </w:p>
         </w:tc>
         <w:tc>
@@ -16035,7 +14438,6 @@
               </w:rPr>
               <w:t xml:space="preserve">0,2 </w:t>
             </w:r>
-            <w:proofErr w:type="spellStart"/>
             <w:r>
               <w:rPr>
                 <w:rFonts w:ascii="Arial" w:hAnsi="Arial" w:cs="Arial"/>
@@ -16045,7 +14447,6 @@
               </w:rPr>
               <w:t>a,b</w:t>
             </w:r>
-            <w:proofErr w:type="spellEnd"/>
           </w:p>
         </w:tc>
         <w:tc>
@@ -16200,7 +14601,6 @@
               </w:rPr>
               <w:t xml:space="preserve">1,4 </w:t>
             </w:r>
-            <w:proofErr w:type="spellStart"/>
             <w:r>
               <w:rPr>
                 <w:rFonts w:ascii="Arial" w:hAnsi="Arial" w:cs="Arial"/>
@@ -16210,7 +14610,6 @@
               </w:rPr>
               <w:t>a,b</w:t>
             </w:r>
-            <w:proofErr w:type="spellEnd"/>
           </w:p>
         </w:tc>
         <w:tc>
@@ -16245,7 +14644,6 @@
               </w:rPr>
               <w:t xml:space="preserve">1,6 </w:t>
             </w:r>
-            <w:proofErr w:type="spellStart"/>
             <w:r>
               <w:rPr>
                 <w:rFonts w:ascii="Arial" w:hAnsi="Arial" w:cs="Arial"/>
@@ -16255,7 +14653,6 @@
               </w:rPr>
               <w:t>a,b</w:t>
             </w:r>
-            <w:proofErr w:type="spellEnd"/>
           </w:p>
         </w:tc>
         <w:tc>
@@ -16290,7 +14687,6 @@
               </w:rPr>
               <w:t xml:space="preserve">1,4 </w:t>
             </w:r>
-            <w:proofErr w:type="spellStart"/>
             <w:r>
               <w:rPr>
                 <w:rFonts w:ascii="Arial" w:hAnsi="Arial" w:cs="Arial"/>
@@ -16300,7 +14696,6 @@
               </w:rPr>
               <w:t>a,b</w:t>
             </w:r>
-            <w:proofErr w:type="spellEnd"/>
           </w:p>
         </w:tc>
         <w:tc>
@@ -16455,7 +14850,6 @@
               </w:rPr>
               <w:t xml:space="preserve">1,7 </w:t>
             </w:r>
-            <w:proofErr w:type="spellStart"/>
             <w:r>
               <w:rPr>
                 <w:rFonts w:ascii="Arial" w:hAnsi="Arial" w:cs="Arial"/>
@@ -16465,7 +14859,6 @@
               </w:rPr>
               <w:t>a,b</w:t>
             </w:r>
-            <w:proofErr w:type="spellEnd"/>
           </w:p>
         </w:tc>
         <w:tc>
@@ -16500,7 +14893,6 @@
               </w:rPr>
               <w:t xml:space="preserve">2,5 </w:t>
             </w:r>
-            <w:proofErr w:type="spellStart"/>
             <w:r>
               <w:rPr>
                 <w:rFonts w:ascii="Arial" w:hAnsi="Arial" w:cs="Arial"/>
@@ -16510,7 +14902,6 @@
               </w:rPr>
               <w:t>a,b</w:t>
             </w:r>
-            <w:proofErr w:type="spellEnd"/>
           </w:p>
         </w:tc>
         <w:tc>
@@ -16545,7 +14936,6 @@
               </w:rPr>
               <w:t xml:space="preserve">1,7 </w:t>
             </w:r>
-            <w:proofErr w:type="spellStart"/>
             <w:r>
               <w:rPr>
                 <w:rFonts w:ascii="Arial" w:hAnsi="Arial" w:cs="Arial"/>
@@ -16555,7 +14945,6 @@
               </w:rPr>
               <w:t>a,b</w:t>
             </w:r>
-            <w:proofErr w:type="spellEnd"/>
           </w:p>
         </w:tc>
         <w:tc>
@@ -16710,7 +15099,6 @@
               </w:rPr>
               <w:t xml:space="preserve">3 </w:t>
             </w:r>
-            <w:proofErr w:type="spellStart"/>
             <w:r>
               <w:rPr>
                 <w:rFonts w:ascii="Arial" w:hAnsi="Arial" w:cs="Arial"/>
@@ -16720,7 +15108,6 @@
               </w:rPr>
               <w:t>a,b</w:t>
             </w:r>
-            <w:proofErr w:type="spellEnd"/>
           </w:p>
         </w:tc>
         <w:tc>
@@ -16755,7 +15142,6 @@
               </w:rPr>
               <w:t xml:space="preserve">5 </w:t>
             </w:r>
-            <w:proofErr w:type="spellStart"/>
             <w:r>
               <w:rPr>
                 <w:rFonts w:ascii="Arial" w:hAnsi="Arial" w:cs="Arial"/>
@@ -16765,7 +15151,6 @@
               </w:rPr>
               <w:t>a,b</w:t>
             </w:r>
-            <w:proofErr w:type="spellEnd"/>
           </w:p>
         </w:tc>
         <w:tc>
@@ -16800,7 +15185,6 @@
               </w:rPr>
               <w:t xml:space="preserve">3 </w:t>
             </w:r>
-            <w:proofErr w:type="spellStart"/>
             <w:r>
               <w:rPr>
                 <w:rFonts w:ascii="Arial" w:hAnsi="Arial" w:cs="Arial"/>
@@ -16810,7 +15194,6 @@
               </w:rPr>
               <w:t>a,b</w:t>
             </w:r>
-            <w:proofErr w:type="spellEnd"/>
           </w:p>
         </w:tc>
         <w:tc>
@@ -16964,7 +15347,6 @@
               </w:rPr>
               <w:t xml:space="preserve">4 </w:t>
             </w:r>
-            <w:proofErr w:type="spellStart"/>
             <w:r>
               <w:rPr>
                 <w:rFonts w:ascii="Arial" w:hAnsi="Arial" w:cs="Arial"/>
@@ -16974,7 +15356,6 @@
               </w:rPr>
               <w:t>a,b</w:t>
             </w:r>
-            <w:proofErr w:type="spellEnd"/>
           </w:p>
         </w:tc>
         <w:tc>
@@ -17009,7 +15390,6 @@
               </w:rPr>
               <w:t xml:space="preserve">8 </w:t>
             </w:r>
-            <w:proofErr w:type="spellStart"/>
             <w:r>
               <w:rPr>
                 <w:rFonts w:ascii="Arial" w:hAnsi="Arial" w:cs="Arial"/>
@@ -17019,7 +15399,6 @@
               </w:rPr>
               <w:t>a,b</w:t>
             </w:r>
-            <w:proofErr w:type="spellEnd"/>
           </w:p>
         </w:tc>
         <w:tc>
@@ -17054,7 +15433,6 @@
               </w:rPr>
               <w:t xml:space="preserve">5 </w:t>
             </w:r>
-            <w:proofErr w:type="spellStart"/>
             <w:r>
               <w:rPr>
                 <w:rFonts w:ascii="Arial" w:hAnsi="Arial" w:cs="Arial"/>
@@ -17064,7 +15442,6 @@
               </w:rPr>
               <w:t>a,b</w:t>
             </w:r>
-            <w:proofErr w:type="spellEnd"/>
           </w:p>
         </w:tc>
         <w:tc>
@@ -17218,7 +15595,6 @@
               </w:rPr>
               <w:t xml:space="preserve">5,5 </w:t>
             </w:r>
-            <w:proofErr w:type="spellStart"/>
             <w:r>
               <w:rPr>
                 <w:rFonts w:ascii="Arial" w:hAnsi="Arial" w:cs="Arial"/>
@@ -17228,7 +15604,6 @@
               </w:rPr>
               <w:t>a,b</w:t>
             </w:r>
-            <w:proofErr w:type="spellEnd"/>
           </w:p>
         </w:tc>
         <w:tc>
@@ -17263,7 +15638,6 @@
               </w:rPr>
               <w:t xml:space="preserve">10 </w:t>
             </w:r>
-            <w:proofErr w:type="spellStart"/>
             <w:r>
               <w:rPr>
                 <w:rFonts w:ascii="Arial" w:hAnsi="Arial" w:cs="Arial"/>
@@ -17273,7 +15647,6 @@
               </w:rPr>
               <w:t>a,b</w:t>
             </w:r>
-            <w:proofErr w:type="spellEnd"/>
           </w:p>
         </w:tc>
         <w:tc>
@@ -17308,7 +15681,6 @@
               </w:rPr>
               <w:t xml:space="preserve">5,5 </w:t>
             </w:r>
-            <w:proofErr w:type="spellStart"/>
             <w:r>
               <w:rPr>
                 <w:rFonts w:ascii="Arial" w:hAnsi="Arial" w:cs="Arial"/>
@@ -17318,7 +15690,6 @@
               </w:rPr>
               <w:t>a,b</w:t>
             </w:r>
-            <w:proofErr w:type="spellEnd"/>
           </w:p>
         </w:tc>
         <w:tc>
@@ -19585,25 +17956,7 @@
               <w:sz w:val="20"/>
               <w:szCs w:val="28"/>
             </w:rPr>
-            <w:t xml:space="preserve">No </w:t>
-          </w:r>
-          <w:proofErr w:type="spellStart"/>
-          <w:r>
-            <w:rPr>
-              <w:rFonts w:ascii="Arial" w:hAnsi="Arial" w:cs="Arial"/>
-              <w:sz w:val="20"/>
-              <w:szCs w:val="28"/>
-            </w:rPr>
-            <w:t>Sertifikat</w:t>
-          </w:r>
-          <w:proofErr w:type="spellEnd"/>
-          <w:r>
-            <w:rPr>
-              <w:rFonts w:ascii="Arial" w:hAnsi="Arial" w:cs="Arial"/>
-              <w:sz w:val="20"/>
-              <w:szCs w:val="28"/>
-            </w:rPr>
-            <w:t>.</w:t>
+            <w:t>No Sertifikat.</w:t>
           </w:r>
         </w:p>
         <w:p>
@@ -19615,23 +17968,13 @@
               <w:sz w:val="16"/>
             </w:rPr>
           </w:pPr>
-          <w:proofErr w:type="spellStart"/>
           <w:r>
             <w:rPr>
               <w:rFonts w:ascii="Arial" w:hAnsi="Arial" w:cs="Arial"/>
               <w:sz w:val="18"/>
               <w:szCs w:val="24"/>
             </w:rPr>
-            <w:t>Tanggal</w:t>
-          </w:r>
-          <w:proofErr w:type="spellEnd"/>
-          <w:r>
-            <w:rPr>
-              <w:rFonts w:ascii="Arial" w:hAnsi="Arial" w:cs="Arial"/>
-              <w:sz w:val="18"/>
-              <w:szCs w:val="24"/>
-            </w:rPr>
-            <w:t xml:space="preserve">: </w:t>
+            <w:t xml:space="preserve">Tanggal: </w:t>
           </w:r>
           <w:r>
             <w:rPr>
@@ -19668,7 +18011,7 @@
               <w:szCs w:val="24"/>
               <w:lang w:val="id-ID"/>
             </w:rPr>
-            <w:t>04 Maret 2026</w:t>
+            <w:t>19 Oktober 2026</w:t>
           </w:r>
           <w:r>
             <w:rPr>
@@ -19734,20 +18077,8 @@
               <w:szCs w:val="28"/>
               <w:lang w:val="en-US"/>
             </w:rPr>
-            <w:t xml:space="preserve">Kantor </w:t>
+            <w:t>Kantor Penerbit</w:t>
           </w:r>
-          <w:proofErr w:type="spellStart"/>
-          <w:r>
-            <w:rPr>
-              <w:rFonts w:ascii="Arial" w:hAnsi="Arial" w:cs="Arial"/>
-              <w:bCs/>
-              <w:sz w:val="16"/>
-              <w:szCs w:val="28"/>
-              <w:lang w:val="en-US"/>
-            </w:rPr>
-            <w:t>Penerbit</w:t>
-          </w:r>
-          <w:proofErr w:type="spellEnd"/>
         </w:p>
       </w:tc>
     </w:tr>
@@ -19826,67 +18157,7 @@
               <w:szCs w:val="16"/>
               <w:lang w:val="en-US"/>
             </w:rPr>
-            <w:t xml:space="preserve">Jl. </w:t>
-          </w:r>
-          <w:proofErr w:type="spellStart"/>
-          <w:r>
-            <w:rPr>
-              <w:rFonts w:ascii="Arial" w:eastAsia="Times New Roman" w:hAnsi="Arial" w:cs="Arial"/>
-              <w:sz w:val="16"/>
-              <w:szCs w:val="16"/>
-              <w:lang w:val="en-US"/>
-            </w:rPr>
-            <w:t>Arteri</w:t>
-          </w:r>
-          <w:proofErr w:type="spellEnd"/>
-          <w:r>
-            <w:rPr>
-              <w:rFonts w:ascii="Arial" w:eastAsia="Times New Roman" w:hAnsi="Arial" w:cs="Arial"/>
-              <w:sz w:val="16"/>
-              <w:szCs w:val="16"/>
-              <w:lang w:val="en-US"/>
-            </w:rPr>
-            <w:t xml:space="preserve"> Tol </w:t>
-          </w:r>
-          <w:proofErr w:type="spellStart"/>
-          <w:r>
-            <w:rPr>
-              <w:rFonts w:ascii="Arial" w:eastAsia="Times New Roman" w:hAnsi="Arial" w:cs="Arial"/>
-              <w:sz w:val="16"/>
-              <w:szCs w:val="16"/>
-              <w:lang w:val="en-US"/>
-            </w:rPr>
-            <w:t>Cibitung</w:t>
-          </w:r>
-          <w:proofErr w:type="spellEnd"/>
-          <w:r>
-            <w:rPr>
-              <w:rFonts w:ascii="Arial" w:eastAsia="Times New Roman" w:hAnsi="Arial" w:cs="Arial"/>
-              <w:sz w:val="16"/>
-              <w:szCs w:val="16"/>
-              <w:lang w:val="en-US"/>
-            </w:rPr>
-            <w:t xml:space="preserve"> No.1, </w:t>
-          </w:r>
-          <w:proofErr w:type="spellStart"/>
-          <w:r>
-            <w:rPr>
-              <w:rFonts w:ascii="Arial" w:eastAsia="Times New Roman" w:hAnsi="Arial" w:cs="Arial"/>
-              <w:sz w:val="16"/>
-              <w:szCs w:val="16"/>
-              <w:lang w:val="en-US"/>
-            </w:rPr>
-            <w:t>Cibitung</w:t>
-          </w:r>
-          <w:proofErr w:type="spellEnd"/>
-          <w:r>
-            <w:rPr>
-              <w:rFonts w:ascii="Arial" w:eastAsia="Times New Roman" w:hAnsi="Arial" w:cs="Arial"/>
-              <w:sz w:val="16"/>
-              <w:szCs w:val="16"/>
-              <w:lang w:val="en-US"/>
-            </w:rPr>
-            <w:t xml:space="preserve"> Bekasi 17520</w:t>
+            <w:t>Jl. Arteri Tol Cibitung No.1, Cibitung Bekasi 17520</w:t>
           </w:r>
         </w:p>
         <w:p>
@@ -19921,7 +18192,6 @@
             </w:rPr>
             <w:t>/</w:t>
           </w:r>
-          <w:proofErr w:type="spellStart"/>
           <w:r>
             <w:rPr>
               <w:rFonts w:ascii="Arial" w:eastAsia="Times New Roman" w:hAnsi="Arial" w:cs="Arial"/>
@@ -19931,7 +18201,6 @@
             </w:rPr>
             <w:t>Faksimili</w:t>
           </w:r>
-          <w:proofErr w:type="spellEnd"/>
           <w:r>
             <w:rPr>
               <w:rFonts w:ascii="Arial" w:eastAsia="Times New Roman" w:hAnsi="Arial" w:cs="Arial"/>
@@ -20313,23 +18582,13 @@
               <w:szCs w:val="24"/>
             </w:rPr>
           </w:pPr>
-          <w:proofErr w:type="spellStart"/>
           <w:r>
             <w:rPr>
               <w:rFonts w:ascii="Arial" w:hAnsi="Arial" w:cs="Arial"/>
               <w:sz w:val="18"/>
               <w:szCs w:val="24"/>
             </w:rPr>
-            <w:t>Tanggal</w:t>
-          </w:r>
-          <w:proofErr w:type="spellEnd"/>
-          <w:r>
-            <w:rPr>
-              <w:rFonts w:ascii="Arial" w:hAnsi="Arial" w:cs="Arial"/>
-              <w:sz w:val="18"/>
-              <w:szCs w:val="24"/>
-            </w:rPr>
-            <w:t xml:space="preserve">: </w:t>
+            <w:t xml:space="preserve">Tanggal: </w:t>
           </w:r>
           <w:r>
             <w:rPr>
@@ -20366,7 +18625,7 @@
               <w:szCs w:val="24"/>
               <w:lang w:val="id-ID"/>
             </w:rPr>
-            <w:t>04 Maret 2026</w:t>
+            <w:t>19 Oktober 2026</w:t>
           </w:r>
           <w:r>
             <w:rPr>
@@ -20530,29 +18789,7 @@
               <w:szCs w:val="28"/>
               <w:lang w:val="en-US"/>
             </w:rPr>
-            <w:t xml:space="preserve">Kantor </w:t>
-          </w:r>
-          <w:proofErr w:type="spellStart"/>
-          <w:r>
-            <w:rPr>
-              <w:rFonts w:ascii="Arial" w:hAnsi="Arial" w:cs="Arial"/>
-              <w:bCs/>
-              <w:sz w:val="16"/>
-              <w:szCs w:val="28"/>
-              <w:lang w:val="en-US"/>
-            </w:rPr>
-            <w:t>Penerbit</w:t>
-          </w:r>
-          <w:proofErr w:type="spellEnd"/>
-          <w:r>
-            <w:rPr>
-              <w:rFonts w:ascii="Arial" w:hAnsi="Arial" w:cs="Arial"/>
-              <w:bCs/>
-              <w:sz w:val="16"/>
-              <w:szCs w:val="28"/>
-              <w:lang w:val="en-US"/>
-            </w:rPr>
-            <w:t xml:space="preserve"> :</w:t>
+            <w:t>Kantor Penerbit :</w:t>
           </w:r>
         </w:p>
       </w:tc>
@@ -20633,67 +18870,7 @@
               <w:szCs w:val="16"/>
               <w:lang w:val="en-US"/>
             </w:rPr>
-            <w:t xml:space="preserve">Jl. </w:t>
-          </w:r>
-          <w:proofErr w:type="spellStart"/>
-          <w:r>
-            <w:rPr>
-              <w:rFonts w:ascii="Arial" w:eastAsia="Times New Roman" w:hAnsi="Arial" w:cs="Arial"/>
-              <w:sz w:val="16"/>
-              <w:szCs w:val="16"/>
-              <w:lang w:val="en-US"/>
-            </w:rPr>
-            <w:t>Arteri</w:t>
-          </w:r>
-          <w:proofErr w:type="spellEnd"/>
-          <w:r>
-            <w:rPr>
-              <w:rFonts w:ascii="Arial" w:eastAsia="Times New Roman" w:hAnsi="Arial" w:cs="Arial"/>
-              <w:sz w:val="16"/>
-              <w:szCs w:val="16"/>
-              <w:lang w:val="en-US"/>
-            </w:rPr>
-            <w:t xml:space="preserve"> Tol </w:t>
-          </w:r>
-          <w:proofErr w:type="spellStart"/>
-          <w:r>
-            <w:rPr>
-              <w:rFonts w:ascii="Arial" w:eastAsia="Times New Roman" w:hAnsi="Arial" w:cs="Arial"/>
-              <w:sz w:val="16"/>
-              <w:szCs w:val="16"/>
-              <w:lang w:val="en-US"/>
-            </w:rPr>
-            <w:t>Cibitung</w:t>
-          </w:r>
-          <w:proofErr w:type="spellEnd"/>
-          <w:r>
-            <w:rPr>
-              <w:rFonts w:ascii="Arial" w:eastAsia="Times New Roman" w:hAnsi="Arial" w:cs="Arial"/>
-              <w:sz w:val="16"/>
-              <w:szCs w:val="16"/>
-              <w:lang w:val="en-US"/>
-            </w:rPr>
-            <w:t xml:space="preserve"> No.1, </w:t>
-          </w:r>
-          <w:proofErr w:type="spellStart"/>
-          <w:r>
-            <w:rPr>
-              <w:rFonts w:ascii="Arial" w:eastAsia="Times New Roman" w:hAnsi="Arial" w:cs="Arial"/>
-              <w:sz w:val="16"/>
-              <w:szCs w:val="16"/>
-              <w:lang w:val="en-US"/>
-            </w:rPr>
-            <w:t>Cibitung</w:t>
-          </w:r>
-          <w:proofErr w:type="spellEnd"/>
-          <w:r>
-            <w:rPr>
-              <w:rFonts w:ascii="Arial" w:eastAsia="Times New Roman" w:hAnsi="Arial" w:cs="Arial"/>
-              <w:sz w:val="16"/>
-              <w:szCs w:val="16"/>
-              <w:lang w:val="en-US"/>
-            </w:rPr>
-            <w:t xml:space="preserve"> Bekasi 17520</w:t>
+            <w:t>Jl. Arteri Tol Cibitung No.1, Cibitung Bekasi 17520</w:t>
           </w:r>
         </w:p>
         <w:p>
@@ -20729,7 +18906,6 @@
             </w:rPr>
             <w:t>/</w:t>
           </w:r>
-          <w:proofErr w:type="spellStart"/>
           <w:r>
             <w:rPr>
               <w:rFonts w:ascii="Arial" w:eastAsia="Times New Roman" w:hAnsi="Arial" w:cs="Arial"/>
@@ -20739,7 +18915,6 @@
             </w:rPr>
             <w:t>Faksimili</w:t>
           </w:r>
-          <w:proofErr w:type="spellEnd"/>
           <w:r>
             <w:rPr>
               <w:rFonts w:ascii="Arial" w:eastAsia="Times New Roman" w:hAnsi="Arial" w:cs="Arial"/>
@@ -21114,23 +19289,13 @@
               <w:szCs w:val="24"/>
             </w:rPr>
           </w:pPr>
-          <w:proofErr w:type="spellStart"/>
           <w:r>
             <w:rPr>
               <w:rFonts w:ascii="Arial" w:hAnsi="Arial" w:cs="Arial"/>
               <w:sz w:val="18"/>
               <w:szCs w:val="24"/>
             </w:rPr>
-            <w:t>Tanggal</w:t>
-          </w:r>
-          <w:proofErr w:type="spellEnd"/>
-          <w:r>
-            <w:rPr>
-              <w:rFonts w:ascii="Arial" w:hAnsi="Arial" w:cs="Arial"/>
-              <w:sz w:val="18"/>
-              <w:szCs w:val="24"/>
-            </w:rPr>
-            <w:t xml:space="preserve">: </w:t>
+            <w:t xml:space="preserve">Tanggal: </w:t>
           </w:r>
           <w:r>
             <w:rPr>
@@ -21167,7 +19332,7 @@
               <w:szCs w:val="24"/>
               <w:lang w:val="id-ID"/>
             </w:rPr>
-            <w:t>04 Maret 2026</w:t>
+            <w:t>19 Oktober 2026</w:t>
           </w:r>
           <w:r>
             <w:rPr>
@@ -21331,29 +19496,7 @@
               <w:szCs w:val="28"/>
               <w:lang w:val="en-US"/>
             </w:rPr>
-            <w:t xml:space="preserve">Kantor </w:t>
-          </w:r>
-          <w:proofErr w:type="spellStart"/>
-          <w:r>
-            <w:rPr>
-              <w:rFonts w:ascii="Arial" w:hAnsi="Arial" w:cs="Arial"/>
-              <w:bCs/>
-              <w:sz w:val="16"/>
-              <w:szCs w:val="28"/>
-              <w:lang w:val="en-US"/>
-            </w:rPr>
-            <w:t>Penerbit</w:t>
-          </w:r>
-          <w:proofErr w:type="spellEnd"/>
-          <w:r>
-            <w:rPr>
-              <w:rFonts w:ascii="Arial" w:hAnsi="Arial" w:cs="Arial"/>
-              <w:bCs/>
-              <w:sz w:val="16"/>
-              <w:szCs w:val="28"/>
-              <w:lang w:val="en-US"/>
-            </w:rPr>
-            <w:t xml:space="preserve"> :</w:t>
+            <w:t>Kantor Penerbit :</w:t>
           </w:r>
         </w:p>
       </w:tc>
@@ -21434,67 +19577,7 @@
               <w:szCs w:val="16"/>
               <w:lang w:val="en-US"/>
             </w:rPr>
-            <w:t xml:space="preserve">Jl. </w:t>
-          </w:r>
-          <w:proofErr w:type="spellStart"/>
-          <w:r>
-            <w:rPr>
-              <w:rFonts w:ascii="Arial" w:eastAsia="Times New Roman" w:hAnsi="Arial" w:cs="Arial"/>
-              <w:sz w:val="16"/>
-              <w:szCs w:val="16"/>
-              <w:lang w:val="en-US"/>
-            </w:rPr>
-            <w:t>Arteri</w:t>
-          </w:r>
-          <w:proofErr w:type="spellEnd"/>
-          <w:r>
-            <w:rPr>
-              <w:rFonts w:ascii="Arial" w:eastAsia="Times New Roman" w:hAnsi="Arial" w:cs="Arial"/>
-              <w:sz w:val="16"/>
-              <w:szCs w:val="16"/>
-              <w:lang w:val="en-US"/>
-            </w:rPr>
-            <w:t xml:space="preserve"> Tol </w:t>
-          </w:r>
-          <w:proofErr w:type="spellStart"/>
-          <w:r>
-            <w:rPr>
-              <w:rFonts w:ascii="Arial" w:eastAsia="Times New Roman" w:hAnsi="Arial" w:cs="Arial"/>
-              <w:sz w:val="16"/>
-              <w:szCs w:val="16"/>
-              <w:lang w:val="en-US"/>
-            </w:rPr>
-            <w:t>Cibitung</w:t>
-          </w:r>
-          <w:proofErr w:type="spellEnd"/>
-          <w:r>
-            <w:rPr>
-              <w:rFonts w:ascii="Arial" w:eastAsia="Times New Roman" w:hAnsi="Arial" w:cs="Arial"/>
-              <w:sz w:val="16"/>
-              <w:szCs w:val="16"/>
-              <w:lang w:val="en-US"/>
-            </w:rPr>
-            <w:t xml:space="preserve"> No.1, </w:t>
-          </w:r>
-          <w:proofErr w:type="spellStart"/>
-          <w:r>
-            <w:rPr>
-              <w:rFonts w:ascii="Arial" w:eastAsia="Times New Roman" w:hAnsi="Arial" w:cs="Arial"/>
-              <w:sz w:val="16"/>
-              <w:szCs w:val="16"/>
-              <w:lang w:val="en-US"/>
-            </w:rPr>
-            <w:t>Cibitung</w:t>
-          </w:r>
-          <w:proofErr w:type="spellEnd"/>
-          <w:r>
-            <w:rPr>
-              <w:rFonts w:ascii="Arial" w:eastAsia="Times New Roman" w:hAnsi="Arial" w:cs="Arial"/>
-              <w:sz w:val="16"/>
-              <w:szCs w:val="16"/>
-              <w:lang w:val="en-US"/>
-            </w:rPr>
-            <w:t xml:space="preserve"> Bekasi 17520</w:t>
+            <w:t>Jl. Arteri Tol Cibitung No.1, Cibitung Bekasi 17520</w:t>
           </w:r>
         </w:p>
         <w:p>
@@ -21530,7 +19613,6 @@
             </w:rPr>
             <w:t>/</w:t>
           </w:r>
-          <w:proofErr w:type="spellStart"/>
           <w:r>
             <w:rPr>
               <w:rFonts w:ascii="Arial" w:eastAsia="Times New Roman" w:hAnsi="Arial" w:cs="Arial"/>
@@ -21540,7 +19622,6 @@
             </w:rPr>
             <w:t>Faksimili</w:t>
           </w:r>
-          <w:proofErr w:type="spellEnd"/>
           <w:r>
             <w:rPr>
               <w:rFonts w:ascii="Arial" w:eastAsia="Times New Roman" w:hAnsi="Arial" w:cs="Arial"/>
@@ -21651,7 +19732,6 @@
               <w:szCs w:val="20"/>
             </w:rPr>
           </w:pPr>
-          <w:proofErr w:type="spellStart"/>
           <w:r>
             <w:rPr>
               <w:rFonts w:ascii="Arial" w:hAnsi="Arial" w:cs="Arial"/>
@@ -21662,7 +19742,6 @@
             </w:rPr>
             <w:t>Klausul</w:t>
           </w:r>
-          <w:proofErr w:type="spellEnd"/>
         </w:p>
       </w:tc>
       <w:tc>
@@ -21681,7 +19760,6 @@
               <w:szCs w:val="20"/>
             </w:rPr>
           </w:pPr>
-          <w:proofErr w:type="spellStart"/>
           <w:r>
             <w:rPr>
               <w:rFonts w:ascii="Arial" w:hAnsi="Arial" w:cs="Arial"/>
@@ -21690,31 +19768,8 @@
               <w:sz w:val="20"/>
               <w:szCs w:val="20"/>
             </w:rPr>
-            <w:t>Syarat-syarat</w:t>
+            <w:t>Syarat-syarat Pengujian</w:t>
           </w:r>
-          <w:proofErr w:type="spellEnd"/>
-          <w:r>
-            <w:rPr>
-              <w:rFonts w:ascii="Arial" w:hAnsi="Arial" w:cs="Arial"/>
-              <w:b/>
-              <w:bCs/>
-              <w:sz w:val="20"/>
-              <w:szCs w:val="20"/>
-            </w:rPr>
-            <w:t xml:space="preserve"> </w:t>
-          </w:r>
-          <w:proofErr w:type="spellStart"/>
-          <w:r>
-            <w:rPr>
-              <w:rFonts w:ascii="Arial" w:hAnsi="Arial" w:cs="Arial"/>
-              <w:b/>
-              <w:bCs/>
-              <w:sz w:val="20"/>
-              <w:szCs w:val="20"/>
-            </w:rPr>
-            <w:t>Pengujian</w:t>
-          </w:r>
-          <w:proofErr w:type="spellEnd"/>
         </w:p>
       </w:tc>
       <w:tc>
@@ -21741,20 +19796,8 @@
               <w:sz w:val="20"/>
               <w:szCs w:val="20"/>
             </w:rPr>
-            <w:t xml:space="preserve">Hasil – </w:t>
+            <w:t>Hasil – Catatan</w:t>
           </w:r>
-          <w:proofErr w:type="spellStart"/>
-          <w:r>
-            <w:rPr>
-              <w:rFonts w:ascii="Arial" w:hAnsi="Arial" w:cs="Arial"/>
-              <w:b/>
-              <w:bCs/>
-              <w:sz w:val="20"/>
-              <w:szCs w:val="20"/>
-            </w:rPr>
-            <w:t>Catatan</w:t>
-          </w:r>
-          <w:proofErr w:type="spellEnd"/>
         </w:p>
       </w:tc>
       <w:tc>
@@ -22106,23 +20149,13 @@
               <w:szCs w:val="24"/>
             </w:rPr>
           </w:pPr>
-          <w:proofErr w:type="spellStart"/>
           <w:r>
             <w:rPr>
               <w:rFonts w:ascii="Arial" w:hAnsi="Arial" w:cs="Arial"/>
               <w:sz w:val="18"/>
               <w:szCs w:val="24"/>
             </w:rPr>
-            <w:t>Tanggal</w:t>
-          </w:r>
-          <w:proofErr w:type="spellEnd"/>
-          <w:r>
-            <w:rPr>
-              <w:rFonts w:ascii="Arial" w:hAnsi="Arial" w:cs="Arial"/>
-              <w:sz w:val="18"/>
-              <w:szCs w:val="24"/>
-            </w:rPr>
-            <w:t xml:space="preserve">: </w:t>
+            <w:t xml:space="preserve">Tanggal: </w:t>
           </w:r>
           <w:r>
             <w:rPr>
@@ -22159,7 +20192,7 @@
               <w:szCs w:val="24"/>
               <w:lang w:val="id-ID"/>
             </w:rPr>
-            <w:t>04 Maret 2026</w:t>
+            <w:t>19 Oktober 2026</w:t>
           </w:r>
           <w:r>
             <w:rPr>
@@ -22323,29 +20356,7 @@
               <w:szCs w:val="28"/>
               <w:lang w:val="en-US"/>
             </w:rPr>
-            <w:t xml:space="preserve">Kantor </w:t>
-          </w:r>
-          <w:proofErr w:type="spellStart"/>
-          <w:r>
-            <w:rPr>
-              <w:rFonts w:ascii="Arial" w:hAnsi="Arial" w:cs="Arial"/>
-              <w:bCs/>
-              <w:sz w:val="16"/>
-              <w:szCs w:val="28"/>
-              <w:lang w:val="en-US"/>
-            </w:rPr>
-            <w:t>Penerbit</w:t>
-          </w:r>
-          <w:proofErr w:type="spellEnd"/>
-          <w:r>
-            <w:rPr>
-              <w:rFonts w:ascii="Arial" w:hAnsi="Arial" w:cs="Arial"/>
-              <w:bCs/>
-              <w:sz w:val="16"/>
-              <w:szCs w:val="28"/>
-              <w:lang w:val="en-US"/>
-            </w:rPr>
-            <w:t xml:space="preserve"> :</w:t>
+            <w:t>Kantor Penerbit :</w:t>
           </w:r>
         </w:p>
       </w:tc>
@@ -22426,67 +20437,7 @@
               <w:szCs w:val="16"/>
               <w:lang w:val="en-US"/>
             </w:rPr>
-            <w:t xml:space="preserve">Jl. </w:t>
-          </w:r>
-          <w:proofErr w:type="spellStart"/>
-          <w:r>
-            <w:rPr>
-              <w:rFonts w:ascii="Arial" w:eastAsia="Times New Roman" w:hAnsi="Arial" w:cs="Arial"/>
-              <w:sz w:val="16"/>
-              <w:szCs w:val="16"/>
-              <w:lang w:val="en-US"/>
-            </w:rPr>
-            <w:t>Arteri</w:t>
-          </w:r>
-          <w:proofErr w:type="spellEnd"/>
-          <w:r>
-            <w:rPr>
-              <w:rFonts w:ascii="Arial" w:eastAsia="Times New Roman" w:hAnsi="Arial" w:cs="Arial"/>
-              <w:sz w:val="16"/>
-              <w:szCs w:val="16"/>
-              <w:lang w:val="en-US"/>
-            </w:rPr>
-            <w:t xml:space="preserve"> Tol </w:t>
-          </w:r>
-          <w:proofErr w:type="spellStart"/>
-          <w:r>
-            <w:rPr>
-              <w:rFonts w:ascii="Arial" w:eastAsia="Times New Roman" w:hAnsi="Arial" w:cs="Arial"/>
-              <w:sz w:val="16"/>
-              <w:szCs w:val="16"/>
-              <w:lang w:val="en-US"/>
-            </w:rPr>
-            <w:t>Cibitung</w:t>
-          </w:r>
-          <w:proofErr w:type="spellEnd"/>
-          <w:r>
-            <w:rPr>
-              <w:rFonts w:ascii="Arial" w:eastAsia="Times New Roman" w:hAnsi="Arial" w:cs="Arial"/>
-              <w:sz w:val="16"/>
-              <w:szCs w:val="16"/>
-              <w:lang w:val="en-US"/>
-            </w:rPr>
-            <w:t xml:space="preserve"> No.1, </w:t>
-          </w:r>
-          <w:proofErr w:type="spellStart"/>
-          <w:r>
-            <w:rPr>
-              <w:rFonts w:ascii="Arial" w:eastAsia="Times New Roman" w:hAnsi="Arial" w:cs="Arial"/>
-              <w:sz w:val="16"/>
-              <w:szCs w:val="16"/>
-              <w:lang w:val="en-US"/>
-            </w:rPr>
-            <w:t>Cibitung</w:t>
-          </w:r>
-          <w:proofErr w:type="spellEnd"/>
-          <w:r>
-            <w:rPr>
-              <w:rFonts w:ascii="Arial" w:eastAsia="Times New Roman" w:hAnsi="Arial" w:cs="Arial"/>
-              <w:sz w:val="16"/>
-              <w:szCs w:val="16"/>
-              <w:lang w:val="en-US"/>
-            </w:rPr>
-            <w:t xml:space="preserve"> Bekasi 17520</w:t>
+            <w:t>Jl. Arteri Tol Cibitung No.1, Cibitung Bekasi 17520</w:t>
           </w:r>
         </w:p>
         <w:p>
@@ -22522,7 +20473,6 @@
             </w:rPr>
             <w:t>/</w:t>
           </w:r>
-          <w:proofErr w:type="spellStart"/>
           <w:r>
             <w:rPr>
               <w:rFonts w:ascii="Arial" w:eastAsia="Times New Roman" w:hAnsi="Arial" w:cs="Arial"/>
@@ -22532,7 +20482,6 @@
             </w:rPr>
             <w:t>Faksimili</w:t>
           </w:r>
-          <w:proofErr w:type="spellEnd"/>
           <w:r>
             <w:rPr>
               <w:rFonts w:ascii="Arial" w:eastAsia="Times New Roman" w:hAnsi="Arial" w:cs="Arial"/>

</xml_diff>

<commit_message>
minor update for docx template and datasheet generator
</commit_message>
<xml_diff>
--- a/src/templates/FULL-LED SWABALAST.docx
+++ b/src/templates/FULL-LED SWABALAST.docx
@@ -153,7 +153,7 @@
                 <w:sz w:val="20"/>
                 <w:szCs w:val="20"/>
               </w:rPr>
-              <w:t xml:space="preserve">{applicant}</w:t>
+              <w:t>{applicant}</w:t>
             </w:r>
           </w:p>
         </w:tc>
@@ -245,25 +245,7 @@
                 <w:szCs w:val="20"/>
                 <w:lang w:val="sv-SE"/>
               </w:rPr>
-              <w:t xml:space="preserve">ALAMAT</w:t>
-            </w:r>
-            <w:r>
-              <w:rPr>
-                <w:rFonts w:ascii="Arial" w:hAnsi="Arial" w:cs="Arial"/>
-                <w:sz w:val="20"/>
-                <w:szCs w:val="20"/>
-                <w:lang w:val="sv-SE"/>
-              </w:rPr>
-              <w:t/>
-            </w:r>
-            <w:r>
-              <w:rPr>
-                <w:rFonts w:ascii="Arial" w:hAnsi="Arial" w:cs="Arial"/>
-                <w:sz w:val="20"/>
-                <w:szCs w:val="20"/>
-                <w:lang w:val="sv-SE"/>
-              </w:rPr>
-              <w:t/>
+              <w:t>ALAMAT</w:t>
             </w:r>
           </w:p>
         </w:tc>
@@ -1157,7 +1139,7 @@
                 <w:sz w:val="20"/>
                 <w:szCs w:val="20"/>
               </w:rPr>
-              <w:t xml:space="preserve">Kode Contoh / No. BAPC</w:t>
+              <w:t>Kode Contoh / No. BAPC</w:t>
             </w:r>
           </w:p>
         </w:tc>
@@ -1497,25 +1479,7 @@
                 <w:sz w:val="20"/>
                 <w:szCs w:val="20"/>
               </w:rPr>
-              <w:t xml:space="preserve">{date_received}</w:t>
-            </w:r>
-            <w:proofErr w:type="spellStart"/>
-            <w:r>
-              <w:rPr>
-                <w:rFonts w:ascii="Arial" w:hAnsi="Arial" w:cs="Arial"/>
-                <w:sz w:val="20"/>
-                <w:szCs w:val="20"/>
-              </w:rPr>
-              <w:t/>
-            </w:r>
-            <w:proofErr w:type="spellEnd"/>
-            <w:r>
-              <w:rPr>
-                <w:rFonts w:ascii="Arial" w:hAnsi="Arial" w:cs="Arial"/>
-                <w:sz w:val="20"/>
-                <w:szCs w:val="20"/>
-              </w:rPr>
-              <w:t/>
+              <w:t>{date_received}</w:t>
             </w:r>
           </w:p>
         </w:tc>
@@ -1607,25 +1571,7 @@
                 <w:sz w:val="20"/>
                 <w:szCs w:val="20"/>
               </w:rPr>
-              <w:t xml:space="preserve">{date_testing}</w:t>
-            </w:r>
-            <w:proofErr w:type="spellStart"/>
-            <w:r>
-              <w:rPr>
-                <w:rFonts w:ascii="Arial" w:hAnsi="Arial" w:cs="Arial"/>
-                <w:sz w:val="20"/>
-                <w:szCs w:val="20"/>
-              </w:rPr>
-              <w:t/>
-            </w:r>
-            <w:proofErr w:type="spellEnd"/>
-            <w:r>
-              <w:rPr>
-                <w:rFonts w:ascii="Arial" w:hAnsi="Arial" w:cs="Arial"/>
-                <w:sz w:val="20"/>
-                <w:szCs w:val="20"/>
-              </w:rPr>
-              <w:t/>
+              <w:t>{date_testing}</w:t>
             </w:r>
           </w:p>
         </w:tc>
@@ -2079,29 +2025,7 @@
                 <w:szCs w:val="20"/>
                 <w:lang w:val="en-US"/>
               </w:rPr>
-              <w:t xml:space="preserve">{order_number}</w:t>
-            </w:r>
-            <w:proofErr w:type="spellStart"/>
-            <w:r>
-              <w:rPr>
-                <w:rFonts w:ascii="Arial" w:hAnsi="Arial" w:cs="Arial"/>
-                <w:bCs/>
-                <w:sz w:val="20"/>
-                <w:szCs w:val="20"/>
-                <w:lang w:val="en-US"/>
-              </w:rPr>
-              <w:t/>
-            </w:r>
-            <w:proofErr w:type="spellEnd"/>
-            <w:r>
-              <w:rPr>
-                <w:rFonts w:ascii="Arial" w:hAnsi="Arial" w:cs="Arial"/>
-                <w:bCs/>
-                <w:sz w:val="20"/>
-                <w:szCs w:val="20"/>
-                <w:lang w:val="en-US"/>
-              </w:rPr>
-              <w:t/>
+              <w:t>{order_number}</w:t>
             </w:r>
           </w:p>
         </w:tc>
@@ -2215,7 +2139,7 @@
                 <w:szCs w:val="20"/>
                 <w:lang w:val="sv-SE"/>
               </w:rPr>
-              <w:t xml:space="preserve">{approval_name}</w:t>
+              <w:t>{approval_name}</w:t>
             </w:r>
           </w:p>
         </w:tc>
@@ -2473,7 +2397,7 @@
                 <w:sz w:val="20"/>
                 <w:szCs w:val="20"/>
               </w:rPr>
-              <w:t xml:space="preserve">{technician_name}</w:t>
+              <w:t>{technician_name}</w:t>
             </w:r>
           </w:p>
         </w:tc>
@@ -2581,7 +2505,7 @@
                 <w:szCs w:val="20"/>
                 <w:lang w:val="en-GB"/>
               </w:rPr>
-              <w:t xml:space="preserve">{engineer_name}</w:t>
+              <w:t>{engineer_name}</w:t>
             </w:r>
           </w:p>
         </w:tc>
@@ -2688,7 +2612,7 @@
                 <w:szCs w:val="20"/>
                 <w:lang w:val="en-US"/>
               </w:rPr>
-              <w:t xml:space="preserve">{approval_name}</w:t>
+              <w:t>{approval_name}</w:t>
             </w:r>
           </w:p>
         </w:tc>
@@ -3133,7 +3057,7 @@
                 <w:sz w:val="20"/>
                 <w:szCs w:val="20"/>
               </w:rPr>
-              <w:t xml:space="preserve">{applicant}</w:t>
+              <w:t>{applicant}</w:t>
             </w:r>
           </w:p>
         </w:tc>
@@ -3242,7 +3166,7 @@
                 <w:szCs w:val="20"/>
                 <w:lang w:val="sv-SE"/>
               </w:rPr>
-              <w:t xml:space="preserve">{applicant_address}</w:t>
+              <w:t>{applicant_address}</w:t>
             </w:r>
           </w:p>
         </w:tc>
@@ -4287,7 +4211,7 @@
                 <w:sz w:val="20"/>
                 <w:szCs w:val="20"/>
               </w:rPr>
-              <w:t xml:space="preserve">Kode Contoh / No. BAPC</w:t>
+              <w:t>Kode Contoh / No. BAPC</w:t>
             </w:r>
           </w:p>
         </w:tc>
@@ -4571,26 +4495,6 @@
                 <w:szCs w:val="20"/>
               </w:rPr>
               <w:t>{factory_address}</w:t>
-            </w:r>
-            <w:proofErr w:type="spellStart"/>
-            <w:r>
-              <w:rPr>
-                <w:rFonts w:ascii="Arial" w:hAnsi="Arial" w:cs="Arial"/>
-                <w:bCs/>
-                <w:sz w:val="20"/>
-                <w:szCs w:val="20"/>
-              </w:rPr>
-              <w:t/>
-            </w:r>
-            <w:proofErr w:type="spellEnd"/>
-            <w:r>
-              <w:rPr>
-                <w:rFonts w:ascii="Arial" w:hAnsi="Arial" w:cs="Arial"/>
-                <w:bCs/>
-                <w:sz w:val="20"/>
-                <w:szCs w:val="20"/>
-              </w:rPr>
-              <w:t/>
             </w:r>
           </w:p>
         </w:tc>
@@ -5476,25 +5380,7 @@
                 <w:sz w:val="20"/>
                 <w:szCs w:val="20"/>
               </w:rPr>
-              <w:t xml:space="preserve">{date_received}</w:t>
-            </w:r>
-            <w:proofErr w:type="spellStart"/>
-            <w:r>
-              <w:rPr>
-                <w:rFonts w:ascii="Arial" w:hAnsi="Arial" w:cs="Arial"/>
-                <w:sz w:val="20"/>
-                <w:szCs w:val="20"/>
-              </w:rPr>
-              <w:t/>
-            </w:r>
-            <w:proofErr w:type="spellEnd"/>
-            <w:r>
-              <w:rPr>
-                <w:rFonts w:ascii="Arial" w:hAnsi="Arial" w:cs="Arial"/>
-                <w:sz w:val="20"/>
-                <w:szCs w:val="20"/>
-              </w:rPr>
-              <w:t/>
+              <w:t>{date_received}</w:t>
             </w:r>
           </w:p>
         </w:tc>
@@ -5602,25 +5488,7 @@
                 <w:sz w:val="20"/>
                 <w:szCs w:val="20"/>
               </w:rPr>
-              <w:t xml:space="preserve">{date_testing}</w:t>
-            </w:r>
-            <w:proofErr w:type="spellStart"/>
-            <w:r>
-              <w:rPr>
-                <w:rFonts w:ascii="Arial" w:hAnsi="Arial" w:cs="Arial"/>
-                <w:sz w:val="20"/>
-                <w:szCs w:val="20"/>
-              </w:rPr>
-              <w:t/>
-            </w:r>
-            <w:proofErr w:type="spellEnd"/>
-            <w:r>
-              <w:rPr>
-                <w:rFonts w:ascii="Arial" w:hAnsi="Arial" w:cs="Arial"/>
-                <w:sz w:val="20"/>
-                <w:szCs w:val="20"/>
-              </w:rPr>
-              <w:t/>
+              <w:t>{date_testing}</w:t>
             </w:r>
           </w:p>
         </w:tc>
@@ -5859,7 +5727,6 @@
                 <w:szCs w:val="20"/>
                 <w:lang w:val="it-IT"/>
               </w:rPr>
-              <w:lastRenderedPageBreak/>
               <w:t>Salinan Penandaan:</w:t>
             </w:r>
           </w:p>
@@ -6021,14 +5888,15 @@
                 <w:szCs w:val="20"/>
                 <w:lang w:val="sv-SE"/>
               </w:rPr>
-              <w:t xml:space="preserve">tidak</w:t>
-            </w:r>
-            <w:r>
-              <w:rPr>
-                <w:rFonts w:ascii="Arial" w:hAnsi="Arial" w:cs="Arial"/>
-                <w:sz w:val="20"/>
-                <w:szCs w:val="20"/>
-                <w:lang w:val="it-IT" w:eastAsia="zh-CN"/>
+              <w:t>{if_not_pass}</w:t>
+            </w:r>
+            <w:r>
+              <w:rPr>
+                <w:rFonts w:ascii="Arial" w:hAnsi="Arial" w:cs="Arial"/>
+                <w:color w:val="FF0000"/>
+                <w:sz w:val="20"/>
+                <w:szCs w:val="20"/>
+                <w:lang w:val="sv-SE"/>
               </w:rPr>
               <w:t xml:space="preserve"> </w:t>
             </w:r>
@@ -6150,7 +6018,7 @@
                 <w:szCs w:val="20"/>
                 <w:lang w:val="en-ID" w:eastAsia="zh-CN"/>
               </w:rPr>
-              <w:t xml:space="preserve">{merk}</w:t>
+              <w:t>{merk}</w:t>
             </w:r>
             <w:r>
               <w:rPr>
@@ -6198,7 +6066,7 @@
                 <w:szCs w:val="20"/>
                 <w:lang w:val="en-ID" w:eastAsia="zh-CN"/>
               </w:rPr>
-              <w:t xml:space="preserve">{model}</w:t>
+              <w:t>{model}</w:t>
             </w:r>
             <w:r>
               <w:rPr>
@@ -6258,7 +6126,7 @@
                 <w:szCs w:val="20"/>
                 <w:lang w:val="en-ID"/>
               </w:rPr>
-              <w:t xml:space="preserve">{testing_type}</w:t>
+              <w:t>{</w:t>
             </w:r>
             <w:proofErr w:type="spellStart"/>
             <w:r>
@@ -6269,7 +6137,7 @@
                 <w:szCs w:val="20"/>
                 <w:lang w:val="en-ID"/>
               </w:rPr>
-              <w:t/>
+              <w:t>testing_type</w:t>
             </w:r>
             <w:proofErr w:type="spellEnd"/>
             <w:r>
@@ -6280,9 +6148,30 @@
                 <w:szCs w:val="20"/>
                 <w:lang w:val="en-ID"/>
               </w:rPr>
+              <w:t xml:space="preserve">} </w:t>
+            </w:r>
+            <w:proofErr w:type="spellStart"/>
+            <w:r>
+              <w:rPr>
+                <w:rFonts w:ascii="Arial" w:hAnsi="Arial" w:cs="Arial"/>
+                <w:bCs/>
+                <w:sz w:val="20"/>
+                <w:szCs w:val="20"/>
+                <w:lang w:val="en-ID"/>
+              </w:rPr>
+              <w:t>dengan</w:t>
+            </w:r>
+            <w:proofErr w:type="spellEnd"/>
+            <w:r>
+              <w:rPr>
+                <w:rFonts w:ascii="Arial" w:hAnsi="Arial" w:cs="Arial"/>
+                <w:bCs/>
+                <w:sz w:val="20"/>
+                <w:szCs w:val="20"/>
+                <w:lang w:val="en-ID"/>
+              </w:rPr>
               <w:t xml:space="preserve"> </w:t>
             </w:r>
-            <w:proofErr w:type="spellStart"/>
             <w:r>
               <w:rPr>
                 <w:rFonts w:ascii="Arial" w:hAnsi="Arial" w:cs="Arial"/>
@@ -6291,50 +6180,7 @@
                 <w:szCs w:val="20"/>
                 <w:lang w:val="en-ID"/>
               </w:rPr>
-              <w:t>dengan</w:t>
-            </w:r>
-            <w:proofErr w:type="spellEnd"/>
-            <w:r>
-              <w:rPr>
-                <w:rFonts w:ascii="Arial" w:hAnsi="Arial" w:cs="Arial"/>
-                <w:bCs/>
-                <w:sz w:val="20"/>
-                <w:szCs w:val="20"/>
-                <w:lang w:val="en-ID"/>
-              </w:rPr>
-              <w:t xml:space="preserve"> </w:t>
-            </w:r>
-            <w:r>
-              <w:rPr>
-                <w:rFonts w:ascii="Arial" w:hAnsi="Arial" w:cs="Arial"/>
-                <w:bCs/>
-                <w:sz w:val="20"/>
-                <w:szCs w:val="20"/>
-                <w:lang w:val="en-ID"/>
-              </w:rPr>
-              <w:t xml:space="preserve">{iwo_or_duty_letter}</w:t>
-            </w:r>
-            <w:proofErr w:type="spellStart"/>
-            <w:r>
-              <w:rPr>
-                <w:rFonts w:ascii="Arial" w:hAnsi="Arial" w:cs="Arial"/>
-                <w:bCs/>
-                <w:sz w:val="20"/>
-                <w:szCs w:val="20"/>
-                <w:lang w:val="en-ID"/>
-              </w:rPr>
-              <w:t/>
-            </w:r>
-            <w:proofErr w:type="spellEnd"/>
-            <w:r>
-              <w:rPr>
-                <w:rFonts w:ascii="Arial" w:hAnsi="Arial" w:cs="Arial"/>
-                <w:bCs/>
-                <w:sz w:val="20"/>
-                <w:szCs w:val="20"/>
-                <w:lang w:val="en-ID"/>
-              </w:rPr>
-              <w:t/>
+              <w:t>{iwo_or_duty_letter}</w:t>
             </w:r>
           </w:p>
         </w:tc>
@@ -6366,7 +6212,7 @@
         <w:tblLook w:val="01E0" w:firstRow="1" w:lastRow="1" w:firstColumn="1" w:lastColumn="1" w:noHBand="0" w:noVBand="0"/>
       </w:tblPr>
       <w:tblGrid>
-        <w:gridCol w:w="10080"/>
+        <w:gridCol w:w="10644"/>
       </w:tblGrid>
       <w:tr>
         <w:trPr>
@@ -6450,11 +6296,11 @@
               <w:tblLook w:val="04A0" w:firstRow="1" w:lastRow="0" w:firstColumn="1" w:lastColumn="0" w:noHBand="0" w:noVBand="1"/>
             </w:tblPr>
             <w:tblGrid>
-              <w:gridCol w:w="1696"/>
-              <w:gridCol w:w="2267"/>
-              <w:gridCol w:w="1942"/>
-              <w:gridCol w:w="2169"/>
-              <w:gridCol w:w="1717"/>
+              <w:gridCol w:w="753"/>
+              <w:gridCol w:w="846"/>
+              <w:gridCol w:w="3188"/>
+              <w:gridCol w:w="2630"/>
+              <w:gridCol w:w="3001"/>
             </w:tblGrid>
             <w:tr>
               <w:tc>
@@ -6629,7 +6475,7 @@
                       <w:szCs w:val="20"/>
                       <w:lang w:val="en-GB" w:eastAsia="zh-CN"/>
                     </w:rPr>
-                    <w:t xml:space="preserve">{merk}</w:t>
+                    <w:t>{merk}</w:t>
                   </w:r>
                 </w:p>
               </w:tc>
@@ -6655,7 +6501,7 @@
                       <w:szCs w:val="20"/>
                       <w:lang w:eastAsia="zh-CN"/>
                     </w:rPr>
-                    <w:t xml:space="preserve">{model}</w:t>
+                    <w:t>{model}</w:t>
                   </w:r>
                 </w:p>
               </w:tc>
@@ -6681,7 +6527,7 @@
                       <w:szCs w:val="20"/>
                       <w:lang w:val="en-GB" w:eastAsia="zh-CN"/>
                     </w:rPr>
-                    <w:t>{marking_voltage}</w:t>
+                    <w:t>{</w:t>
                   </w:r>
                   <w:proofErr w:type="spellStart"/>
                   <w:r>
@@ -6691,7 +6537,7 @@
                       <w:szCs w:val="20"/>
                       <w:lang w:val="en-GB" w:eastAsia="zh-CN"/>
                     </w:rPr>
-                    <w:t>{marking_voltage}</w:t>
+                    <w:t>marking_voltage</w:t>
                   </w:r>
                   <w:proofErr w:type="spellEnd"/>
                   <w:r>
@@ -6701,7 +6547,27 @@
                       <w:szCs w:val="20"/>
                       <w:lang w:val="en-GB" w:eastAsia="zh-CN"/>
                     </w:rPr>
-                    <w:t/>
+                    <w:t>}{</w:t>
+                  </w:r>
+                  <w:proofErr w:type="spellStart"/>
+                  <w:r>
+                    <w:rPr>
+                      <w:rFonts w:ascii="Arial" w:hAnsi="Arial" w:cs="Arial"/>
+                      <w:sz w:val="20"/>
+                      <w:szCs w:val="20"/>
+                      <w:lang w:val="en-GB" w:eastAsia="zh-CN"/>
+                    </w:rPr>
+                    <w:t>marking_voltage</w:t>
+                  </w:r>
+                  <w:proofErr w:type="spellEnd"/>
+                  <w:r>
+                    <w:rPr>
+                      <w:rFonts w:ascii="Arial" w:hAnsi="Arial" w:cs="Arial"/>
+                      <w:sz w:val="20"/>
+                      <w:szCs w:val="20"/>
+                      <w:lang w:val="en-GB" w:eastAsia="zh-CN"/>
+                    </w:rPr>
+                    <w:t>}</w:t>
                   </w:r>
                 </w:p>
               </w:tc>
@@ -6727,7 +6593,7 @@
                       <w:szCs w:val="20"/>
                       <w:lang w:val="en-GB"/>
                     </w:rPr>
-                    <w:t>{marking_freq}</w:t>
+                    <w:t>{</w:t>
                   </w:r>
                   <w:proofErr w:type="spellStart"/>
                   <w:r>
@@ -6737,7 +6603,7 @@
                       <w:szCs w:val="20"/>
                       <w:lang w:val="en-GB"/>
                     </w:rPr>
-                    <w:t>{marking_freq}</w:t>
+                    <w:t>marking_freq</w:t>
                   </w:r>
                   <w:proofErr w:type="spellEnd"/>
                   <w:r>
@@ -6747,7 +6613,27 @@
                       <w:szCs w:val="20"/>
                       <w:lang w:val="en-GB"/>
                     </w:rPr>
-                    <w:t/>
+                    <w:t>}{</w:t>
+                  </w:r>
+                  <w:proofErr w:type="spellStart"/>
+                  <w:r>
+                    <w:rPr>
+                      <w:rFonts w:ascii="Arial" w:hAnsi="Arial" w:cs="Arial"/>
+                      <w:sz w:val="20"/>
+                      <w:szCs w:val="20"/>
+                      <w:lang w:val="en-GB"/>
+                    </w:rPr>
+                    <w:t>marking_freq</w:t>
+                  </w:r>
+                  <w:proofErr w:type="spellEnd"/>
+                  <w:r>
+                    <w:rPr>
+                      <w:rFonts w:ascii="Arial" w:hAnsi="Arial" w:cs="Arial"/>
+                      <w:sz w:val="20"/>
+                      <w:szCs w:val="20"/>
+                      <w:lang w:val="en-GB"/>
+                    </w:rPr>
+                    <w:t>}</w:t>
                   </w:r>
                 </w:p>
               </w:tc>
@@ -6773,7 +6659,7 @@
                       <w:szCs w:val="20"/>
                       <w:lang w:val="en-US"/>
                     </w:rPr>
-                    <w:t>{marking_power}</w:t>
+                    <w:t>{</w:t>
                   </w:r>
                   <w:proofErr w:type="spellStart"/>
                   <w:r>
@@ -6783,7 +6669,7 @@
                       <w:szCs w:val="20"/>
                       <w:lang w:val="en-US"/>
                     </w:rPr>
-                    <w:t>{marking_power}</w:t>
+                    <w:t>marking_power</w:t>
                   </w:r>
                   <w:proofErr w:type="spellEnd"/>
                   <w:r>
@@ -6793,7 +6679,27 @@
                       <w:szCs w:val="20"/>
                       <w:lang w:val="en-US"/>
                     </w:rPr>
-                    <w:t/>
+                    <w:t>}{</w:t>
+                  </w:r>
+                  <w:proofErr w:type="spellStart"/>
+                  <w:r>
+                    <w:rPr>
+                      <w:rFonts w:ascii="Arial" w:hAnsi="Arial" w:cs="Arial"/>
+                      <w:sz w:val="20"/>
+                      <w:szCs w:val="20"/>
+                      <w:lang w:val="en-US"/>
+                    </w:rPr>
+                    <w:t>marking_power</w:t>
+                  </w:r>
+                  <w:proofErr w:type="spellEnd"/>
+                  <w:r>
+                    <w:rPr>
+                      <w:rFonts w:ascii="Arial" w:hAnsi="Arial" w:cs="Arial"/>
+                      <w:sz w:val="20"/>
+                      <w:szCs w:val="20"/>
+                      <w:lang w:val="en-US"/>
+                    </w:rPr>
+                    <w:t>}</w:t>
                   </w:r>
                 </w:p>
               </w:tc>
@@ -6882,10 +6788,8 @@
               </w:rPr>
             </w:pPr>
             <w:r>
-              <w:t>{#summary} </w:t>
-            </w:r>
-            <w:r>
-              <w:t>{#is_header}</w:t>
+              <w:lastRenderedPageBreak/>
+              <w:t>{#summary}{#is_header}</w:t>
             </w:r>
             <w:r>
               <w:rPr>
@@ -7159,23 +7063,7 @@
                 <w:sz w:val="20"/>
                 <w:szCs w:val="20"/>
               </w:rPr>
-              <w:t>{/is_header}{^is_header}</w:t>
-            </w:r>
-            <w:r>
-              <w:rPr>
-                <w:rFonts w:ascii="Arial" w:hAnsi="Arial" w:cs="Arial"/>
-                <w:sz w:val="20"/>
-                <w:szCs w:val="20"/>
-              </w:rPr>
-              <w:t>{text}</w:t>
-            </w:r>
-            <w:r>
-              <w:rPr>
-                <w:rFonts w:ascii="Arial" w:hAnsi="Arial" w:cs="Arial"/>
-                <w:sz w:val="20"/>
-                <w:szCs w:val="20"/>
-              </w:rPr>
-              <w:t>{/is_header}</w:t>
+              <w:t>{/is_header}{^is_header}{text}{/is_header}</w:t>
             </w:r>
           </w:p>
         </w:tc>
@@ -7462,39 +7350,7 @@
                 <w:szCs w:val="20"/>
                 <w:lang w:val="en-US"/>
               </w:rPr>
-              <w:t xml:space="preserve">undefined</w:t>
-            </w:r>
-            <w:proofErr w:type="spellStart"/>
-            <w:r>
-              <w:rPr>
-                <w:rFonts w:ascii="Arial" w:hAnsi="Arial" w:cs="Arial"/>
-                <w:b/>
-                <w:sz w:val="20"/>
-                <w:szCs w:val="20"/>
-                <w:lang w:val="en-US"/>
-              </w:rPr>
-              <w:t/>
-            </w:r>
-            <w:r>
-              <w:rPr>
-                <w:rFonts w:ascii="Arial" w:hAnsi="Arial" w:cs="Arial"/>
-                <w:b/>
-                <w:sz w:val="20"/>
-                <w:szCs w:val="20"/>
-                <w:lang w:val="en-US"/>
-              </w:rPr>
-              <w:t/>
-            </w:r>
-            <w:proofErr w:type="spellEnd"/>
-            <w:r>
-              <w:rPr>
-                <w:rFonts w:ascii="Arial" w:hAnsi="Arial" w:cs="Arial"/>
-                <w:b/>
-                <w:sz w:val="20"/>
-                <w:szCs w:val="20"/>
-                <w:lang w:val="en-US"/>
-              </w:rPr>
-              <w:t/>
+              <w:t>undefined</w:t>
             </w:r>
           </w:p>
         </w:tc>
@@ -7979,7 +7835,7 @@
                 <w:szCs w:val="20"/>
                 <w:lang w:val="sv-SE"/>
               </w:rPr>
-              <w:t xml:space="preserve">undefined</w:t>
+              <w:t>undefined</w:t>
             </w:r>
           </w:p>
         </w:tc>
@@ -8010,7 +7866,7 @@
                 <w:szCs w:val="20"/>
                 <w:lang w:val="sv-SE"/>
               </w:rPr>
-              <w:t xml:space="preserve">undefined</w:t>
+              <w:t>undefined</w:t>
             </w:r>
           </w:p>
         </w:tc>
@@ -8041,7 +7897,7 @@
                 <w:szCs w:val="20"/>
                 <w:lang w:val="sv-SE"/>
               </w:rPr>
-              <w:t xml:space="preserve">undefined</w:t>
+              <w:t>undefined</w:t>
             </w:r>
           </w:p>
         </w:tc>
@@ -8072,7 +7928,7 @@
                 <w:szCs w:val="20"/>
                 <w:lang w:val="sv-SE"/>
               </w:rPr>
-              <w:t xml:space="preserve">undefined</w:t>
+              <w:t>undefined</w:t>
             </w:r>
           </w:p>
         </w:tc>
@@ -8103,7 +7959,7 @@
                 <w:szCs w:val="20"/>
                 <w:lang w:val="sv-SE"/>
               </w:rPr>
-              <w:t xml:space="preserve">undefined</w:t>
+              <w:t>undefined</w:t>
             </w:r>
           </w:p>
         </w:tc>
@@ -8134,7 +7990,7 @@
                 <w:szCs w:val="20"/>
                 <w:lang w:val="sv-SE"/>
               </w:rPr>
-              <w:t xml:space="preserve">undefined</w:t>
+              <w:t>undefined</w:t>
             </w:r>
           </w:p>
         </w:tc>
@@ -8165,7 +8021,7 @@
                 <w:szCs w:val="20"/>
                 <w:lang w:val="sv-SE"/>
               </w:rPr>
-              <w:t xml:space="preserve">undefined</w:t>
+              <w:t>undefined</w:t>
             </w:r>
           </w:p>
         </w:tc>
@@ -8196,7 +8052,7 @@
                 <w:szCs w:val="20"/>
                 <w:lang w:val="sv-SE"/>
               </w:rPr>
-              <w:t xml:space="preserve">undefined</w:t>
+              <w:t>undefined</w:t>
             </w:r>
           </w:p>
         </w:tc>
@@ -8227,7 +8083,7 @@
                 <w:szCs w:val="20"/>
                 <w:lang w:val="sv-SE"/>
               </w:rPr>
-              <w:t xml:space="preserve">undefined</w:t>
+              <w:t>undefined</w:t>
             </w:r>
           </w:p>
         </w:tc>
@@ -8258,7 +8114,7 @@
                 <w:szCs w:val="20"/>
                 <w:lang w:val="sv-SE"/>
               </w:rPr>
-              <w:t xml:space="preserve">undefined</w:t>
+              <w:t>undefined</w:t>
             </w:r>
           </w:p>
         </w:tc>
@@ -8289,7 +8145,7 @@
                 <w:szCs w:val="20"/>
                 <w:lang w:val="sv-SE"/>
               </w:rPr>
-              <w:t xml:space="preserve">undefined</w:t>
+              <w:t>undefined</w:t>
             </w:r>
           </w:p>
         </w:tc>
@@ -8389,7 +8245,7 @@
                 <w:szCs w:val="20"/>
                 <w:lang w:val="sv-SE"/>
               </w:rPr>
-              <w:t xml:space="preserve">undefined</w:t>
+              <w:t>undefined</w:t>
             </w:r>
           </w:p>
         </w:tc>
@@ -8420,7 +8276,7 @@
                 <w:szCs w:val="20"/>
                 <w:lang w:val="sv-SE"/>
               </w:rPr>
-              <w:t xml:space="preserve">undefined</w:t>
+              <w:t>undefined</w:t>
             </w:r>
           </w:p>
         </w:tc>
@@ -8451,7 +8307,7 @@
                 <w:szCs w:val="20"/>
                 <w:lang w:val="sv-SE"/>
               </w:rPr>
-              <w:t xml:space="preserve">undefined</w:t>
+              <w:t>undefined</w:t>
             </w:r>
           </w:p>
         </w:tc>
@@ -8482,7 +8338,7 @@
                 <w:szCs w:val="20"/>
                 <w:lang w:val="sv-SE"/>
               </w:rPr>
-              <w:t xml:space="preserve">undefined</w:t>
+              <w:t>undefined</w:t>
             </w:r>
           </w:p>
         </w:tc>
@@ -8513,7 +8369,7 @@
                 <w:szCs w:val="20"/>
                 <w:lang w:val="sv-SE"/>
               </w:rPr>
-              <w:t xml:space="preserve">undefined</w:t>
+              <w:t>undefined</w:t>
             </w:r>
           </w:p>
         </w:tc>
@@ -8544,7 +8400,7 @@
                 <w:szCs w:val="20"/>
                 <w:lang w:val="sv-SE"/>
               </w:rPr>
-              <w:t xml:space="preserve">undefined</w:t>
+              <w:t>undefined</w:t>
             </w:r>
           </w:p>
         </w:tc>
@@ -8575,7 +8431,7 @@
                 <w:szCs w:val="20"/>
                 <w:lang w:val="sv-SE"/>
               </w:rPr>
-              <w:t xml:space="preserve">undefined</w:t>
+              <w:t>undefined</w:t>
             </w:r>
           </w:p>
         </w:tc>
@@ -8606,7 +8462,7 @@
                 <w:szCs w:val="20"/>
                 <w:lang w:val="sv-SE"/>
               </w:rPr>
-              <w:t xml:space="preserve">undefined</w:t>
+              <w:t>undefined</w:t>
             </w:r>
           </w:p>
         </w:tc>
@@ -8637,7 +8493,7 @@
                 <w:szCs w:val="20"/>
                 <w:lang w:val="sv-SE"/>
               </w:rPr>
-              <w:t xml:space="preserve">undefined</w:t>
+              <w:t>undefined</w:t>
             </w:r>
           </w:p>
         </w:tc>
@@ -8668,7 +8524,7 @@
                 <w:szCs w:val="20"/>
                 <w:lang w:val="sv-SE"/>
               </w:rPr>
-              <w:t xml:space="preserve">undefined</w:t>
+              <w:t>undefined</w:t>
             </w:r>
           </w:p>
         </w:tc>
@@ -8699,7 +8555,7 @@
                 <w:szCs w:val="20"/>
                 <w:lang w:val="sv-SE"/>
               </w:rPr>
-              <w:t xml:space="preserve">undefined</w:t>
+              <w:t>undefined</w:t>
             </w:r>
           </w:p>
         </w:tc>
@@ -8789,7 +8645,7 @@
                 <w:szCs w:val="20"/>
                 <w:lang w:val="sv-SE"/>
               </w:rPr>
-              <w:t xml:space="preserve">undefined</w:t>
+              <w:t>undefined</w:t>
             </w:r>
           </w:p>
         </w:tc>
@@ -8820,7 +8676,7 @@
                 <w:szCs w:val="20"/>
                 <w:lang w:val="sv-SE"/>
               </w:rPr>
-              <w:t xml:space="preserve">undefined</w:t>
+              <w:t>undefined</w:t>
             </w:r>
           </w:p>
         </w:tc>
@@ -8851,7 +8707,7 @@
                 <w:szCs w:val="20"/>
                 <w:lang w:val="sv-SE"/>
               </w:rPr>
-              <w:t xml:space="preserve">undefined</w:t>
+              <w:t>undefined</w:t>
             </w:r>
           </w:p>
         </w:tc>
@@ -8882,7 +8738,7 @@
                 <w:szCs w:val="20"/>
                 <w:lang w:val="sv-SE"/>
               </w:rPr>
-              <w:t xml:space="preserve">undefined</w:t>
+              <w:t>undefined</w:t>
             </w:r>
           </w:p>
         </w:tc>
@@ -8913,7 +8769,7 @@
                 <w:szCs w:val="20"/>
                 <w:lang w:val="sv-SE"/>
               </w:rPr>
-              <w:t xml:space="preserve">undefined</w:t>
+              <w:t>undefined</w:t>
             </w:r>
           </w:p>
         </w:tc>
@@ -8944,7 +8800,7 @@
                 <w:szCs w:val="20"/>
                 <w:lang w:val="sv-SE"/>
               </w:rPr>
-              <w:t xml:space="preserve">undefined</w:t>
+              <w:t>undefined</w:t>
             </w:r>
           </w:p>
         </w:tc>
@@ -8975,7 +8831,7 @@
                 <w:szCs w:val="20"/>
                 <w:lang w:val="sv-SE"/>
               </w:rPr>
-              <w:t xml:space="preserve">undefined</w:t>
+              <w:t>undefined</w:t>
             </w:r>
           </w:p>
         </w:tc>
@@ -9006,7 +8862,7 @@
                 <w:szCs w:val="20"/>
                 <w:lang w:val="sv-SE"/>
               </w:rPr>
-              <w:t xml:space="preserve">undefined</w:t>
+              <w:t>undefined</w:t>
             </w:r>
           </w:p>
         </w:tc>
@@ -9037,7 +8893,7 @@
                 <w:szCs w:val="20"/>
                 <w:lang w:val="sv-SE"/>
               </w:rPr>
-              <w:t xml:space="preserve">undefined</w:t>
+              <w:t>undefined</w:t>
             </w:r>
           </w:p>
         </w:tc>
@@ -9068,7 +8924,7 @@
                 <w:szCs w:val="20"/>
                 <w:lang w:val="sv-SE"/>
               </w:rPr>
-              <w:t xml:space="preserve">undefined</w:t>
+              <w:t>undefined</w:t>
             </w:r>
           </w:p>
         </w:tc>
@@ -9099,7 +8955,7 @@
                 <w:szCs w:val="20"/>
                 <w:lang w:val="sv-SE"/>
               </w:rPr>
-              <w:t xml:space="preserve">undefined</w:t>
+              <w:t>undefined</w:t>
             </w:r>
           </w:p>
         </w:tc>
@@ -9200,7 +9056,7 @@
                 <w:szCs w:val="20"/>
                 <w:lang w:val="sv-SE"/>
               </w:rPr>
-              <w:t xml:space="preserve">undefined</w:t>
+              <w:t>undefined</w:t>
             </w:r>
           </w:p>
         </w:tc>
@@ -9231,7 +9087,7 @@
                 <w:szCs w:val="20"/>
                 <w:lang w:val="sv-SE"/>
               </w:rPr>
-              <w:t xml:space="preserve">undefined</w:t>
+              <w:t>undefined</w:t>
             </w:r>
           </w:p>
         </w:tc>
@@ -9262,7 +9118,7 @@
                 <w:szCs w:val="20"/>
                 <w:lang w:val="sv-SE"/>
               </w:rPr>
-              <w:t xml:space="preserve">undefined</w:t>
+              <w:t>undefined</w:t>
             </w:r>
           </w:p>
         </w:tc>
@@ -9293,7 +9149,7 @@
                 <w:szCs w:val="20"/>
                 <w:lang w:val="sv-SE"/>
               </w:rPr>
-              <w:t xml:space="preserve">undefined</w:t>
+              <w:t>undefined</w:t>
             </w:r>
           </w:p>
         </w:tc>
@@ -9324,7 +9180,7 @@
                 <w:szCs w:val="20"/>
                 <w:lang w:val="sv-SE"/>
               </w:rPr>
-              <w:t xml:space="preserve">undefined</w:t>
+              <w:t>undefined</w:t>
             </w:r>
           </w:p>
         </w:tc>
@@ -9355,7 +9211,7 @@
                 <w:szCs w:val="20"/>
                 <w:lang w:val="sv-SE"/>
               </w:rPr>
-              <w:t xml:space="preserve">undefined</w:t>
+              <w:t>undefined</w:t>
             </w:r>
           </w:p>
         </w:tc>
@@ -9386,7 +9242,7 @@
                 <w:szCs w:val="20"/>
                 <w:lang w:val="sv-SE"/>
               </w:rPr>
-              <w:t xml:space="preserve">undefined</w:t>
+              <w:t>undefined</w:t>
             </w:r>
           </w:p>
         </w:tc>
@@ -9417,7 +9273,7 @@
                 <w:szCs w:val="20"/>
                 <w:lang w:val="sv-SE"/>
               </w:rPr>
-              <w:t xml:space="preserve">undefined</w:t>
+              <w:t>undefined</w:t>
             </w:r>
           </w:p>
         </w:tc>
@@ -9448,7 +9304,7 @@
                 <w:szCs w:val="20"/>
                 <w:lang w:val="sv-SE"/>
               </w:rPr>
-              <w:t xml:space="preserve">undefined</w:t>
+              <w:t>undefined</w:t>
             </w:r>
           </w:p>
         </w:tc>
@@ -9479,7 +9335,7 @@
                 <w:szCs w:val="20"/>
                 <w:lang w:val="sv-SE"/>
               </w:rPr>
-              <w:t xml:space="preserve">undefined</w:t>
+              <w:t>undefined</w:t>
             </w:r>
           </w:p>
         </w:tc>
@@ -9510,7 +9366,7 @@
                 <w:szCs w:val="20"/>
                 <w:lang w:val="sv-SE"/>
               </w:rPr>
-              <w:t xml:space="preserve">undefined</w:t>
+              <w:t>undefined</w:t>
             </w:r>
           </w:p>
         </w:tc>
@@ -9545,11 +9401,11 @@
         <w:tblLook w:val="01E0" w:firstRow="1" w:lastRow="1" w:firstColumn="1" w:lastColumn="1" w:noHBand="0" w:noVBand="0"/>
       </w:tblPr>
       <w:tblGrid>
-        <w:gridCol w:w="944"/>
-        <w:gridCol w:w="3002"/>
-        <w:gridCol w:w="2821"/>
-        <w:gridCol w:w="1302"/>
-        <w:gridCol w:w="1962"/>
+        <w:gridCol w:w="959"/>
+        <w:gridCol w:w="3209"/>
+        <w:gridCol w:w="2952"/>
+        <w:gridCol w:w="1404"/>
+        <w:gridCol w:w="1507"/>
       </w:tblGrid>
       <w:tr>
         <w:trPr>
@@ -9653,29 +9509,7 @@
                 <w:szCs w:val="20"/>
                 <w:lang w:val="en-US"/>
               </w:rPr>
-              <w:t xml:space="preserve">undefined</w:t>
-            </w:r>
-            <w:proofErr w:type="spellStart"/>
-            <w:r>
-              <w:rPr>
-                <w:rFonts w:ascii="Arial" w:hAnsi="Arial" w:cs="Arial"/>
-                <w:b/>
-                <w:sz w:val="20"/>
-                <w:szCs w:val="20"/>
-                <w:lang w:val="en-US"/>
-              </w:rPr>
-              <w:t/>
-            </w:r>
-            <w:proofErr w:type="spellEnd"/>
-            <w:r>
-              <w:rPr>
-                <w:rFonts w:ascii="Arial" w:hAnsi="Arial" w:cs="Arial"/>
-                <w:b/>
-                <w:sz w:val="20"/>
-                <w:szCs w:val="20"/>
-                <w:lang w:val="en-US"/>
-              </w:rPr>
-              <w:t/>
+              <w:t>undefined</w:t>
             </w:r>
           </w:p>
         </w:tc>
@@ -9878,25 +9712,7 @@
                 <w:sz w:val="20"/>
                 <w:szCs w:val="20"/>
               </w:rPr>
-              <w:t xml:space="preserve"> I + </w:t>
-            </w:r>
-            <w:proofErr w:type="spellStart"/>
-            <w:r>
-              <w:rPr>
-                <w:rFonts w:ascii="Arial" w:hAnsi="Arial" w:cs="Arial"/>
-                <w:sz w:val="20"/>
-                <w:szCs w:val="20"/>
-              </w:rPr>
-              <w:t>Selungkup</w:t>
-            </w:r>
-            <w:proofErr w:type="spellEnd"/>
-            <w:r>
-              <w:rPr>
-                <w:rFonts w:ascii="Arial" w:hAnsi="Arial" w:cs="Arial"/>
-                <w:sz w:val="20"/>
-                <w:szCs w:val="20"/>
-              </w:rPr>
-              <w:t xml:space="preserve"> </w:t>
+              <w:t xml:space="preserve"> I + Selungkup </w:t>
             </w:r>
           </w:p>
         </w:tc>
@@ -9923,7 +9739,7 @@
                 <w:szCs w:val="20"/>
                 <w:lang w:val="en-GB"/>
               </w:rPr>
-              <w:t xml:space="preserve">undefined</w:t>
+              <w:t>undefined</w:t>
             </w:r>
           </w:p>
         </w:tc>
@@ -9996,25 +9812,7 @@
                 <w:sz w:val="20"/>
                 <w:szCs w:val="20"/>
               </w:rPr>
-              <w:t xml:space="preserve"> II + </w:t>
-            </w:r>
-            <w:proofErr w:type="spellStart"/>
-            <w:r>
-              <w:rPr>
-                <w:rFonts w:ascii="Arial" w:hAnsi="Arial" w:cs="Arial"/>
-                <w:sz w:val="20"/>
-                <w:szCs w:val="20"/>
-              </w:rPr>
-              <w:t>Selungkup</w:t>
-            </w:r>
-            <w:proofErr w:type="spellEnd"/>
-            <w:r>
-              <w:rPr>
-                <w:rFonts w:ascii="Arial" w:hAnsi="Arial" w:cs="Arial"/>
-                <w:sz w:val="20"/>
-                <w:szCs w:val="20"/>
-              </w:rPr>
-              <w:t xml:space="preserve"> </w:t>
+              <w:t xml:space="preserve"> II + Selungkup </w:t>
             </w:r>
           </w:p>
         </w:tc>
@@ -10039,7 +9837,7 @@
                 <w:szCs w:val="20"/>
                 <w:lang w:val="en-GB"/>
               </w:rPr>
-              <w:t xml:space="preserve">undefined</w:t>
+              <w:t>undefined</w:t>
             </w:r>
           </w:p>
         </w:tc>
@@ -10112,25 +9910,7 @@
                 <w:sz w:val="20"/>
                 <w:szCs w:val="20"/>
               </w:rPr>
-              <w:t xml:space="preserve"> III + </w:t>
-            </w:r>
-            <w:proofErr w:type="spellStart"/>
-            <w:r>
-              <w:rPr>
-                <w:rFonts w:ascii="Arial" w:hAnsi="Arial" w:cs="Arial"/>
-                <w:sz w:val="20"/>
-                <w:szCs w:val="20"/>
-              </w:rPr>
-              <w:t>Selungkup</w:t>
-            </w:r>
-            <w:proofErr w:type="spellEnd"/>
-            <w:r>
-              <w:rPr>
-                <w:rFonts w:ascii="Arial" w:hAnsi="Arial" w:cs="Arial"/>
-                <w:sz w:val="20"/>
-                <w:szCs w:val="20"/>
-              </w:rPr>
-              <w:t xml:space="preserve"> </w:t>
+              <w:t xml:space="preserve"> III + Selungkup </w:t>
             </w:r>
           </w:p>
         </w:tc>
@@ -10155,7 +9935,7 @@
                 <w:szCs w:val="20"/>
                 <w:lang w:val="en-GB"/>
               </w:rPr>
-              <w:t xml:space="preserve">undefined</w:t>
+              <w:t>undefined</w:t>
             </w:r>
           </w:p>
         </w:tc>
@@ -10215,11 +9995,11 @@
         <w:tblLook w:val="01E0" w:firstRow="1" w:lastRow="1" w:firstColumn="1" w:lastColumn="1" w:noHBand="0" w:noVBand="0"/>
       </w:tblPr>
       <w:tblGrid>
-        <w:gridCol w:w="946"/>
-        <w:gridCol w:w="2597"/>
-        <w:gridCol w:w="3101"/>
-        <w:gridCol w:w="1425"/>
-        <w:gridCol w:w="1962"/>
+        <w:gridCol w:w="959"/>
+        <w:gridCol w:w="2807"/>
+        <w:gridCol w:w="3288"/>
+        <w:gridCol w:w="1559"/>
+        <w:gridCol w:w="1418"/>
       </w:tblGrid>
       <w:tr>
         <w:trPr>
@@ -10301,29 +10081,7 @@
                 <w:szCs w:val="20"/>
                 <w:lang w:val="en-US"/>
               </w:rPr>
-              <w:t xml:space="preserve">undefined</w:t>
-            </w:r>
-            <w:proofErr w:type="spellStart"/>
-            <w:r>
-              <w:rPr>
-                <w:rFonts w:ascii="Arial" w:hAnsi="Arial" w:cs="Arial"/>
-                <w:b/>
-                <w:sz w:val="20"/>
-                <w:szCs w:val="20"/>
-                <w:lang w:val="en-US"/>
-              </w:rPr>
-              <w:t/>
-            </w:r>
-            <w:proofErr w:type="spellEnd"/>
-            <w:r>
-              <w:rPr>
-                <w:rFonts w:ascii="Arial" w:hAnsi="Arial" w:cs="Arial"/>
-                <w:b/>
-                <w:sz w:val="20"/>
-                <w:szCs w:val="20"/>
-                <w:lang w:val="en-US"/>
-              </w:rPr>
-              <w:t/>
+              <w:t>undefined</w:t>
             </w:r>
           </w:p>
         </w:tc>
@@ -10472,18 +10230,8 @@
                 <w:sz w:val="20"/>
                 <w:szCs w:val="20"/>
               </w:rPr>
-              <w:t xml:space="preserve"> I + </w:t>
-            </w:r>
-            <w:proofErr w:type="spellStart"/>
-            <w:r>
-              <w:rPr>
-                <w:rFonts w:ascii="Arial" w:hAnsi="Arial" w:cs="Arial"/>
-                <w:sz w:val="20"/>
-                <w:szCs w:val="20"/>
-              </w:rPr>
-              <w:t>Selungkup</w:t>
-            </w:r>
-            <w:proofErr w:type="spellEnd"/>
+              <w:t xml:space="preserve"> I + Selungkup</w:t>
+            </w:r>
           </w:p>
         </w:tc>
         <w:tc>
@@ -10589,18 +10337,8 @@
                 <w:sz w:val="20"/>
                 <w:szCs w:val="20"/>
               </w:rPr>
-              <w:t xml:space="preserve"> II + </w:t>
-            </w:r>
-            <w:proofErr w:type="spellStart"/>
-            <w:r>
-              <w:rPr>
-                <w:rFonts w:ascii="Arial" w:hAnsi="Arial" w:cs="Arial"/>
-                <w:sz w:val="20"/>
-                <w:szCs w:val="20"/>
-              </w:rPr>
-              <w:t>Selungkup</w:t>
-            </w:r>
-            <w:proofErr w:type="spellEnd"/>
+              <w:t xml:space="preserve"> II + Selungkup</w:t>
+            </w:r>
           </w:p>
         </w:tc>
         <w:tc>
@@ -10706,18 +10444,8 @@
                 <w:sz w:val="20"/>
                 <w:szCs w:val="20"/>
               </w:rPr>
-              <w:t xml:space="preserve"> III + </w:t>
-            </w:r>
-            <w:proofErr w:type="spellStart"/>
-            <w:r>
-              <w:rPr>
-                <w:rFonts w:ascii="Arial" w:hAnsi="Arial" w:cs="Arial"/>
-                <w:sz w:val="20"/>
-                <w:szCs w:val="20"/>
-              </w:rPr>
-              <w:t>Selungkup</w:t>
-            </w:r>
-            <w:proofErr w:type="spellEnd"/>
+              <w:t xml:space="preserve"> III + Selungkup</w:t>
+            </w:r>
           </w:p>
         </w:tc>
         <w:tc>
@@ -10937,29 +10665,7 @@
                 <w:szCs w:val="20"/>
                 <w:lang w:val="en-US"/>
               </w:rPr>
-              <w:t xml:space="preserve">undefined</w:t>
-            </w:r>
-            <w:proofErr w:type="spellStart"/>
-            <w:r>
-              <w:rPr>
-                <w:rFonts w:ascii="Arial" w:hAnsi="Arial" w:cs="Arial"/>
-                <w:b/>
-                <w:sz w:val="20"/>
-                <w:szCs w:val="20"/>
-                <w:lang w:val="en-US"/>
-              </w:rPr>
-              <w:t/>
-            </w:r>
-            <w:proofErr w:type="spellEnd"/>
-            <w:r>
-              <w:rPr>
-                <w:rFonts w:ascii="Arial" w:hAnsi="Arial" w:cs="Arial"/>
-                <w:b/>
-                <w:sz w:val="20"/>
-                <w:szCs w:val="20"/>
-                <w:lang w:val="en-US"/>
-              </w:rPr>
-              <w:t/>
+              <w:t>undefined</w:t>
             </w:r>
           </w:p>
         </w:tc>
@@ -11416,7 +11122,7 @@
                 <w:szCs w:val="20"/>
                 <w:lang w:val="sv-SE"/>
               </w:rPr>
-              <w:t xml:space="preserve">undefined</w:t>
+              <w:t>undefined</w:t>
             </w:r>
           </w:p>
         </w:tc>
@@ -11447,7 +11153,7 @@
                 <w:szCs w:val="20"/>
                 <w:lang w:val="sv-SE"/>
               </w:rPr>
-              <w:t xml:space="preserve">undefined</w:t>
+              <w:t>undefined</w:t>
             </w:r>
           </w:p>
         </w:tc>
@@ -11478,7 +11184,7 @@
                 <w:szCs w:val="20"/>
                 <w:lang w:val="sv-SE"/>
               </w:rPr>
-              <w:t xml:space="preserve">undefined</w:t>
+              <w:t>undefined</w:t>
             </w:r>
           </w:p>
         </w:tc>
@@ -11509,7 +11215,7 @@
                 <w:szCs w:val="20"/>
                 <w:lang w:val="sv-SE"/>
               </w:rPr>
-              <w:t xml:space="preserve">undefined</w:t>
+              <w:t>undefined</w:t>
             </w:r>
           </w:p>
         </w:tc>
@@ -11540,7 +11246,7 @@
                 <w:szCs w:val="20"/>
                 <w:lang w:val="sv-SE"/>
               </w:rPr>
-              <w:t xml:space="preserve">undefined</w:t>
+              <w:t>undefined</w:t>
             </w:r>
           </w:p>
         </w:tc>
@@ -11571,7 +11277,7 @@
                 <w:szCs w:val="20"/>
                 <w:lang w:val="sv-SE"/>
               </w:rPr>
-              <w:t xml:space="preserve">undefined</w:t>
+              <w:t>undefined</w:t>
             </w:r>
           </w:p>
         </w:tc>
@@ -11602,7 +11308,7 @@
                 <w:szCs w:val="20"/>
                 <w:lang w:val="sv-SE"/>
               </w:rPr>
-              <w:t xml:space="preserve">undefined</w:t>
+              <w:t>undefined</w:t>
             </w:r>
           </w:p>
         </w:tc>
@@ -11633,7 +11339,7 @@
                 <w:szCs w:val="20"/>
                 <w:lang w:val="sv-SE"/>
               </w:rPr>
-              <w:t xml:space="preserve">undefined</w:t>
+              <w:t>undefined</w:t>
             </w:r>
           </w:p>
         </w:tc>
@@ -11664,7 +11370,7 @@
                 <w:szCs w:val="20"/>
                 <w:lang w:val="sv-SE"/>
               </w:rPr>
-              <w:t xml:space="preserve">undefined</w:t>
+              <w:t>undefined</w:t>
             </w:r>
           </w:p>
         </w:tc>
@@ -11695,7 +11401,7 @@
                 <w:szCs w:val="20"/>
                 <w:lang w:val="sv-SE"/>
               </w:rPr>
-              <w:t xml:space="preserve">undefined</w:t>
+              <w:t>undefined</w:t>
             </w:r>
           </w:p>
         </w:tc>
@@ -11726,7 +11432,7 @@
                 <w:szCs w:val="20"/>
                 <w:lang w:val="sv-SE"/>
               </w:rPr>
-              <w:t xml:space="preserve">undefined</w:t>
+              <w:t>undefined</w:t>
             </w:r>
           </w:p>
         </w:tc>
@@ -11794,6 +11500,7 @@
                 <w:sz w:val="20"/>
                 <w:szCs w:val="20"/>
               </w:rPr>
+              <w:lastRenderedPageBreak/>
               <w:t>9.2</w:t>
             </w:r>
           </w:p>
@@ -11869,29 +11576,7 @@
                 <w:szCs w:val="20"/>
                 <w:lang w:val="en-US"/>
               </w:rPr>
-              <w:t xml:space="preserve">undefined</w:t>
-            </w:r>
-            <w:proofErr w:type="spellStart"/>
-            <w:r>
-              <w:rPr>
-                <w:rFonts w:ascii="Arial" w:hAnsi="Arial" w:cs="Arial"/>
-                <w:b/>
-                <w:sz w:val="20"/>
-                <w:szCs w:val="20"/>
-                <w:lang w:val="en-US"/>
-              </w:rPr>
-              <w:t/>
-            </w:r>
-            <w:proofErr w:type="spellEnd"/>
-            <w:r>
-              <w:rPr>
-                <w:rFonts w:ascii="Arial" w:hAnsi="Arial" w:cs="Arial"/>
-                <w:b/>
-                <w:sz w:val="20"/>
-                <w:szCs w:val="20"/>
-                <w:lang w:val="en-US"/>
-              </w:rPr>
-              <w:t/>
+              <w:t>undefined</w:t>
             </w:r>
           </w:p>
         </w:tc>
@@ -12094,18 +11779,8 @@
                 <w:sz w:val="20"/>
                 <w:szCs w:val="20"/>
               </w:rPr>
-              <w:t xml:space="preserve"> I + </w:t>
-            </w:r>
-            <w:proofErr w:type="spellStart"/>
-            <w:r>
-              <w:rPr>
-                <w:rFonts w:ascii="Arial" w:hAnsi="Arial" w:cs="Arial"/>
-                <w:sz w:val="20"/>
-                <w:szCs w:val="20"/>
-              </w:rPr>
-              <w:t>Selungkup</w:t>
-            </w:r>
-            <w:proofErr w:type="spellEnd"/>
+              <w:t xml:space="preserve"> I + Selungkup</w:t>
+            </w:r>
           </w:p>
         </w:tc>
         <w:tc>
@@ -12132,7 +11807,7 @@
                 <w:szCs w:val="20"/>
                 <w:lang w:val="en-GB"/>
               </w:rPr>
-              <w:t xml:space="preserve">undefined</w:t>
+              <w:t>undefined</w:t>
             </w:r>
           </w:p>
         </w:tc>
@@ -12206,18 +11881,8 @@
                 <w:sz w:val="20"/>
                 <w:szCs w:val="20"/>
               </w:rPr>
-              <w:t xml:space="preserve"> II + </w:t>
-            </w:r>
-            <w:proofErr w:type="spellStart"/>
-            <w:r>
-              <w:rPr>
-                <w:rFonts w:ascii="Arial" w:hAnsi="Arial" w:cs="Arial"/>
-                <w:sz w:val="20"/>
-                <w:szCs w:val="20"/>
-              </w:rPr>
-              <w:t>Selungkup</w:t>
-            </w:r>
-            <w:proofErr w:type="spellEnd"/>
+              <w:t xml:space="preserve"> II + Selungkup</w:t>
+            </w:r>
           </w:p>
         </w:tc>
         <w:tc>
@@ -12242,7 +11907,7 @@
                 <w:szCs w:val="20"/>
                 <w:lang w:val="en-GB"/>
               </w:rPr>
-              <w:t xml:space="preserve">undefined</w:t>
+              <w:t>undefined</w:t>
             </w:r>
           </w:p>
         </w:tc>
@@ -12316,18 +11981,8 @@
                 <w:sz w:val="20"/>
                 <w:szCs w:val="20"/>
               </w:rPr>
-              <w:t xml:space="preserve"> III + </w:t>
-            </w:r>
-            <w:proofErr w:type="spellStart"/>
-            <w:r>
-              <w:rPr>
-                <w:rFonts w:ascii="Arial" w:hAnsi="Arial" w:cs="Arial"/>
-                <w:sz w:val="20"/>
-                <w:szCs w:val="20"/>
-              </w:rPr>
-              <w:t>Selungkup</w:t>
-            </w:r>
-            <w:proofErr w:type="spellEnd"/>
+              <w:t xml:space="preserve"> III + Selungkup</w:t>
+            </w:r>
           </w:p>
         </w:tc>
         <w:tc>
@@ -12352,7 +12007,7 @@
                 <w:szCs w:val="20"/>
                 <w:lang w:val="en-GB"/>
               </w:rPr>
-              <w:t xml:space="preserve">undefined</w:t>
+              <w:t>undefined</w:t>
             </w:r>
           </w:p>
         </w:tc>
@@ -12654,18 +12309,8 @@
                 <w:sz w:val="20"/>
                 <w:szCs w:val="20"/>
               </w:rPr>
-              <w:t xml:space="preserve"> I + </w:t>
-            </w:r>
-            <w:proofErr w:type="spellStart"/>
-            <w:r>
-              <w:rPr>
-                <w:rFonts w:ascii="Arial" w:hAnsi="Arial" w:cs="Arial"/>
-                <w:sz w:val="20"/>
-                <w:szCs w:val="20"/>
-              </w:rPr>
-              <w:t>Selungkup</w:t>
-            </w:r>
-            <w:proofErr w:type="spellEnd"/>
+              <w:t xml:space="preserve"> I + Selungkup</w:t>
+            </w:r>
           </w:p>
         </w:tc>
         <w:tc>
@@ -12771,18 +12416,8 @@
                 <w:sz w:val="20"/>
                 <w:szCs w:val="20"/>
               </w:rPr>
-              <w:t xml:space="preserve"> II + </w:t>
-            </w:r>
-            <w:proofErr w:type="spellStart"/>
-            <w:r>
-              <w:rPr>
-                <w:rFonts w:ascii="Arial" w:hAnsi="Arial" w:cs="Arial"/>
-                <w:sz w:val="20"/>
-                <w:szCs w:val="20"/>
-              </w:rPr>
-              <w:t>Selungkup</w:t>
-            </w:r>
-            <w:proofErr w:type="spellEnd"/>
+              <w:t xml:space="preserve"> II + Selungkup</w:t>
+            </w:r>
           </w:p>
         </w:tc>
         <w:tc>
@@ -12888,18 +12523,8 @@
                 <w:sz w:val="20"/>
                 <w:szCs w:val="20"/>
               </w:rPr>
-              <w:t xml:space="preserve"> III + </w:t>
-            </w:r>
-            <w:proofErr w:type="spellStart"/>
-            <w:r>
-              <w:rPr>
-                <w:rFonts w:ascii="Arial" w:hAnsi="Arial" w:cs="Arial"/>
-                <w:sz w:val="20"/>
-                <w:szCs w:val="20"/>
-              </w:rPr>
-              <w:t>Selungkup</w:t>
-            </w:r>
-            <w:proofErr w:type="spellEnd"/>
+              <w:t xml:space="preserve"> III + Selungkup</w:t>
+            </w:r>
           </w:p>
         </w:tc>
         <w:tc>
@@ -13253,7 +12878,7 @@
                 <w:szCs w:val="20"/>
                 <w:lang w:val="en-GB"/>
               </w:rPr>
-              <w:t xml:space="preserve">undefined</w:t>
+              <w:t>undefined</w:t>
             </w:r>
           </w:p>
         </w:tc>
@@ -13342,7 +12967,7 @@
                 <w:szCs w:val="20"/>
                 <w:lang w:val="en-GB"/>
               </w:rPr>
-              <w:t xml:space="preserve">undefined</w:t>
+              <w:t>undefined</w:t>
             </w:r>
           </w:p>
         </w:tc>
@@ -13431,7 +13056,7 @@
                 <w:szCs w:val="20"/>
                 <w:lang w:val="en-GB"/>
               </w:rPr>
-              <w:t xml:space="preserve">undefined</w:t>
+              <w:t>undefined</w:t>
             </w:r>
           </w:p>
         </w:tc>
@@ -13808,7 +13433,6 @@
                 <w:lang w:val="en-US"/>
               </w:rPr>
             </w:pPr>
-            <w:proofErr w:type="spellStart"/>
             <w:r>
               <w:rPr>
                 <w:rFonts w:ascii="Arial" w:hAnsi="Arial" w:cs="Arial"/>
@@ -13818,7 +13442,6 @@
               </w:rPr>
               <w:t>Selungkup</w:t>
             </w:r>
-            <w:proofErr w:type="spellEnd"/>
           </w:p>
         </w:tc>
         <w:tc>
@@ -13880,7 +13503,7 @@
                 <w:szCs w:val="20"/>
                 <w:lang w:val="en-GB"/>
               </w:rPr>
-              <w:t xml:space="preserve">undefined</w:t>
+              <w:t>undefined</w:t>
             </w:r>
           </w:p>
         </w:tc>
@@ -14336,7 +13959,6 @@
                 <w:lang w:val="en-US"/>
               </w:rPr>
             </w:pPr>
-            <w:proofErr w:type="spellStart"/>
             <w:r>
               <w:rPr>
                 <w:rFonts w:ascii="Arial" w:hAnsi="Arial" w:cs="Arial"/>
@@ -14346,7 +13968,6 @@
               </w:rPr>
               <w:t>Selungkup</w:t>
             </w:r>
-            <w:proofErr w:type="spellEnd"/>
           </w:p>
         </w:tc>
         <w:tc>
@@ -15991,7 +15612,6 @@
               <w:t xml:space="preserve">0,6 </w:t>
             </w:r>
             <w:proofErr w:type="spellStart"/>
-            <w:proofErr w:type="gramStart"/>
             <w:r>
               <w:rPr>
                 <w:rFonts w:ascii="Arial" w:hAnsi="Arial" w:cs="Arial"/>
@@ -16002,7 +15622,6 @@
               <w:t>a,b</w:t>
             </w:r>
             <w:proofErr w:type="spellEnd"/>
-            <w:proofErr w:type="gramEnd"/>
           </w:p>
         </w:tc>
         <w:tc>
@@ -16038,7 +15657,6 @@
               <w:t xml:space="preserve">1,2 </w:t>
             </w:r>
             <w:proofErr w:type="spellStart"/>
-            <w:proofErr w:type="gramStart"/>
             <w:r>
               <w:rPr>
                 <w:rFonts w:ascii="Arial" w:hAnsi="Arial" w:cs="Arial"/>
@@ -16049,7 +15667,6 @@
               <w:t>a,b</w:t>
             </w:r>
             <w:proofErr w:type="spellEnd"/>
-            <w:proofErr w:type="gramEnd"/>
           </w:p>
         </w:tc>
         <w:tc>
@@ -16085,7 +15702,6 @@
               <w:t xml:space="preserve">0,2 </w:t>
             </w:r>
             <w:proofErr w:type="spellStart"/>
-            <w:proofErr w:type="gramStart"/>
             <w:r>
               <w:rPr>
                 <w:rFonts w:ascii="Arial" w:hAnsi="Arial" w:cs="Arial"/>
@@ -16096,7 +15712,6 @@
               <w:t>a,b</w:t>
             </w:r>
             <w:proofErr w:type="spellEnd"/>
-            <w:proofErr w:type="gramEnd"/>
           </w:p>
         </w:tc>
         <w:tc>
@@ -16252,7 +15867,6 @@
               <w:t xml:space="preserve">1,4 </w:t>
             </w:r>
             <w:proofErr w:type="spellStart"/>
-            <w:proofErr w:type="gramStart"/>
             <w:r>
               <w:rPr>
                 <w:rFonts w:ascii="Arial" w:hAnsi="Arial" w:cs="Arial"/>
@@ -16263,7 +15877,6 @@
               <w:t>a,b</w:t>
             </w:r>
             <w:proofErr w:type="spellEnd"/>
-            <w:proofErr w:type="gramEnd"/>
           </w:p>
         </w:tc>
         <w:tc>
@@ -16299,7 +15912,6 @@
               <w:t xml:space="preserve">1,6 </w:t>
             </w:r>
             <w:proofErr w:type="spellStart"/>
-            <w:proofErr w:type="gramStart"/>
             <w:r>
               <w:rPr>
                 <w:rFonts w:ascii="Arial" w:hAnsi="Arial" w:cs="Arial"/>
@@ -16310,7 +15922,6 @@
               <w:t>a,b</w:t>
             </w:r>
             <w:proofErr w:type="spellEnd"/>
-            <w:proofErr w:type="gramEnd"/>
           </w:p>
         </w:tc>
         <w:tc>
@@ -16346,7 +15957,6 @@
               <w:t xml:space="preserve">1,4 </w:t>
             </w:r>
             <w:proofErr w:type="spellStart"/>
-            <w:proofErr w:type="gramStart"/>
             <w:r>
               <w:rPr>
                 <w:rFonts w:ascii="Arial" w:hAnsi="Arial" w:cs="Arial"/>
@@ -16357,7 +15967,6 @@
               <w:t>a,b</w:t>
             </w:r>
             <w:proofErr w:type="spellEnd"/>
-            <w:proofErr w:type="gramEnd"/>
           </w:p>
         </w:tc>
         <w:tc>
@@ -16513,7 +16122,6 @@
               <w:t xml:space="preserve">1,7 </w:t>
             </w:r>
             <w:proofErr w:type="spellStart"/>
-            <w:proofErr w:type="gramStart"/>
             <w:r>
               <w:rPr>
                 <w:rFonts w:ascii="Arial" w:hAnsi="Arial" w:cs="Arial"/>
@@ -16524,7 +16132,6 @@
               <w:t>a,b</w:t>
             </w:r>
             <w:proofErr w:type="spellEnd"/>
-            <w:proofErr w:type="gramEnd"/>
           </w:p>
         </w:tc>
         <w:tc>
@@ -16560,7 +16167,6 @@
               <w:t xml:space="preserve">2,5 </w:t>
             </w:r>
             <w:proofErr w:type="spellStart"/>
-            <w:proofErr w:type="gramStart"/>
             <w:r>
               <w:rPr>
                 <w:rFonts w:ascii="Arial" w:hAnsi="Arial" w:cs="Arial"/>
@@ -16571,7 +16177,6 @@
               <w:t>a,b</w:t>
             </w:r>
             <w:proofErr w:type="spellEnd"/>
-            <w:proofErr w:type="gramEnd"/>
           </w:p>
         </w:tc>
         <w:tc>
@@ -16607,7 +16212,6 @@
               <w:t xml:space="preserve">1,7 </w:t>
             </w:r>
             <w:proofErr w:type="spellStart"/>
-            <w:proofErr w:type="gramStart"/>
             <w:r>
               <w:rPr>
                 <w:rFonts w:ascii="Arial" w:hAnsi="Arial" w:cs="Arial"/>
@@ -16618,7 +16222,6 @@
               <w:t>a,b</w:t>
             </w:r>
             <w:proofErr w:type="spellEnd"/>
-            <w:proofErr w:type="gramEnd"/>
           </w:p>
         </w:tc>
         <w:tc>
@@ -16774,7 +16377,6 @@
               <w:t xml:space="preserve">3 </w:t>
             </w:r>
             <w:proofErr w:type="spellStart"/>
-            <w:proofErr w:type="gramStart"/>
             <w:r>
               <w:rPr>
                 <w:rFonts w:ascii="Arial" w:hAnsi="Arial" w:cs="Arial"/>
@@ -16785,7 +16387,6 @@
               <w:t>a,b</w:t>
             </w:r>
             <w:proofErr w:type="spellEnd"/>
-            <w:proofErr w:type="gramEnd"/>
           </w:p>
         </w:tc>
         <w:tc>
@@ -16821,7 +16422,6 @@
               <w:t xml:space="preserve">5 </w:t>
             </w:r>
             <w:proofErr w:type="spellStart"/>
-            <w:proofErr w:type="gramStart"/>
             <w:r>
               <w:rPr>
                 <w:rFonts w:ascii="Arial" w:hAnsi="Arial" w:cs="Arial"/>
@@ -16832,7 +16432,6 @@
               <w:t>a,b</w:t>
             </w:r>
             <w:proofErr w:type="spellEnd"/>
-            <w:proofErr w:type="gramEnd"/>
           </w:p>
         </w:tc>
         <w:tc>
@@ -16868,7 +16467,6 @@
               <w:t xml:space="preserve">3 </w:t>
             </w:r>
             <w:proofErr w:type="spellStart"/>
-            <w:proofErr w:type="gramStart"/>
             <w:r>
               <w:rPr>
                 <w:rFonts w:ascii="Arial" w:hAnsi="Arial" w:cs="Arial"/>
@@ -16879,7 +16477,6 @@
               <w:t>a,b</w:t>
             </w:r>
             <w:proofErr w:type="spellEnd"/>
-            <w:proofErr w:type="gramEnd"/>
           </w:p>
         </w:tc>
         <w:tc>
@@ -17034,7 +16631,6 @@
               <w:t xml:space="preserve">4 </w:t>
             </w:r>
             <w:proofErr w:type="spellStart"/>
-            <w:proofErr w:type="gramStart"/>
             <w:r>
               <w:rPr>
                 <w:rFonts w:ascii="Arial" w:hAnsi="Arial" w:cs="Arial"/>
@@ -17045,7 +16641,6 @@
               <w:t>a,b</w:t>
             </w:r>
             <w:proofErr w:type="spellEnd"/>
-            <w:proofErr w:type="gramEnd"/>
           </w:p>
         </w:tc>
         <w:tc>
@@ -17081,7 +16676,6 @@
               <w:t xml:space="preserve">8 </w:t>
             </w:r>
             <w:proofErr w:type="spellStart"/>
-            <w:proofErr w:type="gramStart"/>
             <w:r>
               <w:rPr>
                 <w:rFonts w:ascii="Arial" w:hAnsi="Arial" w:cs="Arial"/>
@@ -17092,7 +16686,6 @@
               <w:t>a,b</w:t>
             </w:r>
             <w:proofErr w:type="spellEnd"/>
-            <w:proofErr w:type="gramEnd"/>
           </w:p>
         </w:tc>
         <w:tc>
@@ -17128,7 +16721,6 @@
               <w:t xml:space="preserve">5 </w:t>
             </w:r>
             <w:proofErr w:type="spellStart"/>
-            <w:proofErr w:type="gramStart"/>
             <w:r>
               <w:rPr>
                 <w:rFonts w:ascii="Arial" w:hAnsi="Arial" w:cs="Arial"/>
@@ -17139,7 +16731,6 @@
               <w:t>a,b</w:t>
             </w:r>
             <w:proofErr w:type="spellEnd"/>
-            <w:proofErr w:type="gramEnd"/>
           </w:p>
         </w:tc>
         <w:tc>
@@ -17294,7 +16885,6 @@
               <w:t xml:space="preserve">5,5 </w:t>
             </w:r>
             <w:proofErr w:type="spellStart"/>
-            <w:proofErr w:type="gramStart"/>
             <w:r>
               <w:rPr>
                 <w:rFonts w:ascii="Arial" w:hAnsi="Arial" w:cs="Arial"/>
@@ -17305,7 +16895,6 @@
               <w:t>a,b</w:t>
             </w:r>
             <w:proofErr w:type="spellEnd"/>
-            <w:proofErr w:type="gramEnd"/>
           </w:p>
         </w:tc>
         <w:tc>
@@ -17341,7 +16930,6 @@
               <w:t xml:space="preserve">10 </w:t>
             </w:r>
             <w:proofErr w:type="spellStart"/>
-            <w:proofErr w:type="gramStart"/>
             <w:r>
               <w:rPr>
                 <w:rFonts w:ascii="Arial" w:hAnsi="Arial" w:cs="Arial"/>
@@ -17352,7 +16940,6 @@
               <w:t>a,b</w:t>
             </w:r>
             <w:proofErr w:type="spellEnd"/>
-            <w:proofErr w:type="gramEnd"/>
           </w:p>
         </w:tc>
         <w:tc>
@@ -17388,7 +16975,6 @@
               <w:t xml:space="preserve">5,5 </w:t>
             </w:r>
             <w:proofErr w:type="spellStart"/>
-            <w:proofErr w:type="gramStart"/>
             <w:r>
               <w:rPr>
                 <w:rFonts w:ascii="Arial" w:hAnsi="Arial" w:cs="Arial"/>
@@ -17399,7 +16985,6 @@
               <w:t>a,b</w:t>
             </w:r>
             <w:proofErr w:type="spellEnd"/>
-            <w:proofErr w:type="gramEnd"/>
           </w:p>
         </w:tc>
         <w:tc>
@@ -17691,7 +17276,7 @@
                 <w:sz w:val="20"/>
                 <w:szCs w:val="20"/>
               </w:rPr>
-              <w:t xml:space="preserve">{model}</w:t>
+              <w:t>{model}</w:t>
             </w:r>
           </w:p>
         </w:tc>
@@ -18392,23 +17977,6 @@
                 <w:lang w:eastAsia="zh-CN"/>
               </w:rPr>
             </w:pPr>
-            <w:r>
-              <w:rPr>
-                <w:noProof/>
-              </w:rPr>
-            </w:r>
-            <w:r>
-              <w:rPr>
-                <w:noProof/>
-              </w:rPr>
-              <w:t/>
-            </w:r>
-            <w:r>
-              <w:rPr>
-                <w:noProof/>
-              </w:rPr>
-              <w:t/>
-            </w:r>
           </w:p>
         </w:tc>
       </w:tr>
@@ -18509,7 +18077,7 @@
                 <w:sz w:val="20"/>
                 <w:szCs w:val="20"/>
               </w:rPr>
-              <w:t xml:space="preserve">{model}</w:t>
+              <w:t>{model}</w:t>
             </w:r>
           </w:p>
         </w:tc>
@@ -19210,23 +18778,6 @@
                 <w:lang w:eastAsia="zh-CN"/>
               </w:rPr>
             </w:pPr>
-            <w:r>
-              <w:rPr>
-                <w:noProof/>
-              </w:rPr>
-            </w:r>
-            <w:r>
-              <w:rPr>
-                <w:noProof/>
-              </w:rPr>
-              <w:t/>
-            </w:r>
-            <w:r>
-              <w:rPr>
-                <w:noProof/>
-              </w:rPr>
-              <w:t/>
-            </w:r>
           </w:p>
         </w:tc>
       </w:tr>
@@ -19763,7 +19314,7 @@
               <w:szCs w:val="24"/>
               <w:lang w:val="id-ID"/>
             </w:rPr>
-            <w:t>21 Oktober 2026</w:t>
+            <w:t>25 Oktober 2026</w:t>
           </w:r>
           <w:r>
             <w:rPr>
@@ -19998,7 +19549,6 @@
               <w:lang w:val="en-US"/>
             </w:rPr>
           </w:pPr>
-          <w:proofErr w:type="gramStart"/>
           <w:r>
             <w:rPr>
               <w:rFonts w:ascii="Arial" w:eastAsia="Times New Roman" w:hAnsi="Arial" w:cs="Arial"/>
@@ -20018,7 +19568,6 @@
             <w:t>/</w:t>
           </w:r>
           <w:proofErr w:type="spellStart"/>
-          <w:proofErr w:type="gramEnd"/>
           <w:r>
             <w:rPr>
               <w:rFonts w:ascii="Arial" w:eastAsia="Times New Roman" w:hAnsi="Arial" w:cs="Arial"/>
@@ -20383,7 +19932,6 @@
               <w:lang w:val="en-GB"/>
             </w:rPr>
           </w:pPr>
-          <w:proofErr w:type="spellStart"/>
           <w:r>
             <w:rPr>
               <w:rFonts w:ascii="Arial" w:hAnsi="Arial" w:cs="Arial"/>
@@ -20392,7 +19940,6 @@
             </w:rPr>
             <w:t>Laporan</w:t>
           </w:r>
-          <w:proofErr w:type="spellEnd"/>
           <w:r>
             <w:rPr>
               <w:rFonts w:ascii="Arial" w:hAnsi="Arial" w:cs="Arial"/>
@@ -20465,7 +20012,7 @@
               <w:szCs w:val="24"/>
               <w:lang w:val="id-ID"/>
             </w:rPr>
-            <w:t>21 Oktober 2026</w:t>
+            <w:t>25 Oktober 2026</w:t>
           </w:r>
           <w:r>
             <w:rPr>
@@ -20632,7 +20179,6 @@
             <w:t xml:space="preserve">Kantor </w:t>
           </w:r>
           <w:proofErr w:type="spellStart"/>
-          <w:proofErr w:type="gramStart"/>
           <w:r>
             <w:rPr>
               <w:rFonts w:ascii="Arial" w:hAnsi="Arial" w:cs="Arial"/>
@@ -20654,7 +20200,6 @@
             </w:rPr>
             <w:t xml:space="preserve"> :</w:t>
           </w:r>
-          <w:proofErr w:type="gramEnd"/>
         </w:p>
       </w:tc>
     </w:tr>
@@ -20812,7 +20357,6 @@
               <w:lang w:val="en-US"/>
             </w:rPr>
           </w:pPr>
-          <w:proofErr w:type="gramStart"/>
           <w:r>
             <w:rPr>
               <w:rFonts w:ascii="Arial" w:eastAsia="Times New Roman" w:hAnsi="Arial" w:cs="Arial"/>
@@ -20832,7 +20376,6 @@
             <w:t>/</w:t>
           </w:r>
           <w:proofErr w:type="spellStart"/>
-          <w:proofErr w:type="gramEnd"/>
           <w:r>
             <w:rPr>
               <w:rFonts w:ascii="Arial" w:eastAsia="Times New Roman" w:hAnsi="Arial" w:cs="Arial"/>
@@ -21190,7 +20733,6 @@
               <w:lang w:val="en-GB"/>
             </w:rPr>
           </w:pPr>
-          <w:proofErr w:type="spellStart"/>
           <w:r>
             <w:rPr>
               <w:rFonts w:ascii="Arial" w:hAnsi="Arial" w:cs="Arial"/>
@@ -21199,7 +20741,6 @@
             </w:rPr>
             <w:t>Laporan</w:t>
           </w:r>
-          <w:proofErr w:type="spellEnd"/>
           <w:r>
             <w:rPr>
               <w:rFonts w:ascii="Arial" w:hAnsi="Arial" w:cs="Arial"/>
@@ -21272,7 +20813,7 @@
               <w:szCs w:val="24"/>
               <w:lang w:val="id-ID"/>
             </w:rPr>
-            <w:t>21 Oktober 2026</w:t>
+            <w:t>25 Oktober 2026</w:t>
           </w:r>
           <w:r>
             <w:rPr>
@@ -21439,7 +20980,6 @@
             <w:t xml:space="preserve">Kantor </w:t>
           </w:r>
           <w:proofErr w:type="spellStart"/>
-          <w:proofErr w:type="gramStart"/>
           <w:r>
             <w:rPr>
               <w:rFonts w:ascii="Arial" w:hAnsi="Arial" w:cs="Arial"/>
@@ -21461,7 +21001,6 @@
             </w:rPr>
             <w:t xml:space="preserve"> :</w:t>
           </w:r>
-          <w:proofErr w:type="gramEnd"/>
         </w:p>
       </w:tc>
     </w:tr>
@@ -21619,7 +21158,6 @@
               <w:lang w:val="en-US"/>
             </w:rPr>
           </w:pPr>
-          <w:proofErr w:type="gramStart"/>
           <w:r>
             <w:rPr>
               <w:rFonts w:ascii="Arial" w:eastAsia="Times New Roman" w:hAnsi="Arial" w:cs="Arial"/>
@@ -21639,7 +21177,6 @@
             <w:t>/</w:t>
           </w:r>
           <w:proofErr w:type="spellStart"/>
-          <w:proofErr w:type="gramEnd"/>
           <w:r>
             <w:rPr>
               <w:rFonts w:ascii="Arial" w:eastAsia="Times New Roman" w:hAnsi="Arial" w:cs="Arial"/>
@@ -22188,7 +21725,6 @@
               <w:lang w:val="en-GB"/>
             </w:rPr>
           </w:pPr>
-          <w:proofErr w:type="spellStart"/>
           <w:r>
             <w:rPr>
               <w:rFonts w:ascii="Arial" w:hAnsi="Arial" w:cs="Arial"/>
@@ -22197,7 +21733,6 @@
             </w:rPr>
             <w:t>Laporan</w:t>
           </w:r>
-          <w:proofErr w:type="spellEnd"/>
           <w:r>
             <w:rPr>
               <w:rFonts w:ascii="Arial" w:hAnsi="Arial" w:cs="Arial"/>
@@ -22270,7 +21805,7 @@
               <w:szCs w:val="24"/>
               <w:lang w:val="id-ID"/>
             </w:rPr>
-            <w:t>21 Oktober 2026</w:t>
+            <w:t>25 Oktober 2026</w:t>
           </w:r>
           <w:r>
             <w:rPr>
@@ -22437,7 +21972,6 @@
             <w:t xml:space="preserve">Kantor </w:t>
           </w:r>
           <w:proofErr w:type="spellStart"/>
-          <w:proofErr w:type="gramStart"/>
           <w:r>
             <w:rPr>
               <w:rFonts w:ascii="Arial" w:hAnsi="Arial" w:cs="Arial"/>
@@ -22459,7 +21993,6 @@
             </w:rPr>
             <w:t xml:space="preserve"> :</w:t>
           </w:r>
-          <w:proofErr w:type="gramEnd"/>
         </w:p>
       </w:tc>
     </w:tr>
@@ -22617,7 +22150,6 @@
               <w:lang w:val="en-US"/>
             </w:rPr>
           </w:pPr>
-          <w:proofErr w:type="gramStart"/>
           <w:r>
             <w:rPr>
               <w:rFonts w:ascii="Arial" w:eastAsia="Times New Roman" w:hAnsi="Arial" w:cs="Arial"/>
@@ -22637,7 +22169,6 @@
             <w:t>/</w:t>
           </w:r>
           <w:proofErr w:type="spellStart"/>
-          <w:proofErr w:type="gramEnd"/>
           <w:r>
             <w:rPr>
               <w:rFonts w:ascii="Arial" w:eastAsia="Times New Roman" w:hAnsi="Arial" w:cs="Arial"/>

</xml_diff>